<commit_message>
Avance Update Word (Aprendizaje Lectivo) V4 CYRGO
</commit_message>
<xml_diff>
--- a/webapp/templates/word/Contrato_Aprendizaje_Lectivo_Cyrgo.docx
+++ b/webapp/templates/word/Contrato_Aprendizaje_Lectivo_Cyrgo.docx
@@ -1187,13 +1187,7 @@
         <w:rPr>
           <w:rFonts w:ascii="Calibri Light" w:hAnsi="Calibri Light" w:cs="Calibri Light"/>
         </w:rPr>
-        <w:t>[[Cedula]]</w:t>
-      </w:r>
-      <w:r>
-        <w:rPr>
-          <w:rFonts w:ascii="Calibri Light" w:hAnsi="Calibri Light" w:cs="Calibri Light"/>
-        </w:rPr>
-        <w:t xml:space="preserve"> </w:t>
+        <w:t xml:space="preserve">[[Cedula]] </w:t>
       </w:r>
       <w:r>
         <w:rPr>
@@ -1576,6 +1570,206 @@
         <w:rPr>
           <w:rFonts w:ascii="Calibri Light" w:hAnsi="Calibri Light" w:cs="Calibri Light"/>
         </w:rPr>
+        <w:t>e</w:t>
+      </w:r>
+      <w:r>
+        <w:rPr>
+          <w:rFonts w:ascii="Calibri Light" w:hAnsi="Calibri Light" w:cs="Calibri Light"/>
+        </w:rPr>
+        <w:t>l</w:t>
+      </w:r>
+      <w:proofErr w:type="spellEnd"/>
+      <w:r>
+        <w:rPr>
+          <w:rFonts w:ascii="Calibri Light" w:hAnsi="Calibri Light" w:cs="Calibri Light"/>
+        </w:rPr>
+        <w:t xml:space="preserve"> </w:t>
+      </w:r>
+      <w:r>
+        <w:rPr>
+          <w:rFonts w:ascii="Calibri Light" w:hAnsi="Calibri Light" w:cs="Calibri Light"/>
+          <w:b/>
+          <w:bCs/>
+        </w:rPr>
+        <w:t>[[</w:t>
+      </w:r>
+      <w:proofErr w:type="spellStart"/>
+      <w:r>
+        <w:rPr>
+          <w:rFonts w:ascii="Calibri Light" w:hAnsi="Calibri Light" w:cs="Calibri Light"/>
+          <w:b/>
+          <w:bCs/>
+        </w:rPr>
+        <w:t>Institucion</w:t>
+      </w:r>
+      <w:proofErr w:type="spellEnd"/>
+      <w:r>
+        <w:rPr>
+          <w:rFonts w:ascii="Calibri Light" w:hAnsi="Calibri Light" w:cs="Calibri Light"/>
+          <w:b/>
+          <w:bCs/>
+        </w:rPr>
+        <w:t>]]</w:t>
+      </w:r>
+      <w:r>
+        <w:rPr>
+          <w:rFonts w:ascii="Calibri Light" w:hAnsi="Calibri Light" w:cs="Calibri Light"/>
+          <w:b/>
+          <w:bCs/>
+        </w:rPr>
+        <w:t xml:space="preserve"> </w:t>
+      </w:r>
+      <w:proofErr w:type="spellStart"/>
+      <w:r>
+        <w:rPr>
+          <w:rFonts w:ascii="Calibri Light" w:hAnsi="Calibri Light" w:cs="Calibri Light"/>
+        </w:rPr>
+        <w:t>m</w:t>
+      </w:r>
+      <w:r>
+        <w:rPr>
+          <w:rFonts w:ascii="Calibri Light" w:hAnsi="Calibri Light" w:cs="Calibri Light"/>
+        </w:rPr>
+        <w:t>ientras</w:t>
+      </w:r>
+      <w:proofErr w:type="spellEnd"/>
+      <w:r>
+        <w:rPr>
+          <w:rFonts w:ascii="Calibri Light" w:hAnsi="Calibri Light" w:cs="Calibri Light"/>
+        </w:rPr>
+        <w:t xml:space="preserve"> </w:t>
+      </w:r>
+      <w:proofErr w:type="spellStart"/>
+      <w:r>
+        <w:rPr>
+          <w:rFonts w:ascii="Calibri Light" w:hAnsi="Calibri Light" w:cs="Calibri Light"/>
+        </w:rPr>
+        <w:t>su</w:t>
+      </w:r>
+      <w:proofErr w:type="spellEnd"/>
+      <w:r>
+        <w:rPr>
+          <w:rFonts w:ascii="Calibri Light" w:hAnsi="Calibri Light" w:cs="Calibri Light"/>
+        </w:rPr>
+        <w:t xml:space="preserve"> etapa </w:t>
+      </w:r>
+      <w:proofErr w:type="spellStart"/>
+      <w:r>
+        <w:rPr>
+          <w:rFonts w:ascii="Calibri Light" w:hAnsi="Calibri Light" w:cs="Calibri Light"/>
+        </w:rPr>
+        <w:t>práctica</w:t>
+      </w:r>
+      <w:proofErr w:type="spellEnd"/>
+      <w:r>
+        <w:rPr>
+          <w:rFonts w:ascii="Calibri Light" w:hAnsi="Calibri Light" w:cs="Calibri Light"/>
+        </w:rPr>
+        <w:t xml:space="preserve"> se </w:t>
+      </w:r>
+      <w:proofErr w:type="spellStart"/>
+      <w:r>
+        <w:rPr>
+          <w:rFonts w:ascii="Calibri Light" w:hAnsi="Calibri Light" w:cs="Calibri Light"/>
+        </w:rPr>
+        <w:t>desarrollará</w:t>
+      </w:r>
+      <w:proofErr w:type="spellEnd"/>
+      <w:r>
+        <w:rPr>
+          <w:rFonts w:ascii="Calibri Light" w:hAnsi="Calibri Light" w:cs="Calibri Light"/>
+        </w:rPr>
+        <w:t xml:space="preserve"> </w:t>
+      </w:r>
+      <w:proofErr w:type="spellStart"/>
+      <w:r>
+        <w:rPr>
+          <w:rFonts w:ascii="Calibri Light" w:hAnsi="Calibri Light" w:cs="Calibri Light"/>
+        </w:rPr>
+        <w:t>en</w:t>
+      </w:r>
+      <w:proofErr w:type="spellEnd"/>
+      <w:r>
+        <w:rPr>
+          <w:rFonts w:ascii="Calibri Light" w:hAnsi="Calibri Light" w:cs="Calibri Light"/>
+        </w:rPr>
+        <w:t xml:space="preserve"> </w:t>
+      </w:r>
+      <w:proofErr w:type="spellStart"/>
+      <w:r>
+        <w:rPr>
+          <w:rFonts w:ascii="Calibri Light" w:hAnsi="Calibri Light" w:cs="Calibri Light"/>
+        </w:rPr>
+        <w:t>la</w:t>
+      </w:r>
+      <w:proofErr w:type="spellEnd"/>
+      <w:r>
+        <w:rPr>
+          <w:rFonts w:ascii="Calibri Light" w:hAnsi="Calibri Light" w:cs="Calibri Light"/>
+        </w:rPr>
+        <w:t xml:space="preserve"> </w:t>
+      </w:r>
+      <w:r>
+        <w:rPr>
+          <w:rFonts w:ascii="Calibri Light" w:hAnsi="Calibri Light" w:cs="Calibri Light"/>
+          <w:b/>
+          <w:bCs/>
+        </w:rPr>
+        <w:t>EMPRESA</w:t>
+      </w:r>
+      <w:r>
+        <w:rPr>
+          <w:rFonts w:ascii="Calibri Light" w:hAnsi="Calibri Light" w:cs="Calibri Light"/>
+        </w:rPr>
+        <w:t xml:space="preserve">, </w:t>
+      </w:r>
+      <w:proofErr w:type="spellStart"/>
+      <w:r>
+        <w:rPr>
+          <w:rFonts w:ascii="Calibri Light" w:hAnsi="Calibri Light" w:cs="Calibri Light"/>
+        </w:rPr>
+        <w:t>quien</w:t>
+      </w:r>
+      <w:proofErr w:type="spellEnd"/>
+      <w:r>
+        <w:rPr>
+          <w:rFonts w:ascii="Calibri Light" w:hAnsi="Calibri Light" w:cs="Calibri Light"/>
+        </w:rPr>
+        <w:t xml:space="preserve"> proporcionara </w:t>
+      </w:r>
+      <w:proofErr w:type="spellStart"/>
+      <w:r>
+        <w:rPr>
+          <w:rFonts w:ascii="Calibri Light" w:hAnsi="Calibri Light" w:cs="Calibri Light"/>
+        </w:rPr>
+        <w:t>los</w:t>
+      </w:r>
+      <w:proofErr w:type="spellEnd"/>
+      <w:r>
+        <w:rPr>
+          <w:rFonts w:ascii="Calibri Light" w:hAnsi="Calibri Light" w:cs="Calibri Light"/>
+        </w:rPr>
+        <w:t xml:space="preserve"> </w:t>
+      </w:r>
+      <w:proofErr w:type="spellStart"/>
+      <w:r>
+        <w:rPr>
+          <w:rFonts w:ascii="Calibri Light" w:hAnsi="Calibri Light" w:cs="Calibri Light"/>
+        </w:rPr>
+        <w:t>medios</w:t>
+      </w:r>
+      <w:proofErr w:type="spellEnd"/>
+      <w:r>
+        <w:rPr>
+          <w:rFonts w:ascii="Calibri Light" w:hAnsi="Calibri Light" w:cs="Calibri Light"/>
+        </w:rPr>
+        <w:t xml:space="preserve"> para que </w:t>
+      </w:r>
+      <w:proofErr w:type="spellStart"/>
+      <w:r>
+        <w:rPr>
+          <w:rFonts w:ascii="Calibri Light" w:hAnsi="Calibri Light" w:cs="Calibri Light"/>
+        </w:rPr>
         <w:t>el</w:t>
       </w:r>
       <w:proofErr w:type="spellEnd"/>
@@ -1583,72 +1777,16 @@
         <w:rPr>
           <w:rFonts w:ascii="Calibri Light" w:hAnsi="Calibri Light" w:cs="Calibri Light"/>
         </w:rPr>
-        <w:t xml:space="preserve">  </w:t>
-      </w:r>
-      <w:r>
-        <w:rPr>
-          <w:rFonts w:ascii="Calibri Light" w:hAnsi="Calibri Light" w:cs="Calibri Light"/>
-          <w:b/>
-          <w:bCs/>
-        </w:rPr>
-        <w:t xml:space="preserve">[[Instituto]] </w:t>
-      </w:r>
-      <w:proofErr w:type="spellStart"/>
-      <w:r>
-        <w:rPr>
-          <w:rFonts w:ascii="Calibri Light" w:hAnsi="Calibri Light" w:cs="Calibri Light"/>
-        </w:rPr>
-        <w:t>m</w:t>
-      </w:r>
-      <w:r>
-        <w:rPr>
-          <w:rFonts w:ascii="Calibri Light" w:hAnsi="Calibri Light" w:cs="Calibri Light"/>
-        </w:rPr>
-        <w:t>ientras</w:t>
-      </w:r>
-      <w:proofErr w:type="spellEnd"/>
-      <w:r>
-        <w:rPr>
-          <w:rFonts w:ascii="Calibri Light" w:hAnsi="Calibri Light" w:cs="Calibri Light"/>
-        </w:rPr>
         <w:t xml:space="preserve"> </w:t>
       </w:r>
-      <w:proofErr w:type="spellStart"/>
-      <w:r>
-        <w:rPr>
-          <w:rFonts w:ascii="Calibri Light" w:hAnsi="Calibri Light" w:cs="Calibri Light"/>
-        </w:rPr>
-        <w:t>su</w:t>
-      </w:r>
-      <w:proofErr w:type="spellEnd"/>
-      <w:r>
-        <w:rPr>
-          <w:rFonts w:ascii="Calibri Light" w:hAnsi="Calibri Light" w:cs="Calibri Light"/>
-        </w:rPr>
-        <w:t xml:space="preserve"> etapa </w:t>
-      </w:r>
-      <w:proofErr w:type="spellStart"/>
-      <w:r>
-        <w:rPr>
-          <w:rFonts w:ascii="Calibri Light" w:hAnsi="Calibri Light" w:cs="Calibri Light"/>
-        </w:rPr>
-        <w:t>práctica</w:t>
-      </w:r>
-      <w:proofErr w:type="spellEnd"/>
-      <w:r>
-        <w:rPr>
-          <w:rFonts w:ascii="Calibri Light" w:hAnsi="Calibri Light" w:cs="Calibri Light"/>
-        </w:rPr>
-        <w:t xml:space="preserve"> se </w:t>
-      </w:r>
-      <w:proofErr w:type="spellStart"/>
-      <w:r>
-        <w:rPr>
-          <w:rFonts w:ascii="Calibri Light" w:hAnsi="Calibri Light" w:cs="Calibri Light"/>
-        </w:rPr>
-        <w:t>desarrollará</w:t>
-      </w:r>
-      <w:proofErr w:type="spellEnd"/>
+      <w:r>
+        <w:rPr>
+          <w:rFonts w:ascii="Calibri Light" w:hAnsi="Calibri Light" w:cs="Calibri Light"/>
+          <w:b/>
+          <w:bCs/>
+        </w:rPr>
+        <w:t>APRENDIZ</w:t>
+      </w:r>
       <w:r>
         <w:rPr>
           <w:rFonts w:ascii="Calibri Light" w:hAnsi="Calibri Light" w:cs="Calibri Light"/>
@@ -1660,7 +1798,7 @@
         <w:rPr>
           <w:rFonts w:ascii="Calibri Light" w:hAnsi="Calibri Light" w:cs="Calibri Light"/>
         </w:rPr>
-        <w:t>en</w:t>
+        <w:t>adquiera</w:t>
       </w:r>
       <w:proofErr w:type="spellEnd"/>
       <w:r>
@@ -1674,6 +1812,62 @@
         <w:rPr>
           <w:rFonts w:ascii="Calibri Light" w:hAnsi="Calibri Light" w:cs="Calibri Light"/>
         </w:rPr>
+        <w:t>formación</w:t>
+      </w:r>
+      <w:proofErr w:type="spellEnd"/>
+      <w:r>
+        <w:rPr>
+          <w:rFonts w:ascii="Calibri Light" w:hAnsi="Calibri Light" w:cs="Calibri Light"/>
+        </w:rPr>
+        <w:t xml:space="preserve"> </w:t>
+      </w:r>
+      <w:proofErr w:type="spellStart"/>
+      <w:r>
+        <w:rPr>
+          <w:rFonts w:ascii="Calibri Light" w:hAnsi="Calibri Light" w:cs="Calibri Light"/>
+        </w:rPr>
+        <w:t>profesional</w:t>
+      </w:r>
+      <w:proofErr w:type="spellEnd"/>
+      <w:r>
+        <w:rPr>
+          <w:rFonts w:ascii="Calibri Light" w:hAnsi="Calibri Light" w:cs="Calibri Light"/>
+        </w:rPr>
+        <w:t xml:space="preserve"> y metódica, dentro de una </w:t>
+      </w:r>
+      <w:proofErr w:type="spellStart"/>
+      <w:r>
+        <w:rPr>
+          <w:rFonts w:ascii="Calibri Light" w:hAnsi="Calibri Light" w:cs="Calibri Light"/>
+        </w:rPr>
+        <w:t>relación</w:t>
+      </w:r>
+      <w:proofErr w:type="spellEnd"/>
+      <w:r>
+        <w:rPr>
+          <w:rFonts w:ascii="Calibri Light" w:hAnsi="Calibri Light" w:cs="Calibri Light"/>
+        </w:rPr>
+        <w:t xml:space="preserve"> de </w:t>
+      </w:r>
+      <w:proofErr w:type="spellStart"/>
+      <w:r>
+        <w:rPr>
+          <w:rFonts w:ascii="Calibri Light" w:hAnsi="Calibri Light" w:cs="Calibri Light"/>
+        </w:rPr>
+        <w:t>aprendizaje</w:t>
+      </w:r>
+      <w:proofErr w:type="spellEnd"/>
+      <w:r>
+        <w:rPr>
+          <w:rFonts w:ascii="Calibri Light" w:hAnsi="Calibri Light" w:cs="Calibri Light"/>
+        </w:rPr>
+        <w:t xml:space="preserve">, </w:t>
+      </w:r>
+      <w:proofErr w:type="spellStart"/>
+      <w:r>
+        <w:rPr>
+          <w:rFonts w:ascii="Calibri Light" w:hAnsi="Calibri Light" w:cs="Calibri Light"/>
+        </w:rPr>
         <w:t>la</w:t>
       </w:r>
       <w:proofErr w:type="spellEnd"/>
@@ -1683,40 +1877,26 @@
         </w:rPr>
         <w:t xml:space="preserve"> </w:t>
       </w:r>
-      <w:r>
-        <w:rPr>
-          <w:rFonts w:ascii="Calibri Light" w:hAnsi="Calibri Light" w:cs="Calibri Light"/>
-          <w:b/>
-          <w:bCs/>
-        </w:rPr>
-        <w:t>EMPRESA</w:t>
-      </w:r>
-      <w:r>
-        <w:rPr>
-          <w:rFonts w:ascii="Calibri Light" w:hAnsi="Calibri Light" w:cs="Calibri Light"/>
-        </w:rPr>
-        <w:t xml:space="preserve">, </w:t>
-      </w:r>
-      <w:proofErr w:type="spellStart"/>
-      <w:r>
-        <w:rPr>
-          <w:rFonts w:ascii="Calibri Light" w:hAnsi="Calibri Light" w:cs="Calibri Light"/>
-        </w:rPr>
-        <w:t>quien</w:t>
-      </w:r>
-      <w:proofErr w:type="spellEnd"/>
-      <w:r>
-        <w:rPr>
-          <w:rFonts w:ascii="Calibri Light" w:hAnsi="Calibri Light" w:cs="Calibri Light"/>
-        </w:rPr>
-        <w:t xml:space="preserve"> proporcionara </w:t>
-      </w:r>
-      <w:proofErr w:type="spellStart"/>
-      <w:r>
-        <w:rPr>
-          <w:rFonts w:ascii="Calibri Light" w:hAnsi="Calibri Light" w:cs="Calibri Light"/>
-        </w:rPr>
-        <w:t>los</w:t>
+      <w:proofErr w:type="spellStart"/>
+      <w:r>
+        <w:rPr>
+          <w:rFonts w:ascii="Calibri Light" w:hAnsi="Calibri Light" w:cs="Calibri Light"/>
+        </w:rPr>
+        <w:t>cual</w:t>
+      </w:r>
+      <w:proofErr w:type="spellEnd"/>
+      <w:r>
+        <w:rPr>
+          <w:rFonts w:ascii="Calibri Light" w:hAnsi="Calibri Light" w:cs="Calibri Light"/>
+        </w:rPr>
+        <w:t xml:space="preserve"> de </w:t>
+      </w:r>
+      <w:proofErr w:type="spellStart"/>
+      <w:r>
+        <w:rPr>
+          <w:rFonts w:ascii="Calibri Light" w:hAnsi="Calibri Light" w:cs="Calibri Light"/>
+        </w:rPr>
+        <w:t>ninguna</w:t>
       </w:r>
       <w:proofErr w:type="spellEnd"/>
       <w:r>
@@ -1730,14 +1910,56 @@
         <w:rPr>
           <w:rFonts w:ascii="Calibri Light" w:hAnsi="Calibri Light" w:cs="Calibri Light"/>
         </w:rPr>
-        <w:t>medios</w:t>
-      </w:r>
-      <w:proofErr w:type="spellEnd"/>
-      <w:r>
-        <w:rPr>
-          <w:rFonts w:ascii="Calibri Light" w:hAnsi="Calibri Light" w:cs="Calibri Light"/>
-        </w:rPr>
-        <w:t xml:space="preserve"> para que </w:t>
+        <w:t>manera</w:t>
+      </w:r>
+      <w:proofErr w:type="spellEnd"/>
+      <w:r>
+        <w:rPr>
+          <w:rFonts w:ascii="Calibri Light" w:hAnsi="Calibri Light" w:cs="Calibri Light"/>
+        </w:rPr>
+        <w:t xml:space="preserve"> implica </w:t>
+      </w:r>
+      <w:proofErr w:type="spellStart"/>
+      <w:r>
+        <w:rPr>
+          <w:rFonts w:ascii="Calibri Light" w:hAnsi="Calibri Light" w:cs="Calibri Light"/>
+        </w:rPr>
+        <w:t>subordinación</w:t>
+      </w:r>
+      <w:proofErr w:type="spellEnd"/>
+      <w:r>
+        <w:rPr>
+          <w:rFonts w:ascii="Calibri Light" w:hAnsi="Calibri Light" w:cs="Calibri Light"/>
+        </w:rPr>
+        <w:t xml:space="preserve"> laboral por parte de </w:t>
+      </w:r>
+      <w:proofErr w:type="spellStart"/>
+      <w:r>
+        <w:rPr>
+          <w:rFonts w:ascii="Calibri Light" w:hAnsi="Calibri Light" w:cs="Calibri Light"/>
+        </w:rPr>
+        <w:t>la</w:t>
+      </w:r>
+      <w:proofErr w:type="spellEnd"/>
+      <w:r>
+        <w:rPr>
+          <w:rFonts w:ascii="Calibri Light" w:hAnsi="Calibri Light" w:cs="Calibri Light"/>
+        </w:rPr>
+        <w:t xml:space="preserve"> </w:t>
+      </w:r>
+      <w:r>
+        <w:rPr>
+          <w:rFonts w:ascii="Calibri Light" w:hAnsi="Calibri Light" w:cs="Calibri Light"/>
+          <w:b/>
+          <w:bCs/>
+        </w:rPr>
+        <w:t xml:space="preserve">EMPRESA </w:t>
+      </w:r>
+      <w:r>
+        <w:rPr>
+          <w:rFonts w:ascii="Calibri Light" w:hAnsi="Calibri Light" w:cs="Calibri Light"/>
+        </w:rPr>
+        <w:t xml:space="preserve">sobre </w:t>
       </w:r>
       <w:proofErr w:type="spellStart"/>
       <w:r>
@@ -1759,8 +1981,37 @@
           <w:b/>
           <w:bCs/>
         </w:rPr>
-        <w:t>APRENDIZ</w:t>
-      </w:r>
+        <w:t xml:space="preserve">APRENDIZ </w:t>
+      </w:r>
+      <w:proofErr w:type="spellStart"/>
+      <w:r>
+        <w:rPr>
+          <w:rFonts w:ascii="Calibri Light" w:hAnsi="Calibri Light" w:cs="Calibri Light"/>
+        </w:rPr>
+        <w:t>pues</w:t>
+      </w:r>
+      <w:proofErr w:type="spellEnd"/>
+      <w:r>
+        <w:rPr>
+          <w:rFonts w:ascii="Calibri Light" w:hAnsi="Calibri Light" w:cs="Calibri Light"/>
+        </w:rPr>
+        <w:t xml:space="preserve"> este no es </w:t>
+      </w:r>
+      <w:r>
+        <w:rPr>
+          <w:rFonts w:ascii="Calibri Light" w:hAnsi="Calibri Light" w:cs="Calibri Light"/>
+        </w:rPr>
+        <w:lastRenderedPageBreak/>
+        <w:t xml:space="preserve">considerado para </w:t>
+      </w:r>
+      <w:proofErr w:type="spellStart"/>
+      <w:r>
+        <w:rPr>
+          <w:rFonts w:ascii="Calibri Light" w:hAnsi="Calibri Light" w:cs="Calibri Light"/>
+        </w:rPr>
+        <w:t>ningún</w:t>
+      </w:r>
+      <w:proofErr w:type="spellEnd"/>
       <w:r>
         <w:rPr>
           <w:rFonts w:ascii="Calibri Light" w:hAnsi="Calibri Light" w:cs="Calibri Light"/>
@@ -1772,7 +2023,21 @@
         <w:rPr>
           <w:rFonts w:ascii="Calibri Light" w:hAnsi="Calibri Light" w:cs="Calibri Light"/>
         </w:rPr>
-        <w:t>adquiera</w:t>
+        <w:t>efecto</w:t>
+      </w:r>
+      <w:proofErr w:type="spellEnd"/>
+      <w:r>
+        <w:rPr>
+          <w:rFonts w:ascii="Calibri Light" w:hAnsi="Calibri Light" w:cs="Calibri Light"/>
+        </w:rPr>
+        <w:t xml:space="preserve"> como </w:t>
+      </w:r>
+      <w:proofErr w:type="spellStart"/>
+      <w:r>
+        <w:rPr>
+          <w:rFonts w:ascii="Calibri Light" w:hAnsi="Calibri Light" w:cs="Calibri Light"/>
+        </w:rPr>
+        <w:t>un</w:t>
       </w:r>
       <w:proofErr w:type="spellEnd"/>
       <w:r>
@@ -1786,7 +2051,21 @@
         <w:rPr>
           <w:rFonts w:ascii="Calibri Light" w:hAnsi="Calibri Light" w:cs="Calibri Light"/>
         </w:rPr>
-        <w:t>formación</w:t>
+        <w:t>trabajador</w:t>
+      </w:r>
+      <w:proofErr w:type="spellEnd"/>
+      <w:r>
+        <w:rPr>
+          <w:rFonts w:ascii="Calibri Light" w:hAnsi="Calibri Light" w:cs="Calibri Light"/>
+        </w:rPr>
+        <w:t xml:space="preserve"> de </w:t>
+      </w:r>
+      <w:proofErr w:type="spellStart"/>
+      <w:r>
+        <w:rPr>
+          <w:rFonts w:ascii="Calibri Light" w:hAnsi="Calibri Light" w:cs="Calibri Light"/>
+        </w:rPr>
+        <w:t>la</w:t>
       </w:r>
       <w:proofErr w:type="spellEnd"/>
       <w:r>
@@ -1795,47 +2074,19 @@
         </w:rPr>
         <w:t xml:space="preserve"> </w:t>
       </w:r>
-      <w:proofErr w:type="spellStart"/>
-      <w:r>
-        <w:rPr>
-          <w:rFonts w:ascii="Calibri Light" w:hAnsi="Calibri Light" w:cs="Calibri Light"/>
-        </w:rPr>
-        <w:t>profesional</w:t>
-      </w:r>
-      <w:proofErr w:type="spellEnd"/>
-      <w:r>
-        <w:rPr>
-          <w:rFonts w:ascii="Calibri Light" w:hAnsi="Calibri Light" w:cs="Calibri Light"/>
-        </w:rPr>
-        <w:t xml:space="preserve"> y metódica, dentro de una </w:t>
-      </w:r>
-      <w:proofErr w:type="spellStart"/>
-      <w:r>
-        <w:rPr>
-          <w:rFonts w:ascii="Calibri Light" w:hAnsi="Calibri Light" w:cs="Calibri Light"/>
-        </w:rPr>
-        <w:t>relación</w:t>
-      </w:r>
-      <w:proofErr w:type="spellEnd"/>
-      <w:r>
-        <w:rPr>
-          <w:rFonts w:ascii="Calibri Light" w:hAnsi="Calibri Light" w:cs="Calibri Light"/>
-        </w:rPr>
-        <w:t xml:space="preserve"> de </w:t>
-      </w:r>
-      <w:proofErr w:type="spellStart"/>
-      <w:r>
-        <w:rPr>
-          <w:rFonts w:ascii="Calibri Light" w:hAnsi="Calibri Light" w:cs="Calibri Light"/>
-        </w:rPr>
-        <w:t>aprendizaje</w:t>
-      </w:r>
-      <w:proofErr w:type="spellEnd"/>
-      <w:r>
-        <w:rPr>
-          <w:rFonts w:ascii="Calibri Light" w:hAnsi="Calibri Light" w:cs="Calibri Light"/>
-        </w:rPr>
-        <w:t xml:space="preserve">, </w:t>
+      <w:r>
+        <w:rPr>
+          <w:rFonts w:ascii="Calibri Light" w:hAnsi="Calibri Light" w:cs="Calibri Light"/>
+          <w:b/>
+          <w:bCs/>
+        </w:rPr>
+        <w:t xml:space="preserve">EMPRESA </w:t>
+      </w:r>
+      <w:r>
+        <w:rPr>
+          <w:rFonts w:ascii="Calibri Light" w:hAnsi="Calibri Light" w:cs="Calibri Light"/>
+        </w:rPr>
+        <w:t xml:space="preserve">y </w:t>
       </w:r>
       <w:proofErr w:type="spellStart"/>
       <w:r>
@@ -1856,55 +2107,6 @@
         <w:rPr>
           <w:rFonts w:ascii="Calibri Light" w:hAnsi="Calibri Light" w:cs="Calibri Light"/>
         </w:rPr>
-        <w:t>cual</w:t>
-      </w:r>
-      <w:proofErr w:type="spellEnd"/>
-      <w:r>
-        <w:rPr>
-          <w:rFonts w:ascii="Calibri Light" w:hAnsi="Calibri Light" w:cs="Calibri Light"/>
-        </w:rPr>
-        <w:t xml:space="preserve"> de </w:t>
-      </w:r>
-      <w:proofErr w:type="spellStart"/>
-      <w:r>
-        <w:rPr>
-          <w:rFonts w:ascii="Calibri Light" w:hAnsi="Calibri Light" w:cs="Calibri Light"/>
-        </w:rPr>
-        <w:t>ninguna</w:t>
-      </w:r>
-      <w:proofErr w:type="spellEnd"/>
-      <w:r>
-        <w:rPr>
-          <w:rFonts w:ascii="Calibri Light" w:hAnsi="Calibri Light" w:cs="Calibri Light"/>
-        </w:rPr>
-        <w:t xml:space="preserve"> </w:t>
-      </w:r>
-      <w:proofErr w:type="spellStart"/>
-      <w:r>
-        <w:rPr>
-          <w:rFonts w:ascii="Calibri Light" w:hAnsi="Calibri Light" w:cs="Calibri Light"/>
-        </w:rPr>
-        <w:t>manera</w:t>
-      </w:r>
-      <w:proofErr w:type="spellEnd"/>
-      <w:r>
-        <w:rPr>
-          <w:rFonts w:ascii="Calibri Light" w:hAnsi="Calibri Light" w:cs="Calibri Light"/>
-        </w:rPr>
-        <w:t xml:space="preserve"> </w:t>
-      </w:r>
-      <w:r>
-        <w:rPr>
-          <w:rFonts w:ascii="Calibri Light" w:hAnsi="Calibri Light" w:cs="Calibri Light"/>
-        </w:rPr>
-        <w:lastRenderedPageBreak/>
-        <w:t xml:space="preserve">implica </w:t>
-      </w:r>
-      <w:proofErr w:type="spellStart"/>
-      <w:r>
-        <w:rPr>
-          <w:rFonts w:ascii="Calibri Light" w:hAnsi="Calibri Light" w:cs="Calibri Light"/>
-        </w:rPr>
         <w:t>subordinación</w:t>
       </w:r>
       <w:proofErr w:type="spellEnd"/>
@@ -1912,164 +2114,8 @@
         <w:rPr>
           <w:rFonts w:ascii="Calibri Light" w:hAnsi="Calibri Light" w:cs="Calibri Light"/>
         </w:rPr>
-        <w:t xml:space="preserve"> laboral por parte de </w:t>
-      </w:r>
-      <w:proofErr w:type="spellStart"/>
-      <w:r>
-        <w:rPr>
-          <w:rFonts w:ascii="Calibri Light" w:hAnsi="Calibri Light" w:cs="Calibri Light"/>
-        </w:rPr>
-        <w:t>la</w:t>
-      </w:r>
-      <w:proofErr w:type="spellEnd"/>
-      <w:r>
-        <w:rPr>
-          <w:rFonts w:ascii="Calibri Light" w:hAnsi="Calibri Light" w:cs="Calibri Light"/>
-        </w:rPr>
-        <w:t xml:space="preserve"> </w:t>
-      </w:r>
-      <w:r>
-        <w:rPr>
-          <w:rFonts w:ascii="Calibri Light" w:hAnsi="Calibri Light" w:cs="Calibri Light"/>
-          <w:b/>
-          <w:bCs/>
-        </w:rPr>
-        <w:t xml:space="preserve">EMPRESA </w:t>
-      </w:r>
-      <w:r>
-        <w:rPr>
-          <w:rFonts w:ascii="Calibri Light" w:hAnsi="Calibri Light" w:cs="Calibri Light"/>
-        </w:rPr>
-        <w:t xml:space="preserve">sobre </w:t>
-      </w:r>
-      <w:proofErr w:type="spellStart"/>
-      <w:r>
-        <w:rPr>
-          <w:rFonts w:ascii="Calibri Light" w:hAnsi="Calibri Light" w:cs="Calibri Light"/>
-        </w:rPr>
-        <w:t>el</w:t>
-      </w:r>
-      <w:proofErr w:type="spellEnd"/>
-      <w:r>
-        <w:rPr>
-          <w:rFonts w:ascii="Calibri Light" w:hAnsi="Calibri Light" w:cs="Calibri Light"/>
-        </w:rPr>
-        <w:t xml:space="preserve"> </w:t>
-      </w:r>
-      <w:r>
-        <w:rPr>
-          <w:rFonts w:ascii="Calibri Light" w:hAnsi="Calibri Light" w:cs="Calibri Light"/>
-          <w:b/>
-          <w:bCs/>
-        </w:rPr>
-        <w:t xml:space="preserve">APRENDIZ </w:t>
-      </w:r>
-      <w:proofErr w:type="spellStart"/>
-      <w:r>
-        <w:rPr>
-          <w:rFonts w:ascii="Calibri Light" w:hAnsi="Calibri Light" w:cs="Calibri Light"/>
-        </w:rPr>
-        <w:t>pues</w:t>
-      </w:r>
-      <w:proofErr w:type="spellEnd"/>
-      <w:r>
-        <w:rPr>
-          <w:rFonts w:ascii="Calibri Light" w:hAnsi="Calibri Light" w:cs="Calibri Light"/>
-        </w:rPr>
-        <w:t xml:space="preserve"> este no es considerado para </w:t>
-      </w:r>
-      <w:proofErr w:type="spellStart"/>
-      <w:r>
-        <w:rPr>
-          <w:rFonts w:ascii="Calibri Light" w:hAnsi="Calibri Light" w:cs="Calibri Light"/>
-        </w:rPr>
-        <w:t>ningún</w:t>
-      </w:r>
-      <w:proofErr w:type="spellEnd"/>
-      <w:r>
-        <w:rPr>
-          <w:rFonts w:ascii="Calibri Light" w:hAnsi="Calibri Light" w:cs="Calibri Light"/>
-        </w:rPr>
-        <w:t xml:space="preserve"> </w:t>
-      </w:r>
-      <w:proofErr w:type="spellStart"/>
-      <w:r>
-        <w:rPr>
-          <w:rFonts w:ascii="Calibri Light" w:hAnsi="Calibri Light" w:cs="Calibri Light"/>
-        </w:rPr>
-        <w:t>efecto</w:t>
-      </w:r>
-      <w:proofErr w:type="spellEnd"/>
-      <w:r>
-        <w:rPr>
-          <w:rFonts w:ascii="Calibri Light" w:hAnsi="Calibri Light" w:cs="Calibri Light"/>
-        </w:rPr>
-        <w:t xml:space="preserve"> como </w:t>
-      </w:r>
-      <w:proofErr w:type="spellStart"/>
-      <w:r>
-        <w:rPr>
-          <w:rFonts w:ascii="Calibri Light" w:hAnsi="Calibri Light" w:cs="Calibri Light"/>
-        </w:rPr>
-        <w:t>un</w:t>
-      </w:r>
-      <w:proofErr w:type="spellEnd"/>
-      <w:r>
-        <w:rPr>
-          <w:rFonts w:ascii="Calibri Light" w:hAnsi="Calibri Light" w:cs="Calibri Light"/>
-        </w:rPr>
-        <w:t xml:space="preserve"> </w:t>
-      </w:r>
-      <w:proofErr w:type="spellStart"/>
-      <w:r>
-        <w:rPr>
-          <w:rFonts w:ascii="Calibri Light" w:hAnsi="Calibri Light" w:cs="Calibri Light"/>
-        </w:rPr>
-        <w:t>trabajador</w:t>
-      </w:r>
-      <w:proofErr w:type="spellEnd"/>
-      <w:r>
-        <w:rPr>
-          <w:rFonts w:ascii="Calibri Light" w:hAnsi="Calibri Light" w:cs="Calibri Light"/>
-        </w:rPr>
-        <w:t xml:space="preserve"> de </w:t>
-      </w:r>
-      <w:proofErr w:type="spellStart"/>
-      <w:r>
-        <w:rPr>
-          <w:rFonts w:ascii="Calibri Light" w:hAnsi="Calibri Light" w:cs="Calibri Light"/>
-        </w:rPr>
-        <w:t>la</w:t>
-      </w:r>
-      <w:proofErr w:type="spellEnd"/>
-      <w:r>
-        <w:rPr>
-          <w:rFonts w:ascii="Calibri Light" w:hAnsi="Calibri Light" w:cs="Calibri Light"/>
-        </w:rPr>
-        <w:t xml:space="preserve"> </w:t>
-      </w:r>
-      <w:r>
-        <w:rPr>
-          <w:rFonts w:ascii="Calibri Light" w:hAnsi="Calibri Light" w:cs="Calibri Light"/>
-          <w:b/>
-          <w:bCs/>
-        </w:rPr>
-        <w:t xml:space="preserve">EMPRESA </w:t>
-      </w:r>
-      <w:r>
-        <w:rPr>
-          <w:rFonts w:ascii="Calibri Light" w:hAnsi="Calibri Light" w:cs="Calibri Light"/>
-        </w:rPr>
-        <w:t xml:space="preserve">y </w:t>
-      </w:r>
-      <w:proofErr w:type="spellStart"/>
-      <w:r>
-        <w:rPr>
-          <w:rFonts w:ascii="Calibri Light" w:hAnsi="Calibri Light" w:cs="Calibri Light"/>
-        </w:rPr>
-        <w:t>la</w:t>
-      </w:r>
-      <w:proofErr w:type="spellEnd"/>
+        <w:t xml:space="preserve"> se limita a las actividades propias del aprendizaje de acuerdo con el literal b) del artículo 21 de la Ley 2466 de 2025.</w:t>
+      </w:r>
     </w:p>
     <w:p>
       <w:pPr>
@@ -2083,7 +2129,7 @@
         <w:rPr>
           <w:rFonts w:ascii="Calibri Light" w:hAnsi="Calibri Light" w:cs="Calibri Light"/>
         </w:rPr>
-        <w:t>subordinación se limita a las actividades propias del aprendizaje de acuerdo con el literal b) del artículo 21 de la Ley 2466 de 2025.</w:t>
+        <w:t>En ese sentido, las partes suscriben el presente contrato de aprendizaje como una forma especial dentro del Derecho Laboral mediante la cual una persona natural desarrolla formación teórica práctica en una entidad de formación legalmente autorizada, a cambio de que esta le proporcione los medios para adquirir formación profesional metódica y completa requerida en el oficio, actividad u ocupación, bajo la tutela de una EMPRESA.</w:t>
       </w:r>
     </w:p>
     <w:p>
@@ -2092,13 +2138,37 @@
         <w:jc w:val="both"/>
         <w:rPr>
           <w:rFonts w:ascii="Calibri Light" w:hAnsi="Calibri Light" w:cs="Calibri Light"/>
-        </w:rPr>
-      </w:pPr>
-      <w:r>
-        <w:rPr>
-          <w:rFonts w:ascii="Calibri Light" w:hAnsi="Calibri Light" w:cs="Calibri Light"/>
-        </w:rPr>
-        <w:t>En ese sentido, las partes suscriben el presente contrato de aprendizaje como una forma especial dentro del Derecho Laboral mediante la cual una persona natural desarrolla formación teórica práctica en una entidad de formación legalmente autorizada, a cambio de que esta le proporcione los medios para adquirir formación profesional metódica y completa requerida en el oficio, actividad u ocupación, bajo la tutela de una EMPRESA.</w:t>
+          <w:b/>
+          <w:bCs/>
+        </w:rPr>
+      </w:pPr>
+      <w:r>
+        <w:rPr>
+          <w:rFonts w:ascii="Calibri Light" w:hAnsi="Calibri Light" w:cs="Calibri Light"/>
+          <w:b/>
+          <w:bCs/>
+        </w:rPr>
+        <w:t xml:space="preserve">PARÁGRAFO: </w:t>
+      </w:r>
+      <w:r>
+        <w:rPr>
+          <w:rFonts w:ascii="Calibri Light" w:hAnsi="Calibri Light" w:cs="Calibri Light"/>
+        </w:rPr>
+        <w:t xml:space="preserve">Este contrato no podrá utilizarse para sustituir trabajadores, funciones permanentes o cargos estructurales dentro de la </w:t>
+      </w:r>
+      <w:r>
+        <w:rPr>
+          <w:rFonts w:ascii="Calibri Light" w:hAnsi="Calibri Light" w:cs="Calibri Light"/>
+          <w:b/>
+          <w:bCs/>
+        </w:rPr>
+        <w:t>EMPRESA</w:t>
+      </w:r>
+      <w:r>
+        <w:rPr>
+          <w:rFonts w:ascii="Calibri Light" w:hAnsi="Calibri Light" w:cs="Calibri Light"/>
+        </w:rPr>
+        <w:t>, conforme lo dispone expresamente el numeral 6 del Artículo 21 de la Ley 2466 de 2025.</w:t>
       </w:r>
     </w:p>
     <w:p>
@@ -2107,45 +2177,6 @@
         <w:jc w:val="both"/>
         <w:rPr>
           <w:rFonts w:ascii="Calibri Light" w:hAnsi="Calibri Light" w:cs="Calibri Light"/>
-          <w:b/>
-          <w:bCs/>
-        </w:rPr>
-      </w:pPr>
-      <w:r>
-        <w:rPr>
-          <w:rFonts w:ascii="Calibri Light" w:hAnsi="Calibri Light" w:cs="Calibri Light"/>
-          <w:b/>
-          <w:bCs/>
-        </w:rPr>
-        <w:t xml:space="preserve">PARÁGRAFO: </w:t>
-      </w:r>
-      <w:r>
-        <w:rPr>
-          <w:rFonts w:ascii="Calibri Light" w:hAnsi="Calibri Light" w:cs="Calibri Light"/>
-        </w:rPr>
-        <w:t xml:space="preserve">Este contrato no podrá utilizarse para sustituir trabajadores, funciones permanentes o cargos estructurales dentro de la </w:t>
-      </w:r>
-      <w:r>
-        <w:rPr>
-          <w:rFonts w:ascii="Calibri Light" w:hAnsi="Calibri Light" w:cs="Calibri Light"/>
-          <w:b/>
-          <w:bCs/>
-        </w:rPr>
-        <w:t>EMPRESA</w:t>
-      </w:r>
-      <w:r>
-        <w:rPr>
-          <w:rFonts w:ascii="Calibri Light" w:hAnsi="Calibri Light" w:cs="Calibri Light"/>
-        </w:rPr>
-        <w:t>, conforme lo dispone expresamente el numeral 6 del Artículo 21 de la Ley 2466 de 2025.</w:t>
-      </w:r>
-    </w:p>
-    <w:p>
-      <w:pPr>
-        <w:spacing w:line="240" w:lineRule="auto"/>
-        <w:jc w:val="both"/>
-        <w:rPr>
-          <w:rFonts w:ascii="Calibri Light" w:hAnsi="Calibri Light" w:cs="Calibri Light"/>
         </w:rPr>
       </w:pPr>
       <w:r>
@@ -2252,7 +2283,19 @@
         <w:rPr>
           <w:rFonts w:ascii="Calibri Light" w:hAnsi="Calibri Light" w:cs="Calibri Light"/>
         </w:rPr>
-        <w:t xml:space="preserve"> fecha de terminación de este, sin que pueda exceder de tres (3) años.  Así las cosas, se deja previsto que el contrato finalizará en la fecha de terminación indicada el sin que sea necesaria la presentación de un aviso previo o el cumplimiento de un requisito adicional. </w:t>
+        <w:t xml:space="preserve"> fecha de terminación de este, sin que pueda exceder de tres (3) años.</w:t>
+      </w:r>
+      <w:r>
+        <w:rPr>
+          <w:rFonts w:ascii="Calibri Light" w:hAnsi="Calibri Light" w:cs="Calibri Light"/>
+        </w:rPr>
+        <w:t xml:space="preserve"> </w:t>
+      </w:r>
+      <w:r>
+        <w:rPr>
+          <w:rFonts w:ascii="Calibri Light" w:hAnsi="Calibri Light" w:cs="Calibri Light"/>
+        </w:rPr>
+        <w:t xml:space="preserve">Así las cosas, se deja previsto que el contrato finalizará en la fecha de terminación indicada el sin que sea necesaria la presentación de un aviso previo o el cumplimiento de un requisito adicional. </w:t>
       </w:r>
     </w:p>
     <w:p>
@@ -2459,6 +2502,7 @@
           <w:rFonts w:ascii="Calibri Light" w:hAnsi="Calibri Light" w:cs="Calibri Light"/>
           <w:b/>
         </w:rPr>
+        <w:lastRenderedPageBreak/>
         <w:t xml:space="preserve">PARÁGRAFO </w:t>
       </w:r>
       <w:proofErr w:type="gramStart"/>
@@ -2857,7 +2901,6 @@
         <w:rPr>
           <w:rFonts w:ascii="Calibri Light" w:hAnsi="Calibri Light" w:cs="Calibri Light"/>
         </w:rPr>
-        <w:lastRenderedPageBreak/>
         <w:t xml:space="preserve">b) </w:t>
       </w:r>
       <w:r>
@@ -2879,7 +2922,14 @@
         <w:rPr>
           <w:rFonts w:ascii="Calibri Light" w:hAnsi="Calibri Light" w:cs="Calibri Light"/>
         </w:rPr>
-        <w:t xml:space="preserve"> para desarrollar su formación en la fase productiva, durante el periodo establecido para el mismo, en las actividades que se le encomiende y que guarde relación con la Formación, cumpliendo con las indicaciones que le señale la</w:t>
+        <w:t xml:space="preserve"> para desarrollar su formación en la fase productiva, durante el periodo establecido para el mismo, en las actividades que se le </w:t>
+      </w:r>
+      <w:r>
+        <w:rPr>
+          <w:rFonts w:ascii="Calibri Light" w:hAnsi="Calibri Light" w:cs="Calibri Light"/>
+        </w:rPr>
+        <w:lastRenderedPageBreak/>
+        <w:t>encomiende y que guarde relación con la Formación, cumpliendo con las indicaciones que le señale la</w:t>
       </w:r>
       <w:r>
         <w:rPr>
@@ -3235,14 +3285,14 @@
         <w:rPr>
           <w:rFonts w:ascii="Calibri Light" w:hAnsi="Calibri Light" w:cs="Calibri Light"/>
         </w:rPr>
-        <w:t xml:space="preserve"> para el desarrollo de su objetivo, que no tenga el carácter de públicos cualquiera que sea la </w:t>
+        <w:t xml:space="preserve"> para el desarrollo de su objetivo, que no tenga el carácter de públicos cualquiera que sea la fuente en que se encuentren. Los datos contenidos en las anteriores fuentes, así como </w:t>
       </w:r>
       <w:r>
         <w:rPr>
           <w:rFonts w:ascii="Calibri Light" w:hAnsi="Calibri Light" w:cs="Calibri Light"/>
         </w:rPr>
         <w:lastRenderedPageBreak/>
-        <w:t xml:space="preserve">fuente en que se encuentren. Los datos contenidos en las anteriores fuentes, así como cualesquiera otros obtenidos con causa y con ocasión del contrato de Aprendizaje se denominarán para efectos de este convenio </w:t>
+        <w:t xml:space="preserve">cualesquiera otros obtenidos con causa y con ocasión del contrato de Aprendizaje se denominarán para efectos de este convenio </w:t>
       </w:r>
       <w:r>
         <w:rPr>
@@ -4142,14 +4192,14 @@
         <w:rPr>
           <w:rFonts w:ascii="Calibri Light" w:hAnsi="Calibri Light" w:cs="Calibri Light"/>
         </w:rPr>
-        <w:t xml:space="preserve">, y en consecuencia se obliga a:  3.1.  Utilizar los Sistemas de Información </w:t>
+        <w:t xml:space="preserve">, y en consecuencia se obliga a:  3.1.  Utilizar los Sistemas de Información únicamente para propósitos aprobados con ocasión del desarrollo del Contrato de Aprendizaje. 3.2. </w:t>
       </w:r>
       <w:r>
         <w:rPr>
           <w:rFonts w:ascii="Calibri Light" w:hAnsi="Calibri Light" w:cs="Calibri Light"/>
         </w:rPr>
         <w:lastRenderedPageBreak/>
-        <w:t xml:space="preserve">únicamente para propósitos aprobados con ocasión del desarrollo del Contrato de Aprendizaje. 3.2. Mantener confidencialmente sus identificaciones, </w:t>
+        <w:t xml:space="preserve">Mantener confidencialmente sus identificaciones, </w:t>
       </w:r>
       <w:proofErr w:type="spellStart"/>
       <w:r>
@@ -4923,14 +4973,14 @@
         <w:rPr>
           <w:rFonts w:ascii="Calibri Light" w:hAnsi="Calibri Light" w:cs="Calibri Light"/>
         </w:rPr>
-        <w:t xml:space="preserve"> en el respectivo Centro de Formación del SENA (o en el Centro </w:t>
+        <w:t xml:space="preserve"> en el respectivo Centro de Formación del SENA (o en el Centro Educativo donde estuviere adelantando los estudios el aprendiz), la asistencia, como el rendimiento </w:t>
       </w:r>
       <w:r>
         <w:rPr>
           <w:rFonts w:ascii="Calibri Light" w:hAnsi="Calibri Light" w:cs="Calibri Light"/>
         </w:rPr>
         <w:lastRenderedPageBreak/>
-        <w:t xml:space="preserve">Educativo donde estuviere adelantando los estudios el aprendiz), la asistencia, como el rendimiento académico, a efectos de verificar y asegurar la real y efectiva utilización del tiempo en la etapa lectiva por parte de este, sin que esto suponga la existencia de una relación jerárquica con algún representante de la </w:t>
+        <w:t xml:space="preserve">académico, a efectos de verificar y asegurar la real y efectiva utilización del tiempo en la etapa lectiva por parte de este, sin que esto suponga la existencia de una relación jerárquica con algún representante de la </w:t>
       </w:r>
       <w:r>
         <w:rPr>
@@ -6069,42 +6119,42 @@
         <w:rPr>
           <w:rFonts w:ascii="Calibri Light" w:hAnsi="Calibri Light" w:cs="Calibri Light"/>
         </w:rPr>
-        <w:t xml:space="preserve">. El presente Contrato de aprendizaje por expresa disposición legal corresponde a un contrato especial laboral a término fijo, por lo que la naturaleza </w:t>
+        <w:t xml:space="preserve">. El presente Contrato de aprendizaje por expresa disposición legal corresponde a un contrato especial laboral a término fijo, por lo que la naturaleza de la relación que une al </w:t>
+      </w:r>
+      <w:r>
+        <w:rPr>
+          <w:rFonts w:ascii="Calibri Light" w:hAnsi="Calibri Light" w:cs="Calibri Light"/>
+          <w:b/>
+          <w:bCs/>
+        </w:rPr>
+        <w:t xml:space="preserve">APRENDIZ </w:t>
+      </w:r>
+      <w:r>
+        <w:rPr>
+          <w:rFonts w:ascii="Calibri Light" w:hAnsi="Calibri Light" w:cs="Calibri Light"/>
+        </w:rPr>
+        <w:t xml:space="preserve">y a la </w:t>
+      </w:r>
+      <w:r>
+        <w:rPr>
+          <w:rFonts w:ascii="Calibri Light" w:hAnsi="Calibri Light" w:cs="Calibri Light"/>
+          <w:b/>
+          <w:bCs/>
+        </w:rPr>
+        <w:t xml:space="preserve">EMPRESA </w:t>
+      </w:r>
+      <w:r>
+        <w:rPr>
+          <w:rFonts w:ascii="Calibri Light" w:hAnsi="Calibri Light" w:cs="Calibri Light"/>
+        </w:rPr>
+        <w:t xml:space="preserve">es de carácter formativo y de aprendizaje. Así las </w:t>
       </w:r>
       <w:r>
         <w:rPr>
           <w:rFonts w:ascii="Calibri Light" w:hAnsi="Calibri Light" w:cs="Calibri Light"/>
         </w:rPr>
         <w:lastRenderedPageBreak/>
-        <w:t xml:space="preserve">de la relación que une al </w:t>
-      </w:r>
-      <w:r>
-        <w:rPr>
-          <w:rFonts w:ascii="Calibri Light" w:hAnsi="Calibri Light" w:cs="Calibri Light"/>
-          <w:b/>
-          <w:bCs/>
-        </w:rPr>
-        <w:t xml:space="preserve">APRENDIZ </w:t>
-      </w:r>
-      <w:r>
-        <w:rPr>
-          <w:rFonts w:ascii="Calibri Light" w:hAnsi="Calibri Light" w:cs="Calibri Light"/>
-        </w:rPr>
-        <w:t xml:space="preserve">y a la </w:t>
-      </w:r>
-      <w:r>
-        <w:rPr>
-          <w:rFonts w:ascii="Calibri Light" w:hAnsi="Calibri Light" w:cs="Calibri Light"/>
-          <w:b/>
-          <w:bCs/>
-        </w:rPr>
-        <w:t xml:space="preserve">EMPRESA </w:t>
-      </w:r>
-      <w:r>
-        <w:rPr>
-          <w:rFonts w:ascii="Calibri Light" w:hAnsi="Calibri Light" w:cs="Calibri Light"/>
-        </w:rPr>
-        <w:t xml:space="preserve">es de carácter formativo y de aprendizaje. Así las cosas, de ninguna manera el </w:t>
+        <w:t xml:space="preserve">cosas, de ninguna manera el </w:t>
       </w:r>
       <w:r>
         <w:rPr>
@@ -6693,8 +6743,16 @@
           <w:noProof/>
           <w:color w:val="000000" w:themeColor="text1"/>
         </w:rPr>
+        <w:t xml:space="preserve">Los datos personales recopilados serán usados, almacenados, procesados, transferidos (nacional e internacionalmente) y circulados para las finalidades descritas en la Política de Tratamiento de Datos </w:t>
+      </w:r>
+      <w:r>
+        <w:rPr>
+          <w:rFonts w:ascii="Calibri Light" w:eastAsia="Century Gothic" w:hAnsi="Calibri Light" w:cs="Calibri Light"/>
+          <w:noProof/>
+          <w:color w:val="000000" w:themeColor="text1"/>
+        </w:rPr>
         <w:lastRenderedPageBreak/>
-        <w:t xml:space="preserve">Los datos personales recopilados serán usados, almacenados, procesados, transferidos (nacional e internacionalmente) y circulados para las finalidades descritas en la Política de Tratamiento de Datos personales disponible en la página de </w:t>
+        <w:t xml:space="preserve">personales disponible en la página de </w:t>
       </w:r>
       <w:r>
         <w:rPr>
@@ -7064,14 +7122,7 @@
         <w:rPr>
           <w:rFonts w:ascii="Calibri Light" w:hAnsi="Calibri Light" w:cs="Calibri Light"/>
         </w:rPr>
-        <w:t xml:space="preserve"> y acepta que en caso de incumplimiento el presente contrato se terminará con justa causa y se le impondrá a título apremio una suma de dinero correspondiente a veinticuatro (24) veces el valor estipulado en la cláusula segunda del presente </w:t>
-      </w:r>
-      <w:r>
-        <w:rPr>
-          <w:rFonts w:ascii="Calibri Light" w:hAnsi="Calibri Light" w:cs="Calibri Light"/>
-        </w:rPr>
-        <w:lastRenderedPageBreak/>
-        <w:t>contrato, sin perjuicio de las indemnizaciones de perjuicios a que haya lugar y de las demás sanciones previstas en el presente contrato.</w:t>
+        <w:t xml:space="preserve"> y acepta que en caso de incumplimiento el presente contrato se terminará con justa causa y se le impondrá a título apremio una suma de dinero correspondiente a veinticuatro (24) veces el valor estipulado en la cláusula segunda del presente contrato, sin perjuicio de las indemnizaciones de perjuicios a que haya lugar y de las demás sanciones previstas en el presente contrato.</w:t>
       </w:r>
     </w:p>
     <w:p>
@@ -7090,6 +7141,7 @@
           <w:b/>
           <w:bCs/>
         </w:rPr>
+        <w:lastRenderedPageBreak/>
         <w:t>DÉCIMO PRIMERA</w:t>
       </w:r>
       <w:r>
@@ -7511,14 +7563,7 @@
           <w:rFonts w:ascii="Calibri Light" w:hAnsi="Calibri Light" w:cs="Calibri Light"/>
         </w:rPr>
         <w:tab/>
-        <w:t xml:space="preserve">En caso de nuevas disposiciones legales que tipifiquen conductas ilícitas, las PARTES se </w:t>
-      </w:r>
-      <w:r>
-        <w:rPr>
-          <w:rFonts w:ascii="Calibri Light" w:hAnsi="Calibri Light" w:cs="Calibri Light"/>
-        </w:rPr>
-        <w:lastRenderedPageBreak/>
-        <w:t>comprometen a hacer las declaraciones necesarias conforme se requiera.</w:t>
+        <w:t>En caso de nuevas disposiciones legales que tipifiquen conductas ilícitas, las PARTES se comprometen a hacer las declaraciones necesarias conforme se requiera.</w:t>
       </w:r>
     </w:p>
     <w:p>
@@ -7552,7 +7597,14 @@
         <w:rPr>
           <w:rFonts w:ascii="Calibri Light" w:hAnsi="Calibri Light" w:cs="Calibri Light"/>
         </w:rPr>
-        <w:t>Si en cualquier momento se constata que estas declaraciones no son válidas o se niegan a declarar sobre nuevas conductas ilícitas, la PARTE cumplida podrá rescindir el contrato unilateralmente y sin indemnización.</w:t>
+        <w:t xml:space="preserve">Si en cualquier momento se constata que estas declaraciones no son válidas o se niegan a declarar </w:t>
+      </w:r>
+      <w:r>
+        <w:rPr>
+          <w:rFonts w:ascii="Calibri Light" w:hAnsi="Calibri Light" w:cs="Calibri Light"/>
+        </w:rPr>
+        <w:lastRenderedPageBreak/>
+        <w:t>sobre nuevas conductas ilícitas, la PARTE cumplida podrá rescindir el contrato unilateralmente y sin indemnización.</w:t>
       </w:r>
     </w:p>
     <w:p>
@@ -7950,6 +8002,7 @@
           <w:b/>
           <w:bCs/>
         </w:rPr>
+        <w:lastRenderedPageBreak/>
         <w:t xml:space="preserve">DECIMO SÉPTIMA: VIGENCIA. </w:t>
       </w:r>
       <w:r>
@@ -8054,49 +8107,27 @@
         <w:rPr>
           <w:rFonts w:ascii="Calibri Light" w:hAnsi="Calibri Light" w:cs="Calibri Light"/>
         </w:rPr>
-        <w:t xml:space="preserve">Para efectos de lo anterior, firman el </w:t>
-      </w:r>
-      <w:r>
-        <w:rPr>
-          <w:rFonts w:ascii="Calibri Light" w:hAnsi="Calibri Light" w:cs="Calibri Light"/>
-        </w:rPr>
-        <w:t>22</w:t>
-      </w:r>
-      <w:r>
-        <w:rPr>
-          <w:rFonts w:ascii="Calibri Light" w:hAnsi="Calibri Light" w:cs="Calibri Light"/>
-        </w:rPr>
-        <w:t xml:space="preserve"> de </w:t>
-      </w:r>
-      <w:r>
-        <w:rPr>
-          <w:rFonts w:ascii="Calibri Light" w:hAnsi="Calibri Light" w:cs="Calibri Light"/>
-        </w:rPr>
-        <w:t>mayo</w:t>
-      </w:r>
-      <w:r>
-        <w:rPr>
-          <w:rFonts w:ascii="Calibri Light" w:hAnsi="Calibri Light" w:cs="Calibri Light"/>
-        </w:rPr>
-        <w:t xml:space="preserve"> </w:t>
-      </w:r>
-      <w:r>
-        <w:rPr>
-          <w:rFonts w:ascii="Calibri Light" w:hAnsi="Calibri Light" w:cs="Calibri Light"/>
-        </w:rPr>
-        <w:t>de 202</w:t>
-      </w:r>
-      <w:r>
-        <w:rPr>
-          <w:rFonts w:ascii="Calibri Light" w:hAnsi="Calibri Light" w:cs="Calibri Light"/>
-        </w:rPr>
-        <w:t>6</w:t>
-      </w:r>
-      <w:r>
-        <w:rPr>
-          <w:rFonts w:ascii="Calibri Light" w:hAnsi="Calibri Light" w:cs="Calibri Light"/>
-        </w:rPr>
-        <w:t>,</w:t>
+        <w:t>Para efectos de lo anterior, firman el</w:t>
+      </w:r>
+      <w:r>
+        <w:rPr>
+          <w:rFonts w:ascii="Calibri Light" w:hAnsi="Calibri Light" w:cs="Calibri Light"/>
+        </w:rPr>
+        <w:t xml:space="preserve"> [[</w:t>
+      </w:r>
+      <w:proofErr w:type="spellStart"/>
+      <w:r>
+        <w:rPr>
+          <w:rFonts w:ascii="Calibri Light" w:hAnsi="Calibri Light" w:cs="Calibri Light"/>
+        </w:rPr>
+        <w:t>FechaLarga</w:t>
+      </w:r>
+      <w:proofErr w:type="spellEnd"/>
+      <w:r>
+        <w:rPr>
+          <w:rFonts w:ascii="Calibri Light" w:hAnsi="Calibri Light" w:cs="Calibri Light"/>
+        </w:rPr>
+        <w:t>]]</w:t>
       </w:r>
     </w:p>
     <w:p>
@@ -8537,7 +8568,7 @@
             </wp:anchor>
           </w:drawing>
         </mc:Choice>
-        <mc:Fallback xmlns:w16sdtfl="http://schemas.microsoft.com/office/word/2024/wordml/sdtformatlock" xmlns:w16du="http://schemas.microsoft.com/office/word/2023/wordml/word16du">
+        <mc:Fallback>
           <w:pict>
             <v:shapetype w14:anchorId="74560A66" id="_x0000_t202" coordsize="21600,21600" o:spt="202" path="m,l,21600r21600,l21600,xe">
               <v:stroke joinstyle="miter"/>
@@ -8787,7 +8818,7 @@
             </wp:anchor>
           </w:drawing>
         </mc:Choice>
-        <mc:Fallback xmlns:w16sdtfl="http://schemas.microsoft.com/office/word/2024/wordml/sdtformatlock" xmlns:w16du="http://schemas.microsoft.com/office/word/2023/wordml/word16du">
+        <mc:Fallback>
           <w:pict>
             <v:shape w14:anchorId="3E1DC161" id="_x0000_s1027" type="#_x0000_t202" style="position:absolute;left:0;text-align:left;margin-left:444.5pt;margin-top:769.55pt;width:147.05pt;height:110.6pt;z-index:251675648;visibility:visible;mso-wrap-style:square;mso-width-percent:0;mso-height-percent:200;mso-wrap-distance-left:9pt;mso-wrap-distance-top:3.6pt;mso-wrap-distance-right:9pt;mso-wrap-distance-bottom:3.6pt;mso-position-horizontal:absolute;mso-position-horizontal-relative:page;mso-position-vertical:absolute;mso-position-vertical-relative:page;mso-width-percent:0;mso-height-percent:200;mso-width-relative:margin;mso-height-relative:margin;v-text-anchor:top" o:gfxdata="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" filled="f" stroked="f">
               <v:textbox style="mso-fit-shape-to-text:t">
@@ -8959,7 +8990,7 @@
             </wp:anchor>
           </w:drawing>
         </mc:Choice>
-        <mc:Fallback xmlns:w16sdtfl="http://schemas.microsoft.com/office/word/2024/wordml/sdtformatlock" xmlns:w16du="http://schemas.microsoft.com/office/word/2023/wordml/word16du">
+        <mc:Fallback>
           <w:pict>
             <v:shape w14:anchorId="36108482" id="_x0000_s1028" type="#_x0000_t202" style="position:absolute;left:0;text-align:left;margin-left:444.25pt;margin-top:757.15pt;width:147.05pt;height:110.6pt;z-index:251674624;visibility:visible;mso-wrap-style:square;mso-width-percent:0;mso-height-percent:200;mso-wrap-distance-left:9pt;mso-wrap-distance-top:3.6pt;mso-wrap-distance-right:9pt;mso-wrap-distance-bottom:3.6pt;mso-position-horizontal:absolute;mso-position-horizontal-relative:page;mso-position-vertical:absolute;mso-position-vertical-relative:page;mso-width-percent:0;mso-height-percent:200;mso-width-relative:margin;mso-height-relative:margin;v-text-anchor:top" o:gfxdata="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" filled="f" stroked="f">
               <v:textbox style="mso-fit-shape-to-text:t">
@@ -9147,7 +9178,7 @@
             </wp:anchor>
           </w:drawing>
         </mc:Choice>
-        <mc:Fallback xmlns:w16sdtfl="http://schemas.microsoft.com/office/word/2024/wordml/sdtformatlock" xmlns:w16du="http://schemas.microsoft.com/office/word/2023/wordml/word16du">
+        <mc:Fallback>
           <w:pict>
             <v:shape w14:anchorId="59E339D1" id="_x0000_s1029" type="#_x0000_t202" style="position:absolute;left:0;text-align:left;margin-left:443.35pt;margin-top:744.85pt;width:147.05pt;height:110.6pt;z-index:251668480;visibility:visible;mso-wrap-style:square;mso-width-percent:0;mso-height-percent:200;mso-wrap-distance-left:9pt;mso-wrap-distance-top:3.6pt;mso-wrap-distance-right:9pt;mso-wrap-distance-bottom:3.6pt;mso-position-horizontal:absolute;mso-position-horizontal-relative:page;mso-position-vertical:absolute;mso-position-vertical-relative:page;mso-width-percent:0;mso-height-percent:200;mso-width-relative:margin;mso-height-relative:margin;v-text-anchor:top" o:gfxdata="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" filled="f" stroked="f">
               <v:textbox style="mso-fit-shape-to-text:t">
@@ -9296,7 +9327,7 @@
             </wp:anchor>
           </w:drawing>
         </mc:Choice>
-        <mc:Fallback xmlns:w16sdtfl="http://schemas.microsoft.com/office/word/2024/wordml/sdtformatlock" xmlns:w16du="http://schemas.microsoft.com/office/word/2023/wordml/word16du">
+        <mc:Fallback>
           <w:pict>
             <v:shape w14:anchorId="64AA0A26" id="_x0000_s1030" type="#_x0000_t202" style="position:absolute;left:0;text-align:left;margin-left:292.75pt;margin-top:745.75pt;width:147.05pt;height:110.6pt;z-index:251667456;visibility:visible;mso-wrap-style:square;mso-width-percent:0;mso-height-percent:200;mso-wrap-distance-left:9pt;mso-wrap-distance-top:3.6pt;mso-wrap-distance-right:9pt;mso-wrap-distance-bottom:3.6pt;mso-position-horizontal:absolute;mso-position-horizontal-relative:page;mso-position-vertical:absolute;mso-position-vertical-relative:page;mso-width-percent:0;mso-height-percent:200;mso-width-relative:margin;mso-height-relative:margin;v-text-anchor:top" o:gfxdata="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" filled="f" stroked="f">
               <v:textbox style="mso-fit-shape-to-text:t">

</xml_diff>

<commit_message>
Campo NIT - Contratos Aprendizajes (Lectivo y Productivo)
</commit_message>
<xml_diff>
--- a/webapp/templates/word/Contrato_Aprendizaje_Lectivo_Cyrgo.docx
+++ b/webapp/templates/word/Contrato_Aprendizaje_Lectivo_Cyrgo.docx
@@ -499,23 +499,7 @@
                 <w:rFonts w:ascii="Calibri Light" w:hAnsi="Calibri Light" w:cs="Calibri Light"/>
                 <w:lang w:val="en-US"/>
               </w:rPr>
-              <w:t>[[</w:t>
-            </w:r>
-            <w:proofErr w:type="spellStart"/>
-            <w:r>
-              <w:rPr>
-                <w:rFonts w:ascii="Calibri Light" w:hAnsi="Calibri Light" w:cs="Calibri Light"/>
-                <w:lang w:val="en-US"/>
-              </w:rPr>
-              <w:t>Nombre</w:t>
-            </w:r>
-            <w:proofErr w:type="spellEnd"/>
-            <w:r>
-              <w:rPr>
-                <w:rFonts w:ascii="Calibri Light" w:hAnsi="Calibri Light" w:cs="Calibri Light"/>
-                <w:lang w:val="en-US"/>
-              </w:rPr>
-              <w:t>]]</w:t>
+              <w:t>[[Nombre]]</w:t>
             </w:r>
           </w:p>
         </w:tc>
@@ -563,21 +547,7 @@
               <w:rPr>
                 <w:rFonts w:ascii="Calibri Light" w:hAnsi="Calibri Light" w:cs="Calibri Light"/>
               </w:rPr>
-              <w:t>[[</w:t>
-            </w:r>
-            <w:proofErr w:type="spellStart"/>
-            <w:r>
-              <w:rPr>
-                <w:rFonts w:ascii="Calibri Light" w:hAnsi="Calibri Light" w:cs="Calibri Light"/>
-              </w:rPr>
-              <w:t>Cedula</w:t>
-            </w:r>
-            <w:proofErr w:type="spellEnd"/>
-            <w:r>
-              <w:rPr>
-                <w:rFonts w:ascii="Calibri Light" w:hAnsi="Calibri Light" w:cs="Calibri Light"/>
-              </w:rPr>
-              <w:t>]]</w:t>
+              <w:t>[[Cedula]]</w:t>
             </w:r>
           </w:p>
         </w:tc>
@@ -627,21 +597,7 @@
               <w:rPr>
                 <w:rFonts w:ascii="Calibri Light" w:hAnsi="Calibri Light" w:cs="Calibri Light"/>
               </w:rPr>
-              <w:t>[[</w:t>
-            </w:r>
-            <w:proofErr w:type="spellStart"/>
-            <w:r>
-              <w:rPr>
-                <w:rFonts w:ascii="Calibri Light" w:hAnsi="Calibri Light" w:cs="Calibri Light"/>
-              </w:rPr>
-              <w:t>FechaNacimiento</w:t>
-            </w:r>
-            <w:proofErr w:type="spellEnd"/>
-            <w:r>
-              <w:rPr>
-                <w:rFonts w:ascii="Calibri Light" w:hAnsi="Calibri Light" w:cs="Calibri Light"/>
-              </w:rPr>
-              <w:t>]]</w:t>
+              <w:t>[[FechaNacimiento]]</w:t>
             </w:r>
           </w:p>
         </w:tc>
@@ -691,21 +647,7 @@
               <w:rPr>
                 <w:rFonts w:ascii="Calibri Light" w:hAnsi="Calibri Light" w:cs="Calibri Light"/>
               </w:rPr>
-              <w:t>[[</w:t>
-            </w:r>
-            <w:proofErr w:type="spellStart"/>
-            <w:r>
-              <w:rPr>
-                <w:rFonts w:ascii="Calibri Light" w:hAnsi="Calibri Light" w:cs="Calibri Light"/>
-              </w:rPr>
-              <w:t>Direccion</w:t>
-            </w:r>
-            <w:proofErr w:type="spellEnd"/>
-            <w:r>
-              <w:rPr>
-                <w:rFonts w:ascii="Calibri Light" w:hAnsi="Calibri Light" w:cs="Calibri Light"/>
-              </w:rPr>
-              <w:t>]]</w:t>
+              <w:t>[[Direccion]]</w:t>
             </w:r>
           </w:p>
         </w:tc>
@@ -803,21 +745,7 @@
               <w:rPr>
                 <w:rFonts w:ascii="Calibri Light" w:hAnsi="Calibri Light" w:cs="Calibri Light"/>
               </w:rPr>
-              <w:t>[[</w:t>
-            </w:r>
-            <w:proofErr w:type="spellStart"/>
-            <w:r>
-              <w:rPr>
-                <w:rFonts w:ascii="Calibri Light" w:hAnsi="Calibri Light" w:cs="Calibri Light"/>
-              </w:rPr>
-              <w:t>FechaIngreso</w:t>
-            </w:r>
-            <w:proofErr w:type="spellEnd"/>
-            <w:r>
-              <w:rPr>
-                <w:rFonts w:ascii="Calibri Light" w:hAnsi="Calibri Light" w:cs="Calibri Light"/>
-              </w:rPr>
-              <w:t>]]</w:t>
+              <w:t>[[FechaIngreso]]</w:t>
             </w:r>
           </w:p>
         </w:tc>
@@ -867,21 +795,7 @@
               <w:rPr>
                 <w:rFonts w:ascii="Calibri Light" w:hAnsi="Calibri Light" w:cs="Calibri Light"/>
               </w:rPr>
-              <w:t>[[</w:t>
-            </w:r>
-            <w:proofErr w:type="spellStart"/>
-            <w:r>
-              <w:rPr>
-                <w:rFonts w:ascii="Calibri Light" w:hAnsi="Calibri Light" w:cs="Calibri Light"/>
-              </w:rPr>
-              <w:t>FechaSalida</w:t>
-            </w:r>
-            <w:proofErr w:type="spellEnd"/>
-            <w:r>
-              <w:rPr>
-                <w:rFonts w:ascii="Calibri Light" w:hAnsi="Calibri Light" w:cs="Calibri Light"/>
-              </w:rPr>
-              <w:t>]]</w:t>
+              <w:t>[[FechaSalida]]</w:t>
             </w:r>
           </w:p>
         </w:tc>
@@ -959,21 +873,7 @@
               <w:rPr>
                 <w:rFonts w:ascii="Calibri Light" w:hAnsi="Calibri Light" w:cs="Calibri Light"/>
               </w:rPr>
-              <w:t>[[</w:t>
-            </w:r>
-            <w:proofErr w:type="spellStart"/>
-            <w:r>
-              <w:rPr>
-                <w:rFonts w:ascii="Calibri Light" w:hAnsi="Calibri Light" w:cs="Calibri Light"/>
-              </w:rPr>
-              <w:t>Institucion</w:t>
-            </w:r>
-            <w:proofErr w:type="spellEnd"/>
-            <w:r>
-              <w:rPr>
-                <w:rFonts w:ascii="Calibri Light" w:hAnsi="Calibri Light" w:cs="Calibri Light"/>
-              </w:rPr>
-              <w:t>]]</w:t>
+              <w:t>[[Institucion]]</w:t>
             </w:r>
           </w:p>
         </w:tc>
@@ -1020,6 +920,24 @@
                 <w:rFonts w:ascii="Calibri Light" w:hAnsi="Calibri Light" w:cs="Calibri Light"/>
               </w:rPr>
             </w:pPr>
+            <w:r>
+              <w:rPr>
+                <w:rFonts w:ascii="Calibri Light" w:hAnsi="Calibri Light" w:cs="Calibri Light"/>
+              </w:rPr>
+              <w:t>[[</w:t>
+            </w:r>
+            <w:r>
+              <w:rPr>
+                <w:rFonts w:ascii="Calibri Light" w:hAnsi="Calibri Light" w:cs="Calibri Light"/>
+              </w:rPr>
+              <w:t>Nit</w:t>
+            </w:r>
+            <w:r>
+              <w:rPr>
+                <w:rFonts w:ascii="Calibri Light" w:hAnsi="Calibri Light" w:cs="Calibri Light"/>
+              </w:rPr>
+              <w:t>]]</w:t>
+            </w:r>
           </w:p>
         </w:tc>
       </w:tr>
@@ -1201,23 +1119,7 @@
           <w:rFonts w:ascii="Calibri Light" w:hAnsi="Calibri Light" w:cs="Calibri Light"/>
           <w:bCs/>
         </w:rPr>
-        <w:t xml:space="preserve"> [[</w:t>
-      </w:r>
-      <w:proofErr w:type="spellStart"/>
-      <w:r>
-        <w:rPr>
-          <w:rFonts w:ascii="Calibri Light" w:hAnsi="Calibri Light" w:cs="Calibri Light"/>
-          <w:bCs/>
-        </w:rPr>
-        <w:t>CiudadExpedicion</w:t>
-      </w:r>
-      <w:proofErr w:type="spellEnd"/>
-      <w:r>
-        <w:rPr>
-          <w:rFonts w:ascii="Calibri Light" w:hAnsi="Calibri Light" w:cs="Calibri Light"/>
-          <w:bCs/>
-        </w:rPr>
-        <w:t>]]</w:t>
+        <w:t xml:space="preserve"> [[CiudadExpedicion]]</w:t>
       </w:r>
       <w:r>
         <w:rPr>
@@ -1261,35 +1163,7 @@
         <w:rPr>
           <w:rFonts w:ascii="Calibri Light" w:hAnsi="Calibri Light" w:cs="Calibri Light"/>
         </w:rPr>
-        <w:t xml:space="preserve"> El presente contrato </w:t>
-      </w:r>
-      <w:proofErr w:type="spellStart"/>
-      <w:r>
-        <w:rPr>
-          <w:rFonts w:ascii="Calibri Light" w:hAnsi="Calibri Light" w:cs="Calibri Light"/>
-        </w:rPr>
-        <w:t>tiene</w:t>
-      </w:r>
-      <w:proofErr w:type="spellEnd"/>
-      <w:r>
-        <w:rPr>
-          <w:rFonts w:ascii="Calibri Light" w:hAnsi="Calibri Light" w:cs="Calibri Light"/>
-        </w:rPr>
-        <w:t xml:space="preserve"> como objeto </w:t>
-      </w:r>
-      <w:proofErr w:type="spellStart"/>
-      <w:r>
-        <w:rPr>
-          <w:rFonts w:ascii="Calibri Light" w:hAnsi="Calibri Light" w:cs="Calibri Light"/>
-        </w:rPr>
-        <w:t>garantizar</w:t>
-      </w:r>
-      <w:proofErr w:type="spellEnd"/>
-      <w:r>
-        <w:rPr>
-          <w:rFonts w:ascii="Calibri Light" w:hAnsi="Calibri Light" w:cs="Calibri Light"/>
-        </w:rPr>
-        <w:t xml:space="preserve"> al</w:t>
+        <w:t xml:space="preserve"> El presente contrato tiene como objeto garantizar al</w:t>
       </w:r>
       <w:r>
         <w:rPr>
@@ -1311,810 +1185,176 @@
         <w:rPr>
           <w:rFonts w:ascii="Calibri Light" w:hAnsi="Calibri Light" w:cs="Calibri Light"/>
         </w:rPr>
+        <w:t xml:space="preserve"> la formación profesional metódica y requerida dentro del plan de estudios del </w:t>
+      </w:r>
+      <w:r>
+        <w:rPr>
+          <w:rFonts w:ascii="Calibri Light" w:hAnsi="Calibri Light" w:cs="Calibri Light"/>
+          <w:b/>
+          <w:bCs/>
+        </w:rPr>
+        <w:t>APRENDIZ</w:t>
+      </w:r>
+      <w:r>
+        <w:rPr>
+          <w:rFonts w:ascii="Calibri Light" w:hAnsi="Calibri Light" w:cs="Calibri Light"/>
+        </w:rPr>
+        <w:t xml:space="preserve"> en la especialidad de </w:t>
+      </w:r>
+      <w:r>
+        <w:rPr>
+          <w:rFonts w:ascii="Calibri Light" w:hAnsi="Calibri Light" w:cs="Calibri Light"/>
+          <w:b/>
+          <w:bCs/>
+        </w:rPr>
+        <w:t>[[Cargo]]</w:t>
+      </w:r>
+      <w:r>
+        <w:rPr>
+          <w:rFonts w:ascii="Calibri Light" w:hAnsi="Calibri Light" w:cs="Calibri Light"/>
+        </w:rPr>
+        <w:t xml:space="preserve">, la cual se impartirá en su etapa lectiva por </w:t>
+      </w:r>
+      <w:r>
+        <w:rPr>
+          <w:rFonts w:ascii="Calibri Light" w:hAnsi="Calibri Light" w:cs="Calibri Light"/>
+        </w:rPr>
+        <w:t>e</w:t>
+      </w:r>
+      <w:r>
+        <w:rPr>
+          <w:rFonts w:ascii="Calibri Light" w:hAnsi="Calibri Light" w:cs="Calibri Light"/>
+        </w:rPr>
+        <w:t xml:space="preserve">l </w:t>
+      </w:r>
+      <w:r>
+        <w:rPr>
+          <w:rFonts w:ascii="Calibri Light" w:hAnsi="Calibri Light" w:cs="Calibri Light"/>
+          <w:b/>
+          <w:bCs/>
+        </w:rPr>
+        <w:t>[[Institucion]]</w:t>
+      </w:r>
+      <w:r>
+        <w:rPr>
+          <w:rFonts w:ascii="Calibri Light" w:hAnsi="Calibri Light" w:cs="Calibri Light"/>
+          <w:b/>
+          <w:bCs/>
+        </w:rPr>
         <w:t xml:space="preserve"> </w:t>
       </w:r>
-      <w:proofErr w:type="spellStart"/>
-      <w:r>
-        <w:rPr>
-          <w:rFonts w:ascii="Calibri Light" w:hAnsi="Calibri Light" w:cs="Calibri Light"/>
-        </w:rPr>
-        <w:t>la</w:t>
-      </w:r>
-      <w:proofErr w:type="spellEnd"/>
+      <w:r>
+        <w:rPr>
+          <w:rFonts w:ascii="Calibri Light" w:hAnsi="Calibri Light" w:cs="Calibri Light"/>
+        </w:rPr>
+        <w:t>m</w:t>
+      </w:r>
+      <w:r>
+        <w:rPr>
+          <w:rFonts w:ascii="Calibri Light" w:hAnsi="Calibri Light" w:cs="Calibri Light"/>
+        </w:rPr>
+        <w:t xml:space="preserve">ientras su etapa práctica se desarrollará en la </w:t>
+      </w:r>
+      <w:r>
+        <w:rPr>
+          <w:rFonts w:ascii="Calibri Light" w:hAnsi="Calibri Light" w:cs="Calibri Light"/>
+          <w:b/>
+          <w:bCs/>
+        </w:rPr>
+        <w:t>EMPRESA</w:t>
+      </w:r>
+      <w:r>
+        <w:rPr>
+          <w:rFonts w:ascii="Calibri Light" w:hAnsi="Calibri Light" w:cs="Calibri Light"/>
+        </w:rPr>
+        <w:t>, quien proporcionara los medios para que el</w:t>
+      </w:r>
       <w:r>
         <w:rPr>
           <w:rFonts w:ascii="Calibri Light" w:hAnsi="Calibri Light" w:cs="Calibri Light"/>
         </w:rPr>
         <w:t xml:space="preserve"> </w:t>
       </w:r>
-      <w:proofErr w:type="spellStart"/>
-      <w:r>
-        <w:rPr>
-          <w:rFonts w:ascii="Calibri Light" w:hAnsi="Calibri Light" w:cs="Calibri Light"/>
-        </w:rPr>
-        <w:t>formación</w:t>
-      </w:r>
-      <w:proofErr w:type="spellEnd"/>
+      <w:r>
+        <w:rPr>
+          <w:rFonts w:ascii="Calibri Light" w:hAnsi="Calibri Light" w:cs="Calibri Light"/>
+          <w:b/>
+          <w:bCs/>
+        </w:rPr>
+        <w:t>APRENDIZ</w:t>
+      </w:r>
       <w:r>
         <w:rPr>
           <w:rFonts w:ascii="Calibri Light" w:hAnsi="Calibri Light" w:cs="Calibri Light"/>
         </w:rPr>
         <w:t xml:space="preserve"> </w:t>
       </w:r>
-      <w:proofErr w:type="spellStart"/>
-      <w:r>
-        <w:rPr>
-          <w:rFonts w:ascii="Calibri Light" w:hAnsi="Calibri Light" w:cs="Calibri Light"/>
-        </w:rPr>
-        <w:t>profesional</w:t>
-      </w:r>
-      <w:proofErr w:type="spellEnd"/>
-      <w:r>
-        <w:rPr>
-          <w:rFonts w:ascii="Calibri Light" w:hAnsi="Calibri Light" w:cs="Calibri Light"/>
-        </w:rPr>
-        <w:t xml:space="preserve"> metódica y requerida dentro </w:t>
-      </w:r>
-      <w:proofErr w:type="spellStart"/>
-      <w:r>
-        <w:rPr>
-          <w:rFonts w:ascii="Calibri Light" w:hAnsi="Calibri Light" w:cs="Calibri Light"/>
-        </w:rPr>
-        <w:t>del</w:t>
-      </w:r>
-      <w:proofErr w:type="spellEnd"/>
+      <w:r>
+        <w:rPr>
+          <w:rFonts w:ascii="Calibri Light" w:hAnsi="Calibri Light" w:cs="Calibri Light"/>
+        </w:rPr>
+        <w:t xml:space="preserve">adquiera formación profesional y metódica, dentro de una relación de aprendizaje, la cual de ninguna manera implica subordinación laboral por parte de la </w:t>
+      </w:r>
+      <w:r>
+        <w:rPr>
+          <w:rFonts w:ascii="Calibri Light" w:hAnsi="Calibri Light" w:cs="Calibri Light"/>
+          <w:b/>
+          <w:bCs/>
+        </w:rPr>
+        <w:t xml:space="preserve">EMPRESA </w:t>
+      </w:r>
+      <w:r>
+        <w:rPr>
+          <w:rFonts w:ascii="Calibri Light" w:hAnsi="Calibri Light" w:cs="Calibri Light"/>
+        </w:rPr>
+        <w:t xml:space="preserve">sobre el </w:t>
+      </w:r>
+      <w:r>
+        <w:rPr>
+          <w:rFonts w:ascii="Calibri Light" w:hAnsi="Calibri Light" w:cs="Calibri Light"/>
+          <w:b/>
+          <w:bCs/>
+        </w:rPr>
+        <w:t xml:space="preserve">APRENDIZ </w:t>
+      </w:r>
+      <w:r>
+        <w:rPr>
+          <w:rFonts w:ascii="Calibri Light" w:hAnsi="Calibri Light" w:cs="Calibri Light"/>
+        </w:rPr>
+        <w:t xml:space="preserve">pues este no es </w:t>
+      </w:r>
+      <w:r>
+        <w:rPr>
+          <w:rFonts w:ascii="Calibri Light" w:hAnsi="Calibri Light" w:cs="Calibri Light"/>
+        </w:rPr>
+        <w:lastRenderedPageBreak/>
+        <w:t xml:space="preserve">considerado para ningún efecto como un trabajador de la </w:t>
+      </w:r>
+      <w:r>
+        <w:rPr>
+          <w:rFonts w:ascii="Calibri Light" w:hAnsi="Calibri Light" w:cs="Calibri Light"/>
+          <w:b/>
+          <w:bCs/>
+        </w:rPr>
+        <w:t xml:space="preserve">EMPRESA </w:t>
+      </w:r>
+      <w:r>
+        <w:rPr>
+          <w:rFonts w:ascii="Calibri Light" w:hAnsi="Calibri Light" w:cs="Calibri Light"/>
+        </w:rPr>
+        <w:t>y la</w:t>
+      </w:r>
       <w:r>
         <w:rPr>
           <w:rFonts w:ascii="Calibri Light" w:hAnsi="Calibri Light" w:cs="Calibri Light"/>
         </w:rPr>
         <w:t xml:space="preserve"> </w:t>
       </w:r>
-      <w:proofErr w:type="spellStart"/>
-      <w:r>
-        <w:rPr>
-          <w:rFonts w:ascii="Calibri Light" w:hAnsi="Calibri Light" w:cs="Calibri Light"/>
-        </w:rPr>
-        <w:t>plan</w:t>
-      </w:r>
-      <w:proofErr w:type="spellEnd"/>
-      <w:r>
-        <w:rPr>
-          <w:rFonts w:ascii="Calibri Light" w:hAnsi="Calibri Light" w:cs="Calibri Light"/>
-        </w:rPr>
-        <w:t xml:space="preserve"> de </w:t>
-      </w:r>
-      <w:proofErr w:type="spellStart"/>
-      <w:r>
-        <w:rPr>
-          <w:rFonts w:ascii="Calibri Light" w:hAnsi="Calibri Light" w:cs="Calibri Light"/>
-        </w:rPr>
-        <w:t>estudios</w:t>
-      </w:r>
-      <w:proofErr w:type="spellEnd"/>
-      <w:r>
-        <w:rPr>
-          <w:rFonts w:ascii="Calibri Light" w:hAnsi="Calibri Light" w:cs="Calibri Light"/>
-        </w:rPr>
-        <w:t xml:space="preserve"> </w:t>
-      </w:r>
-      <w:proofErr w:type="spellStart"/>
-      <w:r>
-        <w:rPr>
-          <w:rFonts w:ascii="Calibri Light" w:hAnsi="Calibri Light" w:cs="Calibri Light"/>
-        </w:rPr>
-        <w:t>del</w:t>
-      </w:r>
-      <w:proofErr w:type="spellEnd"/>
-      <w:r>
-        <w:rPr>
-          <w:rFonts w:ascii="Calibri Light" w:hAnsi="Calibri Light" w:cs="Calibri Light"/>
-        </w:rPr>
-        <w:t xml:space="preserve"> </w:t>
-      </w:r>
-      <w:r>
-        <w:rPr>
-          <w:rFonts w:ascii="Calibri Light" w:hAnsi="Calibri Light" w:cs="Calibri Light"/>
-          <w:b/>
-          <w:bCs/>
-        </w:rPr>
-        <w:t>APRENDIZ</w:t>
-      </w:r>
-      <w:r>
-        <w:rPr>
-          <w:rFonts w:ascii="Calibri Light" w:hAnsi="Calibri Light" w:cs="Calibri Light"/>
-        </w:rPr>
-        <w:t xml:space="preserve"> </w:t>
-      </w:r>
-      <w:proofErr w:type="spellStart"/>
-      <w:r>
-        <w:rPr>
-          <w:rFonts w:ascii="Calibri Light" w:hAnsi="Calibri Light" w:cs="Calibri Light"/>
-        </w:rPr>
-        <w:t>en</w:t>
-      </w:r>
-      <w:proofErr w:type="spellEnd"/>
-      <w:r>
-        <w:rPr>
-          <w:rFonts w:ascii="Calibri Light" w:hAnsi="Calibri Light" w:cs="Calibri Light"/>
-        </w:rPr>
-        <w:t xml:space="preserve"> </w:t>
-      </w:r>
-      <w:proofErr w:type="spellStart"/>
-      <w:r>
-        <w:rPr>
-          <w:rFonts w:ascii="Calibri Light" w:hAnsi="Calibri Light" w:cs="Calibri Light"/>
-        </w:rPr>
-        <w:t>la</w:t>
-      </w:r>
-      <w:proofErr w:type="spellEnd"/>
-      <w:r>
-        <w:rPr>
-          <w:rFonts w:ascii="Calibri Light" w:hAnsi="Calibri Light" w:cs="Calibri Light"/>
-        </w:rPr>
-        <w:t xml:space="preserve"> </w:t>
-      </w:r>
-      <w:proofErr w:type="spellStart"/>
-      <w:r>
-        <w:rPr>
-          <w:rFonts w:ascii="Calibri Light" w:hAnsi="Calibri Light" w:cs="Calibri Light"/>
-        </w:rPr>
-        <w:t>especialidad</w:t>
-      </w:r>
-      <w:proofErr w:type="spellEnd"/>
-      <w:r>
-        <w:rPr>
-          <w:rFonts w:ascii="Calibri Light" w:hAnsi="Calibri Light" w:cs="Calibri Light"/>
-        </w:rPr>
-        <w:t xml:space="preserve"> de </w:t>
-      </w:r>
-      <w:r>
-        <w:rPr>
-          <w:rFonts w:ascii="Calibri Light" w:hAnsi="Calibri Light" w:cs="Calibri Light"/>
-          <w:b/>
-          <w:bCs/>
-        </w:rPr>
-        <w:t>[[Cargo]]</w:t>
-      </w:r>
-      <w:r>
-        <w:rPr>
-          <w:rFonts w:ascii="Calibri Light" w:hAnsi="Calibri Light" w:cs="Calibri Light"/>
-        </w:rPr>
-        <w:t xml:space="preserve">, </w:t>
-      </w:r>
-      <w:proofErr w:type="spellStart"/>
-      <w:r>
-        <w:rPr>
-          <w:rFonts w:ascii="Calibri Light" w:hAnsi="Calibri Light" w:cs="Calibri Light"/>
-        </w:rPr>
-        <w:t>la</w:t>
-      </w:r>
-      <w:proofErr w:type="spellEnd"/>
-      <w:r>
-        <w:rPr>
-          <w:rFonts w:ascii="Calibri Light" w:hAnsi="Calibri Light" w:cs="Calibri Light"/>
-        </w:rPr>
-        <w:t xml:space="preserve"> </w:t>
-      </w:r>
-      <w:proofErr w:type="spellStart"/>
-      <w:r>
-        <w:rPr>
-          <w:rFonts w:ascii="Calibri Light" w:hAnsi="Calibri Light" w:cs="Calibri Light"/>
-        </w:rPr>
-        <w:t>cual</w:t>
-      </w:r>
-      <w:proofErr w:type="spellEnd"/>
-      <w:r>
-        <w:rPr>
-          <w:rFonts w:ascii="Calibri Light" w:hAnsi="Calibri Light" w:cs="Calibri Light"/>
-        </w:rPr>
-        <w:t xml:space="preserve"> se </w:t>
-      </w:r>
-      <w:proofErr w:type="spellStart"/>
-      <w:r>
-        <w:rPr>
-          <w:rFonts w:ascii="Calibri Light" w:hAnsi="Calibri Light" w:cs="Calibri Light"/>
-        </w:rPr>
-        <w:t>impartirá</w:t>
-      </w:r>
-      <w:proofErr w:type="spellEnd"/>
-      <w:r>
-        <w:rPr>
-          <w:rFonts w:ascii="Calibri Light" w:hAnsi="Calibri Light" w:cs="Calibri Light"/>
-        </w:rPr>
-        <w:t xml:space="preserve"> </w:t>
-      </w:r>
-      <w:proofErr w:type="spellStart"/>
-      <w:r>
-        <w:rPr>
-          <w:rFonts w:ascii="Calibri Light" w:hAnsi="Calibri Light" w:cs="Calibri Light"/>
-        </w:rPr>
-        <w:t>en</w:t>
-      </w:r>
-      <w:proofErr w:type="spellEnd"/>
-      <w:r>
-        <w:rPr>
-          <w:rFonts w:ascii="Calibri Light" w:hAnsi="Calibri Light" w:cs="Calibri Light"/>
-        </w:rPr>
-        <w:t xml:space="preserve"> </w:t>
-      </w:r>
-      <w:proofErr w:type="spellStart"/>
-      <w:r>
-        <w:rPr>
-          <w:rFonts w:ascii="Calibri Light" w:hAnsi="Calibri Light" w:cs="Calibri Light"/>
-        </w:rPr>
-        <w:t>su</w:t>
-      </w:r>
-      <w:proofErr w:type="spellEnd"/>
-      <w:r>
-        <w:rPr>
-          <w:rFonts w:ascii="Calibri Light" w:hAnsi="Calibri Light" w:cs="Calibri Light"/>
-        </w:rPr>
-        <w:t xml:space="preserve"> etapa </w:t>
-      </w:r>
-      <w:proofErr w:type="spellStart"/>
-      <w:r>
-        <w:rPr>
-          <w:rFonts w:ascii="Calibri Light" w:hAnsi="Calibri Light" w:cs="Calibri Light"/>
-        </w:rPr>
-        <w:t>lectiva</w:t>
-      </w:r>
-      <w:proofErr w:type="spellEnd"/>
-      <w:r>
-        <w:rPr>
-          <w:rFonts w:ascii="Calibri Light" w:hAnsi="Calibri Light" w:cs="Calibri Light"/>
-        </w:rPr>
-        <w:t xml:space="preserve"> por </w:t>
-      </w:r>
-      <w:proofErr w:type="spellStart"/>
-      <w:r>
-        <w:rPr>
-          <w:rFonts w:ascii="Calibri Light" w:hAnsi="Calibri Light" w:cs="Calibri Light"/>
-        </w:rPr>
-        <w:t>e</w:t>
-      </w:r>
-      <w:r>
-        <w:rPr>
-          <w:rFonts w:ascii="Calibri Light" w:hAnsi="Calibri Light" w:cs="Calibri Light"/>
-        </w:rPr>
-        <w:t>l</w:t>
-      </w:r>
-      <w:proofErr w:type="spellEnd"/>
-      <w:r>
-        <w:rPr>
-          <w:rFonts w:ascii="Calibri Light" w:hAnsi="Calibri Light" w:cs="Calibri Light"/>
-        </w:rPr>
-        <w:t xml:space="preserve"> </w:t>
-      </w:r>
-      <w:r>
-        <w:rPr>
-          <w:rFonts w:ascii="Calibri Light" w:hAnsi="Calibri Light" w:cs="Calibri Light"/>
-          <w:b/>
-          <w:bCs/>
-        </w:rPr>
-        <w:t>[[</w:t>
-      </w:r>
-      <w:proofErr w:type="spellStart"/>
-      <w:r>
-        <w:rPr>
-          <w:rFonts w:ascii="Calibri Light" w:hAnsi="Calibri Light" w:cs="Calibri Light"/>
-          <w:b/>
-          <w:bCs/>
-        </w:rPr>
-        <w:t>Institucion</w:t>
-      </w:r>
-      <w:proofErr w:type="spellEnd"/>
-      <w:r>
-        <w:rPr>
-          <w:rFonts w:ascii="Calibri Light" w:hAnsi="Calibri Light" w:cs="Calibri Light"/>
-          <w:b/>
-          <w:bCs/>
-        </w:rPr>
-        <w:t>]]</w:t>
-      </w:r>
-      <w:r>
-        <w:rPr>
-          <w:rFonts w:ascii="Calibri Light" w:hAnsi="Calibri Light" w:cs="Calibri Light"/>
-          <w:b/>
-          <w:bCs/>
-        </w:rPr>
-        <w:t xml:space="preserve"> </w:t>
-      </w:r>
-      <w:proofErr w:type="spellStart"/>
-      <w:r>
-        <w:rPr>
-          <w:rFonts w:ascii="Calibri Light" w:hAnsi="Calibri Light" w:cs="Calibri Light"/>
-        </w:rPr>
-        <w:t>m</w:t>
-      </w:r>
-      <w:r>
-        <w:rPr>
-          <w:rFonts w:ascii="Calibri Light" w:hAnsi="Calibri Light" w:cs="Calibri Light"/>
-        </w:rPr>
-        <w:t>ientras</w:t>
-      </w:r>
-      <w:proofErr w:type="spellEnd"/>
-      <w:r>
-        <w:rPr>
-          <w:rFonts w:ascii="Calibri Light" w:hAnsi="Calibri Light" w:cs="Calibri Light"/>
-        </w:rPr>
-        <w:t xml:space="preserve"> </w:t>
-      </w:r>
-      <w:proofErr w:type="spellStart"/>
-      <w:r>
-        <w:rPr>
-          <w:rFonts w:ascii="Calibri Light" w:hAnsi="Calibri Light" w:cs="Calibri Light"/>
-        </w:rPr>
-        <w:t>su</w:t>
-      </w:r>
-      <w:proofErr w:type="spellEnd"/>
-      <w:r>
-        <w:rPr>
-          <w:rFonts w:ascii="Calibri Light" w:hAnsi="Calibri Light" w:cs="Calibri Light"/>
-        </w:rPr>
-        <w:t xml:space="preserve"> etapa </w:t>
-      </w:r>
-      <w:proofErr w:type="spellStart"/>
-      <w:r>
-        <w:rPr>
-          <w:rFonts w:ascii="Calibri Light" w:hAnsi="Calibri Light" w:cs="Calibri Light"/>
-        </w:rPr>
-        <w:t>práctica</w:t>
-      </w:r>
-      <w:proofErr w:type="spellEnd"/>
-      <w:r>
-        <w:rPr>
-          <w:rFonts w:ascii="Calibri Light" w:hAnsi="Calibri Light" w:cs="Calibri Light"/>
-        </w:rPr>
-        <w:t xml:space="preserve"> se </w:t>
-      </w:r>
-      <w:proofErr w:type="spellStart"/>
-      <w:r>
-        <w:rPr>
-          <w:rFonts w:ascii="Calibri Light" w:hAnsi="Calibri Light" w:cs="Calibri Light"/>
-        </w:rPr>
-        <w:t>desarrollará</w:t>
-      </w:r>
-      <w:proofErr w:type="spellEnd"/>
-      <w:r>
-        <w:rPr>
-          <w:rFonts w:ascii="Calibri Light" w:hAnsi="Calibri Light" w:cs="Calibri Light"/>
-        </w:rPr>
-        <w:t xml:space="preserve"> </w:t>
-      </w:r>
-      <w:proofErr w:type="spellStart"/>
-      <w:r>
-        <w:rPr>
-          <w:rFonts w:ascii="Calibri Light" w:hAnsi="Calibri Light" w:cs="Calibri Light"/>
-        </w:rPr>
-        <w:t>en</w:t>
-      </w:r>
-      <w:proofErr w:type="spellEnd"/>
-      <w:r>
-        <w:rPr>
-          <w:rFonts w:ascii="Calibri Light" w:hAnsi="Calibri Light" w:cs="Calibri Light"/>
-        </w:rPr>
-        <w:t xml:space="preserve"> </w:t>
-      </w:r>
-      <w:proofErr w:type="spellStart"/>
-      <w:r>
-        <w:rPr>
-          <w:rFonts w:ascii="Calibri Light" w:hAnsi="Calibri Light" w:cs="Calibri Light"/>
-        </w:rPr>
-        <w:t>la</w:t>
-      </w:r>
-      <w:proofErr w:type="spellEnd"/>
-      <w:r>
-        <w:rPr>
-          <w:rFonts w:ascii="Calibri Light" w:hAnsi="Calibri Light" w:cs="Calibri Light"/>
-        </w:rPr>
-        <w:t xml:space="preserve"> </w:t>
-      </w:r>
-      <w:r>
-        <w:rPr>
-          <w:rFonts w:ascii="Calibri Light" w:hAnsi="Calibri Light" w:cs="Calibri Light"/>
-          <w:b/>
-          <w:bCs/>
-        </w:rPr>
-        <w:t>EMPRESA</w:t>
-      </w:r>
-      <w:r>
-        <w:rPr>
-          <w:rFonts w:ascii="Calibri Light" w:hAnsi="Calibri Light" w:cs="Calibri Light"/>
-        </w:rPr>
-        <w:t xml:space="preserve">, </w:t>
-      </w:r>
-      <w:proofErr w:type="spellStart"/>
-      <w:r>
-        <w:rPr>
-          <w:rFonts w:ascii="Calibri Light" w:hAnsi="Calibri Light" w:cs="Calibri Light"/>
-        </w:rPr>
-        <w:t>quien</w:t>
-      </w:r>
-      <w:proofErr w:type="spellEnd"/>
-      <w:r>
-        <w:rPr>
-          <w:rFonts w:ascii="Calibri Light" w:hAnsi="Calibri Light" w:cs="Calibri Light"/>
-        </w:rPr>
-        <w:t xml:space="preserve"> proporcionara </w:t>
-      </w:r>
-      <w:proofErr w:type="spellStart"/>
-      <w:r>
-        <w:rPr>
-          <w:rFonts w:ascii="Calibri Light" w:hAnsi="Calibri Light" w:cs="Calibri Light"/>
-        </w:rPr>
-        <w:t>los</w:t>
-      </w:r>
-      <w:proofErr w:type="spellEnd"/>
-      <w:r>
-        <w:rPr>
-          <w:rFonts w:ascii="Calibri Light" w:hAnsi="Calibri Light" w:cs="Calibri Light"/>
-        </w:rPr>
-        <w:t xml:space="preserve"> </w:t>
-      </w:r>
-      <w:proofErr w:type="spellStart"/>
-      <w:r>
-        <w:rPr>
-          <w:rFonts w:ascii="Calibri Light" w:hAnsi="Calibri Light" w:cs="Calibri Light"/>
-        </w:rPr>
-        <w:t>medios</w:t>
-      </w:r>
-      <w:proofErr w:type="spellEnd"/>
-      <w:r>
-        <w:rPr>
-          <w:rFonts w:ascii="Calibri Light" w:hAnsi="Calibri Light" w:cs="Calibri Light"/>
-        </w:rPr>
-        <w:t xml:space="preserve"> para que </w:t>
-      </w:r>
-      <w:proofErr w:type="spellStart"/>
-      <w:r>
-        <w:rPr>
-          <w:rFonts w:ascii="Calibri Light" w:hAnsi="Calibri Light" w:cs="Calibri Light"/>
-        </w:rPr>
-        <w:t>el</w:t>
-      </w:r>
-      <w:proofErr w:type="spellEnd"/>
-      <w:r>
-        <w:rPr>
-          <w:rFonts w:ascii="Calibri Light" w:hAnsi="Calibri Light" w:cs="Calibri Light"/>
-        </w:rPr>
-        <w:t xml:space="preserve"> </w:t>
-      </w:r>
-      <w:r>
-        <w:rPr>
-          <w:rFonts w:ascii="Calibri Light" w:hAnsi="Calibri Light" w:cs="Calibri Light"/>
-          <w:b/>
-          <w:bCs/>
-        </w:rPr>
-        <w:t>APRENDIZ</w:t>
-      </w:r>
-      <w:r>
-        <w:rPr>
-          <w:rFonts w:ascii="Calibri Light" w:hAnsi="Calibri Light" w:cs="Calibri Light"/>
-        </w:rPr>
-        <w:t xml:space="preserve"> </w:t>
-      </w:r>
-      <w:proofErr w:type="spellStart"/>
-      <w:r>
-        <w:rPr>
-          <w:rFonts w:ascii="Calibri Light" w:hAnsi="Calibri Light" w:cs="Calibri Light"/>
-        </w:rPr>
-        <w:t>adquiera</w:t>
-      </w:r>
-      <w:proofErr w:type="spellEnd"/>
-      <w:r>
-        <w:rPr>
-          <w:rFonts w:ascii="Calibri Light" w:hAnsi="Calibri Light" w:cs="Calibri Light"/>
-        </w:rPr>
-        <w:t xml:space="preserve"> </w:t>
-      </w:r>
-      <w:proofErr w:type="spellStart"/>
-      <w:r>
-        <w:rPr>
-          <w:rFonts w:ascii="Calibri Light" w:hAnsi="Calibri Light" w:cs="Calibri Light"/>
-        </w:rPr>
-        <w:t>formación</w:t>
-      </w:r>
-      <w:proofErr w:type="spellEnd"/>
-      <w:r>
-        <w:rPr>
-          <w:rFonts w:ascii="Calibri Light" w:hAnsi="Calibri Light" w:cs="Calibri Light"/>
-        </w:rPr>
-        <w:t xml:space="preserve"> </w:t>
-      </w:r>
-      <w:proofErr w:type="spellStart"/>
-      <w:r>
-        <w:rPr>
-          <w:rFonts w:ascii="Calibri Light" w:hAnsi="Calibri Light" w:cs="Calibri Light"/>
-        </w:rPr>
-        <w:t>profesional</w:t>
-      </w:r>
-      <w:proofErr w:type="spellEnd"/>
-      <w:r>
-        <w:rPr>
-          <w:rFonts w:ascii="Calibri Light" w:hAnsi="Calibri Light" w:cs="Calibri Light"/>
-        </w:rPr>
-        <w:t xml:space="preserve"> y metódica, dentro de una </w:t>
-      </w:r>
-      <w:proofErr w:type="spellStart"/>
-      <w:r>
-        <w:rPr>
-          <w:rFonts w:ascii="Calibri Light" w:hAnsi="Calibri Light" w:cs="Calibri Light"/>
-        </w:rPr>
-        <w:t>relación</w:t>
-      </w:r>
-      <w:proofErr w:type="spellEnd"/>
-      <w:r>
-        <w:rPr>
-          <w:rFonts w:ascii="Calibri Light" w:hAnsi="Calibri Light" w:cs="Calibri Light"/>
-        </w:rPr>
-        <w:t xml:space="preserve"> de </w:t>
-      </w:r>
-      <w:proofErr w:type="spellStart"/>
-      <w:r>
-        <w:rPr>
-          <w:rFonts w:ascii="Calibri Light" w:hAnsi="Calibri Light" w:cs="Calibri Light"/>
-        </w:rPr>
-        <w:t>aprendizaje</w:t>
-      </w:r>
-      <w:proofErr w:type="spellEnd"/>
-      <w:r>
-        <w:rPr>
-          <w:rFonts w:ascii="Calibri Light" w:hAnsi="Calibri Light" w:cs="Calibri Light"/>
-        </w:rPr>
-        <w:t xml:space="preserve">, </w:t>
-      </w:r>
-      <w:proofErr w:type="spellStart"/>
-      <w:r>
-        <w:rPr>
-          <w:rFonts w:ascii="Calibri Light" w:hAnsi="Calibri Light" w:cs="Calibri Light"/>
-        </w:rPr>
-        <w:t>la</w:t>
-      </w:r>
-      <w:proofErr w:type="spellEnd"/>
-      <w:r>
-        <w:rPr>
-          <w:rFonts w:ascii="Calibri Light" w:hAnsi="Calibri Light" w:cs="Calibri Light"/>
-        </w:rPr>
-        <w:t xml:space="preserve"> </w:t>
-      </w:r>
-      <w:proofErr w:type="spellStart"/>
-      <w:r>
-        <w:rPr>
-          <w:rFonts w:ascii="Calibri Light" w:hAnsi="Calibri Light" w:cs="Calibri Light"/>
-        </w:rPr>
-        <w:t>cual</w:t>
-      </w:r>
-      <w:proofErr w:type="spellEnd"/>
-      <w:r>
-        <w:rPr>
-          <w:rFonts w:ascii="Calibri Light" w:hAnsi="Calibri Light" w:cs="Calibri Light"/>
-        </w:rPr>
-        <w:t xml:space="preserve"> de </w:t>
-      </w:r>
-      <w:proofErr w:type="spellStart"/>
-      <w:r>
-        <w:rPr>
-          <w:rFonts w:ascii="Calibri Light" w:hAnsi="Calibri Light" w:cs="Calibri Light"/>
-        </w:rPr>
-        <w:t>ninguna</w:t>
-      </w:r>
-      <w:proofErr w:type="spellEnd"/>
-      <w:r>
-        <w:rPr>
-          <w:rFonts w:ascii="Calibri Light" w:hAnsi="Calibri Light" w:cs="Calibri Light"/>
-        </w:rPr>
-        <w:t xml:space="preserve"> </w:t>
-      </w:r>
-      <w:proofErr w:type="spellStart"/>
-      <w:r>
-        <w:rPr>
-          <w:rFonts w:ascii="Calibri Light" w:hAnsi="Calibri Light" w:cs="Calibri Light"/>
-        </w:rPr>
-        <w:t>manera</w:t>
-      </w:r>
-      <w:proofErr w:type="spellEnd"/>
-      <w:r>
-        <w:rPr>
-          <w:rFonts w:ascii="Calibri Light" w:hAnsi="Calibri Light" w:cs="Calibri Light"/>
-        </w:rPr>
-        <w:t xml:space="preserve"> implica </w:t>
-      </w:r>
-      <w:proofErr w:type="spellStart"/>
-      <w:r>
-        <w:rPr>
-          <w:rFonts w:ascii="Calibri Light" w:hAnsi="Calibri Light" w:cs="Calibri Light"/>
-        </w:rPr>
-        <w:t>subordinación</w:t>
-      </w:r>
-      <w:proofErr w:type="spellEnd"/>
-      <w:r>
-        <w:rPr>
-          <w:rFonts w:ascii="Calibri Light" w:hAnsi="Calibri Light" w:cs="Calibri Light"/>
-        </w:rPr>
-        <w:t xml:space="preserve"> laboral por parte de </w:t>
-      </w:r>
-      <w:proofErr w:type="spellStart"/>
-      <w:r>
-        <w:rPr>
-          <w:rFonts w:ascii="Calibri Light" w:hAnsi="Calibri Light" w:cs="Calibri Light"/>
-        </w:rPr>
-        <w:t>la</w:t>
-      </w:r>
-      <w:proofErr w:type="spellEnd"/>
-      <w:r>
-        <w:rPr>
-          <w:rFonts w:ascii="Calibri Light" w:hAnsi="Calibri Light" w:cs="Calibri Light"/>
-        </w:rPr>
-        <w:t xml:space="preserve"> </w:t>
-      </w:r>
-      <w:r>
-        <w:rPr>
-          <w:rFonts w:ascii="Calibri Light" w:hAnsi="Calibri Light" w:cs="Calibri Light"/>
-          <w:b/>
-          <w:bCs/>
-        </w:rPr>
-        <w:t xml:space="preserve">EMPRESA </w:t>
-      </w:r>
-      <w:r>
-        <w:rPr>
-          <w:rFonts w:ascii="Calibri Light" w:hAnsi="Calibri Light" w:cs="Calibri Light"/>
-        </w:rPr>
-        <w:t xml:space="preserve">sobre </w:t>
-      </w:r>
-      <w:proofErr w:type="spellStart"/>
-      <w:r>
-        <w:rPr>
-          <w:rFonts w:ascii="Calibri Light" w:hAnsi="Calibri Light" w:cs="Calibri Light"/>
-        </w:rPr>
-        <w:t>el</w:t>
-      </w:r>
-      <w:proofErr w:type="spellEnd"/>
-      <w:r>
-        <w:rPr>
-          <w:rFonts w:ascii="Calibri Light" w:hAnsi="Calibri Light" w:cs="Calibri Light"/>
-        </w:rPr>
-        <w:t xml:space="preserve"> </w:t>
-      </w:r>
-      <w:r>
-        <w:rPr>
-          <w:rFonts w:ascii="Calibri Light" w:hAnsi="Calibri Light" w:cs="Calibri Light"/>
-          <w:b/>
-          <w:bCs/>
-        </w:rPr>
-        <w:t xml:space="preserve">APRENDIZ </w:t>
-      </w:r>
-      <w:proofErr w:type="spellStart"/>
-      <w:r>
-        <w:rPr>
-          <w:rFonts w:ascii="Calibri Light" w:hAnsi="Calibri Light" w:cs="Calibri Light"/>
-        </w:rPr>
-        <w:t>pues</w:t>
-      </w:r>
-      <w:proofErr w:type="spellEnd"/>
-      <w:r>
-        <w:rPr>
-          <w:rFonts w:ascii="Calibri Light" w:hAnsi="Calibri Light" w:cs="Calibri Light"/>
-        </w:rPr>
-        <w:t xml:space="preserve"> este no es </w:t>
-      </w:r>
-      <w:r>
-        <w:rPr>
-          <w:rFonts w:ascii="Calibri Light" w:hAnsi="Calibri Light" w:cs="Calibri Light"/>
-        </w:rPr>
-        <w:lastRenderedPageBreak/>
-        <w:t xml:space="preserve">considerado para </w:t>
-      </w:r>
-      <w:proofErr w:type="spellStart"/>
-      <w:r>
-        <w:rPr>
-          <w:rFonts w:ascii="Calibri Light" w:hAnsi="Calibri Light" w:cs="Calibri Light"/>
-        </w:rPr>
-        <w:t>ningún</w:t>
-      </w:r>
-      <w:proofErr w:type="spellEnd"/>
-      <w:r>
-        <w:rPr>
-          <w:rFonts w:ascii="Calibri Light" w:hAnsi="Calibri Light" w:cs="Calibri Light"/>
-        </w:rPr>
-        <w:t xml:space="preserve"> </w:t>
-      </w:r>
-      <w:proofErr w:type="spellStart"/>
-      <w:r>
-        <w:rPr>
-          <w:rFonts w:ascii="Calibri Light" w:hAnsi="Calibri Light" w:cs="Calibri Light"/>
-        </w:rPr>
-        <w:t>efecto</w:t>
-      </w:r>
-      <w:proofErr w:type="spellEnd"/>
-      <w:r>
-        <w:rPr>
-          <w:rFonts w:ascii="Calibri Light" w:hAnsi="Calibri Light" w:cs="Calibri Light"/>
-        </w:rPr>
-        <w:t xml:space="preserve"> como </w:t>
-      </w:r>
-      <w:proofErr w:type="spellStart"/>
-      <w:r>
-        <w:rPr>
-          <w:rFonts w:ascii="Calibri Light" w:hAnsi="Calibri Light" w:cs="Calibri Light"/>
-        </w:rPr>
-        <w:t>un</w:t>
-      </w:r>
-      <w:proofErr w:type="spellEnd"/>
-      <w:r>
-        <w:rPr>
-          <w:rFonts w:ascii="Calibri Light" w:hAnsi="Calibri Light" w:cs="Calibri Light"/>
-        </w:rPr>
-        <w:t xml:space="preserve"> </w:t>
-      </w:r>
-      <w:proofErr w:type="spellStart"/>
-      <w:r>
-        <w:rPr>
-          <w:rFonts w:ascii="Calibri Light" w:hAnsi="Calibri Light" w:cs="Calibri Light"/>
-        </w:rPr>
-        <w:t>trabajador</w:t>
-      </w:r>
-      <w:proofErr w:type="spellEnd"/>
-      <w:r>
-        <w:rPr>
-          <w:rFonts w:ascii="Calibri Light" w:hAnsi="Calibri Light" w:cs="Calibri Light"/>
-        </w:rPr>
-        <w:t xml:space="preserve"> de </w:t>
-      </w:r>
-      <w:proofErr w:type="spellStart"/>
-      <w:r>
-        <w:rPr>
-          <w:rFonts w:ascii="Calibri Light" w:hAnsi="Calibri Light" w:cs="Calibri Light"/>
-        </w:rPr>
-        <w:t>la</w:t>
-      </w:r>
-      <w:proofErr w:type="spellEnd"/>
-      <w:r>
-        <w:rPr>
-          <w:rFonts w:ascii="Calibri Light" w:hAnsi="Calibri Light" w:cs="Calibri Light"/>
-        </w:rPr>
-        <w:t xml:space="preserve"> </w:t>
-      </w:r>
-      <w:r>
-        <w:rPr>
-          <w:rFonts w:ascii="Calibri Light" w:hAnsi="Calibri Light" w:cs="Calibri Light"/>
-          <w:b/>
-          <w:bCs/>
-        </w:rPr>
-        <w:t xml:space="preserve">EMPRESA </w:t>
-      </w:r>
-      <w:r>
-        <w:rPr>
-          <w:rFonts w:ascii="Calibri Light" w:hAnsi="Calibri Light" w:cs="Calibri Light"/>
-        </w:rPr>
-        <w:t xml:space="preserve">y </w:t>
-      </w:r>
-      <w:proofErr w:type="spellStart"/>
-      <w:r>
-        <w:rPr>
-          <w:rFonts w:ascii="Calibri Light" w:hAnsi="Calibri Light" w:cs="Calibri Light"/>
-        </w:rPr>
-        <w:t>la</w:t>
-      </w:r>
-      <w:proofErr w:type="spellEnd"/>
-      <w:r>
-        <w:rPr>
-          <w:rFonts w:ascii="Calibri Light" w:hAnsi="Calibri Light" w:cs="Calibri Light"/>
-        </w:rPr>
-        <w:t xml:space="preserve"> </w:t>
-      </w:r>
-      <w:proofErr w:type="spellStart"/>
-      <w:r>
-        <w:rPr>
-          <w:rFonts w:ascii="Calibri Light" w:hAnsi="Calibri Light" w:cs="Calibri Light"/>
-        </w:rPr>
-        <w:t>subordinación</w:t>
-      </w:r>
-      <w:proofErr w:type="spellEnd"/>
-      <w:r>
-        <w:rPr>
-          <w:rFonts w:ascii="Calibri Light" w:hAnsi="Calibri Light" w:cs="Calibri Light"/>
-        </w:rPr>
-        <w:t xml:space="preserve"> se limita a las actividades propias del aprendizaje de acuerdo con el literal b) del artículo 21 de la Ley 2466 de 2025.</w:t>
+      <w:r>
+        <w:rPr>
+          <w:rFonts w:ascii="Calibri Light" w:hAnsi="Calibri Light" w:cs="Calibri Light"/>
+        </w:rPr>
+        <w:t>subordinación se limita a las actividades propias del aprendizaje de acuerdo con el literal b) del artículo 21 de la Ley 2466 de 2025.</w:t>
       </w:r>
     </w:p>
     <w:p>
@@ -2221,25 +1461,7 @@
           <w:b/>
           <w:bCs/>
         </w:rPr>
-        <w:t>[[</w:t>
-      </w:r>
-      <w:proofErr w:type="spellStart"/>
-      <w:r>
-        <w:rPr>
-          <w:rFonts w:ascii="Calibri Light" w:hAnsi="Calibri Light" w:cs="Calibri Light"/>
-          <w:b/>
-          <w:bCs/>
-        </w:rPr>
-        <w:t>FechaIngreso</w:t>
-      </w:r>
-      <w:proofErr w:type="spellEnd"/>
-      <w:r>
-        <w:rPr>
-          <w:rFonts w:ascii="Calibri Light" w:hAnsi="Calibri Light" w:cs="Calibri Light"/>
-          <w:b/>
-          <w:bCs/>
-        </w:rPr>
-        <w:t xml:space="preserve">]] </w:t>
+        <w:t xml:space="preserve">[[FechaIngreso]] </w:t>
       </w:r>
       <w:r>
         <w:rPr>
@@ -2259,25 +1481,7 @@
           <w:b/>
           <w:bCs/>
         </w:rPr>
-        <w:t>[[</w:t>
-      </w:r>
-      <w:proofErr w:type="spellStart"/>
-      <w:r>
-        <w:rPr>
-          <w:rFonts w:ascii="Calibri Light" w:hAnsi="Calibri Light" w:cs="Calibri Light"/>
-          <w:b/>
-          <w:bCs/>
-        </w:rPr>
-        <w:t>FechaSalida</w:t>
-      </w:r>
-      <w:proofErr w:type="spellEnd"/>
-      <w:r>
-        <w:rPr>
-          <w:rFonts w:ascii="Calibri Light" w:hAnsi="Calibri Light" w:cs="Calibri Light"/>
-          <w:b/>
-          <w:bCs/>
-        </w:rPr>
-        <w:t>]]</w:t>
+        <w:t>[[FechaSalida]]</w:t>
       </w:r>
       <w:r>
         <w:rPr>
@@ -2503,28 +1707,13 @@
           <w:b/>
         </w:rPr>
         <w:lastRenderedPageBreak/>
-        <w:t xml:space="preserve">PARÁGRAFO </w:t>
-      </w:r>
-      <w:proofErr w:type="gramStart"/>
-      <w:r>
-        <w:rPr>
-          <w:rFonts w:ascii="Calibri Light" w:hAnsi="Calibri Light" w:cs="Calibri Light"/>
-          <w:b/>
-        </w:rPr>
-        <w:t>PRIMERO</w:t>
-      </w:r>
-      <w:r>
-        <w:rPr>
-          <w:rFonts w:ascii="Calibri Light" w:hAnsi="Calibri Light" w:cs="Calibri Light"/>
-        </w:rPr>
-        <w:t>.-</w:t>
-      </w:r>
-      <w:proofErr w:type="gramEnd"/>
-      <w:r>
-        <w:rPr>
-          <w:rFonts w:ascii="Calibri Light" w:hAnsi="Calibri Light" w:cs="Calibri Light"/>
-        </w:rPr>
-        <w:t xml:space="preserve"> Este apoyo de sostenimiento no constituye salario en forma alguna ni es considerado una contraprestación directa de un servicio a favor de la </w:t>
+        <w:t>PARÁGRAFO PRIMERO</w:t>
+      </w:r>
+      <w:r>
+        <w:rPr>
+          <w:rFonts w:ascii="Calibri Light" w:hAnsi="Calibri Light" w:cs="Calibri Light"/>
+        </w:rPr>
+        <w:t xml:space="preserve">.- Este apoyo de sostenimiento no constituye salario en forma alguna ni es considerado una contraprestación directa de un servicio a favor de la </w:t>
       </w:r>
       <w:r>
         <w:rPr>
@@ -3641,315 +2830,7 @@
         <w:rPr>
           <w:rFonts w:ascii="Calibri Light" w:hAnsi="Calibri Light" w:cs="Calibri Light"/>
         </w:rPr>
-        <w:t xml:space="preserve"> se </w:t>
-      </w:r>
-      <w:proofErr w:type="spellStart"/>
-      <w:r>
-        <w:rPr>
-          <w:rFonts w:ascii="Calibri Light" w:hAnsi="Calibri Light" w:cs="Calibri Light"/>
-        </w:rPr>
-        <w:t>obliga</w:t>
-      </w:r>
-      <w:proofErr w:type="spellEnd"/>
-      <w:r>
-        <w:rPr>
-          <w:rFonts w:ascii="Calibri Light" w:hAnsi="Calibri Light" w:cs="Calibri Light"/>
-        </w:rPr>
-        <w:t xml:space="preserve"> a reportar a </w:t>
-      </w:r>
-      <w:proofErr w:type="spellStart"/>
-      <w:r>
-        <w:rPr>
-          <w:rFonts w:ascii="Calibri Light" w:hAnsi="Calibri Light" w:cs="Calibri Light"/>
-        </w:rPr>
-        <w:t>la</w:t>
-      </w:r>
-      <w:proofErr w:type="spellEnd"/>
-      <w:r>
-        <w:rPr>
-          <w:rFonts w:ascii="Calibri Light" w:hAnsi="Calibri Light" w:cs="Calibri Light"/>
-        </w:rPr>
-        <w:t xml:space="preserve"> </w:t>
-      </w:r>
-      <w:proofErr w:type="spellStart"/>
-      <w:r>
-        <w:rPr>
-          <w:rFonts w:ascii="Calibri Light" w:hAnsi="Calibri Light" w:cs="Calibri Light"/>
-        </w:rPr>
-        <w:t>Unidad</w:t>
-      </w:r>
-      <w:proofErr w:type="spellEnd"/>
-      <w:r>
-        <w:rPr>
-          <w:rFonts w:ascii="Calibri Light" w:hAnsi="Calibri Light" w:cs="Calibri Light"/>
-        </w:rPr>
-        <w:t xml:space="preserve"> de </w:t>
-      </w:r>
-      <w:proofErr w:type="spellStart"/>
-      <w:r>
-        <w:rPr>
-          <w:rFonts w:ascii="Calibri Light" w:hAnsi="Calibri Light" w:cs="Calibri Light"/>
-        </w:rPr>
-        <w:t>Cumplimiento</w:t>
-      </w:r>
-      <w:proofErr w:type="spellEnd"/>
-      <w:r>
-        <w:rPr>
-          <w:rFonts w:ascii="Calibri Light" w:hAnsi="Calibri Light" w:cs="Calibri Light"/>
-        </w:rPr>
-        <w:t xml:space="preserve"> todas </w:t>
-      </w:r>
-      <w:proofErr w:type="spellStart"/>
-      <w:r>
-        <w:rPr>
-          <w:rFonts w:ascii="Calibri Light" w:hAnsi="Calibri Light" w:cs="Calibri Light"/>
-        </w:rPr>
-        <w:t>aquellas</w:t>
-      </w:r>
-      <w:proofErr w:type="spellEnd"/>
-      <w:r>
-        <w:rPr>
-          <w:rFonts w:ascii="Calibri Light" w:hAnsi="Calibri Light" w:cs="Calibri Light"/>
-        </w:rPr>
-        <w:t xml:space="preserve"> </w:t>
-      </w:r>
-      <w:proofErr w:type="spellStart"/>
-      <w:r>
-        <w:rPr>
-          <w:rFonts w:ascii="Calibri Light" w:hAnsi="Calibri Light" w:cs="Calibri Light"/>
-        </w:rPr>
-        <w:t>transacciones</w:t>
-      </w:r>
-      <w:proofErr w:type="spellEnd"/>
-      <w:r>
-        <w:rPr>
-          <w:rFonts w:ascii="Calibri Light" w:hAnsi="Calibri Light" w:cs="Calibri Light"/>
-        </w:rPr>
-        <w:t xml:space="preserve"> que de </w:t>
-      </w:r>
-      <w:proofErr w:type="spellStart"/>
-      <w:r>
-        <w:rPr>
-          <w:rFonts w:ascii="Calibri Light" w:hAnsi="Calibri Light" w:cs="Calibri Light"/>
-        </w:rPr>
-        <w:t>conformidad</w:t>
-      </w:r>
-      <w:proofErr w:type="spellEnd"/>
-      <w:r>
-        <w:rPr>
-          <w:rFonts w:ascii="Calibri Light" w:hAnsi="Calibri Light" w:cs="Calibri Light"/>
-        </w:rPr>
-        <w:t xml:space="preserve"> </w:t>
-      </w:r>
-      <w:proofErr w:type="spellStart"/>
-      <w:r>
-        <w:rPr>
-          <w:rFonts w:ascii="Calibri Light" w:hAnsi="Calibri Light" w:cs="Calibri Light"/>
-        </w:rPr>
-        <w:t>con</w:t>
-      </w:r>
-      <w:proofErr w:type="spellEnd"/>
-      <w:r>
-        <w:rPr>
-          <w:rFonts w:ascii="Calibri Light" w:hAnsi="Calibri Light" w:cs="Calibri Light"/>
-        </w:rPr>
-        <w:t xml:space="preserve"> </w:t>
-      </w:r>
-      <w:proofErr w:type="spellStart"/>
-      <w:r>
-        <w:rPr>
-          <w:rFonts w:ascii="Calibri Light" w:hAnsi="Calibri Light" w:cs="Calibri Light"/>
-        </w:rPr>
-        <w:t>las</w:t>
-      </w:r>
-      <w:proofErr w:type="spellEnd"/>
-      <w:r>
-        <w:rPr>
-          <w:rFonts w:ascii="Calibri Light" w:hAnsi="Calibri Light" w:cs="Calibri Light"/>
-        </w:rPr>
-        <w:t xml:space="preserve"> </w:t>
-      </w:r>
-      <w:proofErr w:type="spellStart"/>
-      <w:r>
-        <w:rPr>
-          <w:rFonts w:ascii="Calibri Light" w:hAnsi="Calibri Light" w:cs="Calibri Light"/>
-        </w:rPr>
-        <w:t>disposiciones</w:t>
-      </w:r>
-      <w:proofErr w:type="spellEnd"/>
-      <w:r>
-        <w:rPr>
-          <w:rFonts w:ascii="Calibri Light" w:hAnsi="Calibri Light" w:cs="Calibri Light"/>
-        </w:rPr>
-        <w:t xml:space="preserve"> sobre </w:t>
-      </w:r>
-      <w:proofErr w:type="spellStart"/>
-      <w:r>
-        <w:rPr>
-          <w:rFonts w:ascii="Calibri Light" w:hAnsi="Calibri Light" w:cs="Calibri Light"/>
-        </w:rPr>
-        <w:t>Control</w:t>
-      </w:r>
-      <w:proofErr w:type="spellEnd"/>
-      <w:r>
-        <w:rPr>
-          <w:rFonts w:ascii="Calibri Light" w:hAnsi="Calibri Light" w:cs="Calibri Light"/>
-        </w:rPr>
-        <w:t xml:space="preserve"> y </w:t>
-      </w:r>
-      <w:proofErr w:type="spellStart"/>
-      <w:r>
-        <w:rPr>
-          <w:rFonts w:ascii="Calibri Light" w:hAnsi="Calibri Light" w:cs="Calibri Light"/>
-        </w:rPr>
-        <w:t>Prevención</w:t>
-      </w:r>
-      <w:proofErr w:type="spellEnd"/>
-      <w:r>
-        <w:rPr>
-          <w:rFonts w:ascii="Calibri Light" w:hAnsi="Calibri Light" w:cs="Calibri Light"/>
-        </w:rPr>
-        <w:t xml:space="preserve"> de Lavado de Activos y </w:t>
-      </w:r>
-      <w:proofErr w:type="spellStart"/>
-      <w:r>
-        <w:rPr>
-          <w:rFonts w:ascii="Calibri Light" w:hAnsi="Calibri Light" w:cs="Calibri Light"/>
-        </w:rPr>
-        <w:t>Financiación</w:t>
-      </w:r>
-      <w:proofErr w:type="spellEnd"/>
-      <w:r>
-        <w:rPr>
-          <w:rFonts w:ascii="Calibri Light" w:hAnsi="Calibri Light" w:cs="Calibri Light"/>
-        </w:rPr>
-        <w:t xml:space="preserve"> </w:t>
-      </w:r>
-      <w:proofErr w:type="spellStart"/>
-      <w:r>
-        <w:rPr>
-          <w:rFonts w:ascii="Calibri Light" w:hAnsi="Calibri Light" w:cs="Calibri Light"/>
-        </w:rPr>
-        <w:t>del</w:t>
-      </w:r>
-      <w:proofErr w:type="spellEnd"/>
-      <w:r>
-        <w:rPr>
-          <w:rFonts w:ascii="Calibri Light" w:hAnsi="Calibri Light" w:cs="Calibri Light"/>
-        </w:rPr>
-        <w:t xml:space="preserve"> Terrorismo y </w:t>
-      </w:r>
-      <w:proofErr w:type="spellStart"/>
-      <w:r>
-        <w:rPr>
-          <w:rFonts w:ascii="Calibri Light" w:hAnsi="Calibri Light" w:cs="Calibri Light"/>
-        </w:rPr>
-        <w:t>demás</w:t>
-      </w:r>
-      <w:proofErr w:type="spellEnd"/>
-      <w:r>
-        <w:rPr>
-          <w:rFonts w:ascii="Calibri Light" w:hAnsi="Calibri Light" w:cs="Calibri Light"/>
-        </w:rPr>
-        <w:t xml:space="preserve"> </w:t>
-      </w:r>
-      <w:proofErr w:type="spellStart"/>
-      <w:r>
-        <w:rPr>
-          <w:rFonts w:ascii="Calibri Light" w:hAnsi="Calibri Light" w:cs="Calibri Light"/>
-        </w:rPr>
-        <w:t>actividades</w:t>
-      </w:r>
-      <w:proofErr w:type="spellEnd"/>
-      <w:r>
-        <w:rPr>
-          <w:rFonts w:ascii="Calibri Light" w:hAnsi="Calibri Light" w:cs="Calibri Light"/>
-        </w:rPr>
-        <w:t xml:space="preserve"> ilícitas </w:t>
-      </w:r>
-      <w:proofErr w:type="spellStart"/>
-      <w:r>
-        <w:rPr>
-          <w:rFonts w:ascii="Calibri Light" w:hAnsi="Calibri Light" w:cs="Calibri Light"/>
-        </w:rPr>
-        <w:t>deban</w:t>
-      </w:r>
-      <w:proofErr w:type="spellEnd"/>
-      <w:r>
-        <w:rPr>
-          <w:rFonts w:ascii="Calibri Light" w:hAnsi="Calibri Light" w:cs="Calibri Light"/>
-        </w:rPr>
-        <w:t xml:space="preserve"> </w:t>
-      </w:r>
-      <w:proofErr w:type="spellStart"/>
-      <w:r>
-        <w:rPr>
-          <w:rFonts w:ascii="Calibri Light" w:hAnsi="Calibri Light" w:cs="Calibri Light"/>
-        </w:rPr>
-        <w:t>considerarse</w:t>
-      </w:r>
-      <w:proofErr w:type="spellEnd"/>
-      <w:r>
-        <w:rPr>
-          <w:rFonts w:ascii="Calibri Light" w:hAnsi="Calibri Light" w:cs="Calibri Light"/>
-        </w:rPr>
-        <w:t xml:space="preserve"> como </w:t>
-      </w:r>
-      <w:proofErr w:type="spellStart"/>
-      <w:r>
-        <w:rPr>
-          <w:rFonts w:ascii="Calibri Light" w:hAnsi="Calibri Light" w:cs="Calibri Light"/>
-        </w:rPr>
-        <w:t>inusuales</w:t>
-      </w:r>
-      <w:proofErr w:type="spellEnd"/>
-      <w:r>
-        <w:rPr>
-          <w:rFonts w:ascii="Calibri Light" w:hAnsi="Calibri Light" w:cs="Calibri Light"/>
-        </w:rPr>
-        <w:t xml:space="preserve"> o </w:t>
-      </w:r>
-      <w:proofErr w:type="spellStart"/>
-      <w:r>
-        <w:rPr>
-          <w:rFonts w:ascii="Calibri Light" w:hAnsi="Calibri Light" w:cs="Calibri Light"/>
-        </w:rPr>
-        <w:t>sospechosas</w:t>
-      </w:r>
-      <w:proofErr w:type="spellEnd"/>
-      <w:r>
-        <w:rPr>
-          <w:rFonts w:ascii="Calibri Light" w:hAnsi="Calibri Light" w:cs="Calibri Light"/>
-        </w:rPr>
-        <w:t xml:space="preserve">. Para tales </w:t>
-      </w:r>
-      <w:proofErr w:type="spellStart"/>
-      <w:r>
-        <w:rPr>
-          <w:rFonts w:ascii="Calibri Light" w:hAnsi="Calibri Light" w:cs="Calibri Light"/>
-        </w:rPr>
-        <w:t>efectos</w:t>
-      </w:r>
-      <w:proofErr w:type="spellEnd"/>
-      <w:r>
-        <w:rPr>
-          <w:rFonts w:ascii="Calibri Light" w:hAnsi="Calibri Light" w:cs="Calibri Light"/>
-        </w:rPr>
-        <w:t xml:space="preserve"> </w:t>
-      </w:r>
-      <w:proofErr w:type="spellStart"/>
-      <w:r>
-        <w:rPr>
-          <w:rFonts w:ascii="Calibri Light" w:hAnsi="Calibri Light" w:cs="Calibri Light"/>
-        </w:rPr>
-        <w:t>el</w:t>
-      </w:r>
-      <w:proofErr w:type="spellEnd"/>
-      <w:r>
-        <w:rPr>
-          <w:rFonts w:ascii="Calibri Light" w:hAnsi="Calibri Light" w:cs="Calibri Light"/>
-        </w:rPr>
-        <w:t xml:space="preserve"> </w:t>
+        <w:t xml:space="preserve"> se obliga a reportar a la Unidad de Cumplimiento todas aquellas transacciones que de conformidad con las disposiciones sobre Control y Prevención de Lavado de Activos y Financiación del Terrorismo y demás actividades ilícitas deban considerarse como inusuales o sospechosas. Para tales efectos el </w:t>
       </w:r>
       <w:r>
         <w:rPr>
@@ -3963,133 +2844,7 @@
         <w:rPr>
           <w:rFonts w:ascii="Calibri Light" w:hAnsi="Calibri Light" w:cs="Calibri Light"/>
         </w:rPr>
-        <w:t xml:space="preserve"> diligenciará </w:t>
-      </w:r>
-      <w:proofErr w:type="spellStart"/>
-      <w:r>
-        <w:rPr>
-          <w:rFonts w:ascii="Calibri Light" w:hAnsi="Calibri Light" w:cs="Calibri Light"/>
-        </w:rPr>
-        <w:t>el</w:t>
-      </w:r>
-      <w:proofErr w:type="spellEnd"/>
-      <w:r>
-        <w:rPr>
-          <w:rFonts w:ascii="Calibri Light" w:hAnsi="Calibri Light" w:cs="Calibri Light"/>
-        </w:rPr>
-        <w:t xml:space="preserve"> formato </w:t>
-      </w:r>
-      <w:proofErr w:type="spellStart"/>
-      <w:r>
-        <w:rPr>
-          <w:rFonts w:ascii="Calibri Light" w:hAnsi="Calibri Light" w:cs="Calibri Light"/>
-        </w:rPr>
-        <w:t>diseñado</w:t>
-      </w:r>
-      <w:proofErr w:type="spellEnd"/>
-      <w:r>
-        <w:rPr>
-          <w:rFonts w:ascii="Calibri Light" w:hAnsi="Calibri Light" w:cs="Calibri Light"/>
-        </w:rPr>
-        <w:t xml:space="preserve"> para tal </w:t>
-      </w:r>
-      <w:proofErr w:type="spellStart"/>
-      <w:r>
-        <w:rPr>
-          <w:rFonts w:ascii="Calibri Light" w:hAnsi="Calibri Light" w:cs="Calibri Light"/>
-        </w:rPr>
-        <w:t>fin</w:t>
-      </w:r>
-      <w:proofErr w:type="spellEnd"/>
-      <w:r>
-        <w:rPr>
-          <w:rFonts w:ascii="Calibri Light" w:hAnsi="Calibri Light" w:cs="Calibri Light"/>
-        </w:rPr>
-        <w:t xml:space="preserve">, </w:t>
-      </w:r>
-      <w:proofErr w:type="spellStart"/>
-      <w:r>
-        <w:rPr>
-          <w:rFonts w:ascii="Calibri Light" w:hAnsi="Calibri Light" w:cs="Calibri Light"/>
-        </w:rPr>
-        <w:t>el</w:t>
-      </w:r>
-      <w:proofErr w:type="spellEnd"/>
-      <w:r>
-        <w:rPr>
-          <w:rFonts w:ascii="Calibri Light" w:hAnsi="Calibri Light" w:cs="Calibri Light"/>
-        </w:rPr>
-        <w:t xml:space="preserve"> </w:t>
-      </w:r>
-      <w:proofErr w:type="spellStart"/>
-      <w:r>
-        <w:rPr>
-          <w:rFonts w:ascii="Calibri Light" w:hAnsi="Calibri Light" w:cs="Calibri Light"/>
-        </w:rPr>
-        <w:t>cual</w:t>
-      </w:r>
-      <w:proofErr w:type="spellEnd"/>
-      <w:r>
-        <w:rPr>
-          <w:rFonts w:ascii="Calibri Light" w:hAnsi="Calibri Light" w:cs="Calibri Light"/>
-        </w:rPr>
-        <w:t xml:space="preserve"> una vez </w:t>
-      </w:r>
-      <w:proofErr w:type="spellStart"/>
-      <w:r>
-        <w:rPr>
-          <w:rFonts w:ascii="Calibri Light" w:hAnsi="Calibri Light" w:cs="Calibri Light"/>
-        </w:rPr>
-        <w:t>estudiado</w:t>
-      </w:r>
-      <w:proofErr w:type="spellEnd"/>
-      <w:r>
-        <w:rPr>
-          <w:rFonts w:ascii="Calibri Light" w:hAnsi="Calibri Light" w:cs="Calibri Light"/>
-        </w:rPr>
-        <w:t xml:space="preserve"> por </w:t>
-      </w:r>
-      <w:proofErr w:type="spellStart"/>
-      <w:r>
-        <w:rPr>
-          <w:rFonts w:ascii="Calibri Light" w:hAnsi="Calibri Light" w:cs="Calibri Light"/>
-        </w:rPr>
-        <w:t>el</w:t>
-      </w:r>
-      <w:proofErr w:type="spellEnd"/>
-      <w:r>
-        <w:rPr>
-          <w:rFonts w:ascii="Calibri Light" w:hAnsi="Calibri Light" w:cs="Calibri Light"/>
-        </w:rPr>
-        <w:t xml:space="preserve"> Comité </w:t>
-      </w:r>
-      <w:proofErr w:type="spellStart"/>
-      <w:r>
-        <w:rPr>
-          <w:rFonts w:ascii="Calibri Light" w:hAnsi="Calibri Light" w:cs="Calibri Light"/>
-        </w:rPr>
-        <w:t>Evaluador</w:t>
-      </w:r>
-      <w:proofErr w:type="spellEnd"/>
-      <w:r>
-        <w:rPr>
-          <w:rFonts w:ascii="Calibri Light" w:hAnsi="Calibri Light" w:cs="Calibri Light"/>
-        </w:rPr>
-        <w:t xml:space="preserve"> y si es del caso, será entregado ante </w:t>
-      </w:r>
-      <w:proofErr w:type="spellStart"/>
-      <w:r>
-        <w:rPr>
-          <w:rFonts w:ascii="Calibri Light" w:hAnsi="Calibri Light" w:cs="Calibri Light"/>
-        </w:rPr>
-        <w:t>las</w:t>
-      </w:r>
-      <w:proofErr w:type="spellEnd"/>
-      <w:r>
-        <w:rPr>
-          <w:rFonts w:ascii="Calibri Light" w:hAnsi="Calibri Light" w:cs="Calibri Light"/>
-        </w:rPr>
-        <w:t xml:space="preserve"> autoridades competentes. </w:t>
+        <w:t xml:space="preserve"> diligenciará el formato diseñado para tal fin, el cual una vez estudiado por el Comité Evaluador y si es del caso, será entregado ante las autoridades competentes. </w:t>
       </w:r>
     </w:p>
     <w:p>
@@ -4199,21 +2954,7 @@
           <w:rFonts w:ascii="Calibri Light" w:hAnsi="Calibri Light" w:cs="Calibri Light"/>
         </w:rPr>
         <w:lastRenderedPageBreak/>
-        <w:t xml:space="preserve">Mantener confidencialmente sus identificaciones, </w:t>
-      </w:r>
-      <w:proofErr w:type="spellStart"/>
-      <w:r>
-        <w:rPr>
-          <w:rFonts w:ascii="Calibri Light" w:hAnsi="Calibri Light" w:cs="Calibri Light"/>
-        </w:rPr>
-        <w:t>password</w:t>
-      </w:r>
-      <w:proofErr w:type="spellEnd"/>
-      <w:r>
-        <w:rPr>
-          <w:rFonts w:ascii="Calibri Light" w:hAnsi="Calibri Light" w:cs="Calibri Light"/>
-        </w:rPr>
-        <w:t xml:space="preserve"> y claves de acceso físico, y softwares oficiales instalados en su computadora personal o en la suministra por la </w:t>
+        <w:t xml:space="preserve">Mantener confidencialmente sus identificaciones, password y claves de acceso físico, y softwares oficiales instalados en su computadora personal o en la suministra por la </w:t>
       </w:r>
       <w:r>
         <w:rPr>
@@ -5247,35 +3988,7 @@
           <w:rFonts w:ascii="Calibri Light" w:hAnsi="Calibri Light" w:cs="Calibri Light"/>
         </w:rPr>
         <w:tab/>
-        <w:t xml:space="preserve">Por mutuo </w:t>
-      </w:r>
-      <w:proofErr w:type="spellStart"/>
-      <w:r>
-        <w:rPr>
-          <w:rFonts w:ascii="Calibri Light" w:hAnsi="Calibri Light" w:cs="Calibri Light"/>
-        </w:rPr>
-        <w:t>acuerdo</w:t>
-      </w:r>
-      <w:proofErr w:type="spellEnd"/>
-      <w:r>
-        <w:rPr>
-          <w:rFonts w:ascii="Calibri Light" w:hAnsi="Calibri Light" w:cs="Calibri Light"/>
-        </w:rPr>
-        <w:t xml:space="preserve"> entre </w:t>
-      </w:r>
-      <w:proofErr w:type="spellStart"/>
-      <w:r>
-        <w:rPr>
-          <w:rFonts w:ascii="Calibri Light" w:hAnsi="Calibri Light" w:cs="Calibri Light"/>
-        </w:rPr>
-        <w:t>las</w:t>
-      </w:r>
-      <w:proofErr w:type="spellEnd"/>
-      <w:r>
-        <w:rPr>
-          <w:rFonts w:ascii="Calibri Light" w:hAnsi="Calibri Light" w:cs="Calibri Light"/>
-        </w:rPr>
-        <w:t xml:space="preserve"> partes.  </w:t>
+        <w:t xml:space="preserve">Por mutuo acuerdo entre las partes.  </w:t>
       </w:r>
     </w:p>
     <w:p>
@@ -5297,91 +4010,7 @@
           <w:rFonts w:ascii="Calibri Light" w:hAnsi="Calibri Light" w:cs="Calibri Light"/>
         </w:rPr>
         <w:tab/>
-        <w:t xml:space="preserve">Por </w:t>
-      </w:r>
-      <w:proofErr w:type="spellStart"/>
-      <w:r>
-        <w:rPr>
-          <w:rFonts w:ascii="Calibri Light" w:hAnsi="Calibri Light" w:cs="Calibri Light"/>
-        </w:rPr>
-        <w:t>el</w:t>
-      </w:r>
-      <w:proofErr w:type="spellEnd"/>
-      <w:r>
-        <w:rPr>
-          <w:rFonts w:ascii="Calibri Light" w:hAnsi="Calibri Light" w:cs="Calibri Light"/>
-        </w:rPr>
-        <w:t xml:space="preserve"> </w:t>
-      </w:r>
-      <w:proofErr w:type="spellStart"/>
-      <w:r>
-        <w:rPr>
-          <w:rFonts w:ascii="Calibri Light" w:hAnsi="Calibri Light" w:cs="Calibri Light"/>
-        </w:rPr>
-        <w:t>vencimiento</w:t>
-      </w:r>
-      <w:proofErr w:type="spellEnd"/>
-      <w:r>
-        <w:rPr>
-          <w:rFonts w:ascii="Calibri Light" w:hAnsi="Calibri Light" w:cs="Calibri Light"/>
-        </w:rPr>
-        <w:t xml:space="preserve"> </w:t>
-      </w:r>
-      <w:proofErr w:type="spellStart"/>
-      <w:r>
-        <w:rPr>
-          <w:rFonts w:ascii="Calibri Light" w:hAnsi="Calibri Light" w:cs="Calibri Light"/>
-        </w:rPr>
-        <w:t>del</w:t>
-      </w:r>
-      <w:proofErr w:type="spellEnd"/>
-      <w:r>
-        <w:rPr>
-          <w:rFonts w:ascii="Calibri Light" w:hAnsi="Calibri Light" w:cs="Calibri Light"/>
-        </w:rPr>
-        <w:t xml:space="preserve"> término de </w:t>
-      </w:r>
-      <w:proofErr w:type="spellStart"/>
-      <w:r>
-        <w:rPr>
-          <w:rFonts w:ascii="Calibri Light" w:hAnsi="Calibri Light" w:cs="Calibri Light"/>
-        </w:rPr>
-        <w:t>duración</w:t>
-      </w:r>
-      <w:proofErr w:type="spellEnd"/>
-      <w:r>
-        <w:rPr>
-          <w:rFonts w:ascii="Calibri Light" w:hAnsi="Calibri Light" w:cs="Calibri Light"/>
-        </w:rPr>
-        <w:t xml:space="preserve"> </w:t>
-      </w:r>
-      <w:proofErr w:type="spellStart"/>
-      <w:r>
-        <w:rPr>
-          <w:rFonts w:ascii="Calibri Light" w:hAnsi="Calibri Light" w:cs="Calibri Light"/>
-        </w:rPr>
-        <w:t>del</w:t>
-      </w:r>
-      <w:proofErr w:type="spellEnd"/>
-      <w:r>
-        <w:rPr>
-          <w:rFonts w:ascii="Calibri Light" w:hAnsi="Calibri Light" w:cs="Calibri Light"/>
-        </w:rPr>
-        <w:t xml:space="preserve"> presente Contrato de </w:t>
-      </w:r>
-      <w:proofErr w:type="spellStart"/>
-      <w:r>
-        <w:rPr>
-          <w:rFonts w:ascii="Calibri Light" w:hAnsi="Calibri Light" w:cs="Calibri Light"/>
-        </w:rPr>
-        <w:t>aprendizaje</w:t>
-      </w:r>
-      <w:proofErr w:type="spellEnd"/>
-      <w:r>
-        <w:rPr>
-          <w:rFonts w:ascii="Calibri Light" w:hAnsi="Calibri Light" w:cs="Calibri Light"/>
-        </w:rPr>
-        <w:t xml:space="preserve">.  </w:t>
+        <w:t xml:space="preserve">Por el vencimiento del término de duración del presente Contrato de aprendizaje.  </w:t>
       </w:r>
     </w:p>
     <w:p>
@@ -5412,315 +4041,7 @@
           <w:rFonts w:ascii="Calibri Light" w:hAnsi="Calibri Light" w:cs="Calibri Light"/>
         </w:rPr>
         <w:tab/>
-        <w:t xml:space="preserve">La </w:t>
-      </w:r>
-      <w:proofErr w:type="spellStart"/>
-      <w:r>
-        <w:rPr>
-          <w:rFonts w:ascii="Calibri Light" w:hAnsi="Calibri Light" w:cs="Calibri Light"/>
-        </w:rPr>
-        <w:t>cancelación</w:t>
-      </w:r>
-      <w:proofErr w:type="spellEnd"/>
-      <w:r>
-        <w:rPr>
-          <w:rFonts w:ascii="Calibri Light" w:hAnsi="Calibri Light" w:cs="Calibri Light"/>
-        </w:rPr>
-        <w:t xml:space="preserve"> de </w:t>
-      </w:r>
-      <w:proofErr w:type="spellStart"/>
-      <w:r>
-        <w:rPr>
-          <w:rFonts w:ascii="Calibri Light" w:hAnsi="Calibri Light" w:cs="Calibri Light"/>
-        </w:rPr>
-        <w:t>la</w:t>
-      </w:r>
-      <w:proofErr w:type="spellEnd"/>
-      <w:r>
-        <w:rPr>
-          <w:rFonts w:ascii="Calibri Light" w:hAnsi="Calibri Light" w:cs="Calibri Light"/>
-        </w:rPr>
-        <w:t xml:space="preserve"> matrícula por parte </w:t>
-      </w:r>
-      <w:proofErr w:type="spellStart"/>
-      <w:r>
-        <w:rPr>
-          <w:rFonts w:ascii="Calibri Light" w:hAnsi="Calibri Light" w:cs="Calibri Light"/>
-        </w:rPr>
-        <w:t>del</w:t>
-      </w:r>
-      <w:proofErr w:type="spellEnd"/>
-      <w:r>
-        <w:rPr>
-          <w:rFonts w:ascii="Calibri Light" w:hAnsi="Calibri Light" w:cs="Calibri Light"/>
-        </w:rPr>
-        <w:t xml:space="preserve"> SENA de </w:t>
-      </w:r>
-      <w:proofErr w:type="spellStart"/>
-      <w:r>
-        <w:rPr>
-          <w:rFonts w:ascii="Calibri Light" w:hAnsi="Calibri Light" w:cs="Calibri Light"/>
-        </w:rPr>
-        <w:t>acuerdo</w:t>
-      </w:r>
-      <w:proofErr w:type="spellEnd"/>
-      <w:r>
-        <w:rPr>
-          <w:rFonts w:ascii="Calibri Light" w:hAnsi="Calibri Light" w:cs="Calibri Light"/>
-        </w:rPr>
-        <w:t xml:space="preserve"> </w:t>
-      </w:r>
-      <w:proofErr w:type="spellStart"/>
-      <w:r>
-        <w:rPr>
-          <w:rFonts w:ascii="Calibri Light" w:hAnsi="Calibri Light" w:cs="Calibri Light"/>
-        </w:rPr>
-        <w:t>con</w:t>
-      </w:r>
-      <w:proofErr w:type="spellEnd"/>
-      <w:r>
-        <w:rPr>
-          <w:rFonts w:ascii="Calibri Light" w:hAnsi="Calibri Light" w:cs="Calibri Light"/>
-        </w:rPr>
-        <w:t xml:space="preserve"> </w:t>
-      </w:r>
-      <w:proofErr w:type="spellStart"/>
-      <w:r>
-        <w:rPr>
-          <w:rFonts w:ascii="Calibri Light" w:hAnsi="Calibri Light" w:cs="Calibri Light"/>
-        </w:rPr>
-        <w:t>el</w:t>
-      </w:r>
-      <w:proofErr w:type="spellEnd"/>
-      <w:r>
-        <w:rPr>
-          <w:rFonts w:ascii="Calibri Light" w:hAnsi="Calibri Light" w:cs="Calibri Light"/>
-        </w:rPr>
-        <w:t xml:space="preserve"> </w:t>
-      </w:r>
-      <w:proofErr w:type="spellStart"/>
-      <w:r>
-        <w:rPr>
-          <w:rFonts w:ascii="Calibri Light" w:hAnsi="Calibri Light" w:cs="Calibri Light"/>
-        </w:rPr>
-        <w:t>reglamento</w:t>
-      </w:r>
-      <w:proofErr w:type="spellEnd"/>
-      <w:r>
-        <w:rPr>
-          <w:rFonts w:ascii="Calibri Light" w:hAnsi="Calibri Light" w:cs="Calibri Light"/>
-        </w:rPr>
-        <w:t xml:space="preserve"> previsto para </w:t>
-      </w:r>
-      <w:proofErr w:type="spellStart"/>
-      <w:r>
-        <w:rPr>
-          <w:rFonts w:ascii="Calibri Light" w:hAnsi="Calibri Light" w:cs="Calibri Light"/>
-        </w:rPr>
-        <w:t>los</w:t>
-      </w:r>
-      <w:proofErr w:type="spellEnd"/>
-      <w:r>
-        <w:rPr>
-          <w:rFonts w:ascii="Calibri Light" w:hAnsi="Calibri Light" w:cs="Calibri Light"/>
-        </w:rPr>
-        <w:t xml:space="preserve"> </w:t>
-      </w:r>
-      <w:proofErr w:type="spellStart"/>
-      <w:r>
-        <w:rPr>
-          <w:rFonts w:ascii="Calibri Light" w:hAnsi="Calibri Light" w:cs="Calibri Light"/>
-        </w:rPr>
-        <w:t>aprendices</w:t>
-      </w:r>
-      <w:proofErr w:type="spellEnd"/>
-      <w:r>
-        <w:rPr>
-          <w:rFonts w:ascii="Calibri Light" w:hAnsi="Calibri Light" w:cs="Calibri Light"/>
-        </w:rPr>
-        <w:t xml:space="preserve">, ocasionada por </w:t>
-      </w:r>
-      <w:proofErr w:type="spellStart"/>
-      <w:r>
-        <w:rPr>
-          <w:rFonts w:ascii="Calibri Light" w:hAnsi="Calibri Light" w:cs="Calibri Light"/>
-        </w:rPr>
-        <w:t>el</w:t>
-      </w:r>
-      <w:proofErr w:type="spellEnd"/>
-      <w:r>
-        <w:rPr>
-          <w:rFonts w:ascii="Calibri Light" w:hAnsi="Calibri Light" w:cs="Calibri Light"/>
-        </w:rPr>
-        <w:t xml:space="preserve"> bajo </w:t>
-      </w:r>
-      <w:proofErr w:type="spellStart"/>
-      <w:r>
-        <w:rPr>
-          <w:rFonts w:ascii="Calibri Light" w:hAnsi="Calibri Light" w:cs="Calibri Light"/>
-        </w:rPr>
-        <w:t>rendimiento</w:t>
-      </w:r>
-      <w:proofErr w:type="spellEnd"/>
-      <w:r>
-        <w:rPr>
-          <w:rFonts w:ascii="Calibri Light" w:hAnsi="Calibri Light" w:cs="Calibri Light"/>
-        </w:rPr>
-        <w:t xml:space="preserve"> o </w:t>
-      </w:r>
-      <w:proofErr w:type="spellStart"/>
-      <w:r>
-        <w:rPr>
-          <w:rFonts w:ascii="Calibri Light" w:hAnsi="Calibri Light" w:cs="Calibri Light"/>
-        </w:rPr>
-        <w:t>la</w:t>
-      </w:r>
-      <w:proofErr w:type="spellEnd"/>
-      <w:r>
-        <w:rPr>
-          <w:rFonts w:ascii="Calibri Light" w:hAnsi="Calibri Light" w:cs="Calibri Light"/>
-        </w:rPr>
-        <w:t xml:space="preserve"> </w:t>
-      </w:r>
-      <w:proofErr w:type="spellStart"/>
-      <w:r>
-        <w:rPr>
-          <w:rFonts w:ascii="Calibri Light" w:hAnsi="Calibri Light" w:cs="Calibri Light"/>
-        </w:rPr>
-        <w:t>configuración</w:t>
-      </w:r>
-      <w:proofErr w:type="spellEnd"/>
-      <w:r>
-        <w:rPr>
-          <w:rFonts w:ascii="Calibri Light" w:hAnsi="Calibri Light" w:cs="Calibri Light"/>
-        </w:rPr>
-        <w:t xml:space="preserve"> de faltas disciplinarias cometidas </w:t>
-      </w:r>
-      <w:proofErr w:type="spellStart"/>
-      <w:r>
-        <w:rPr>
-          <w:rFonts w:ascii="Calibri Light" w:hAnsi="Calibri Light" w:cs="Calibri Light"/>
-        </w:rPr>
-        <w:t>en</w:t>
-      </w:r>
-      <w:proofErr w:type="spellEnd"/>
-      <w:r>
-        <w:rPr>
-          <w:rFonts w:ascii="Calibri Light" w:hAnsi="Calibri Light" w:cs="Calibri Light"/>
-        </w:rPr>
-        <w:t xml:space="preserve"> </w:t>
-      </w:r>
-      <w:proofErr w:type="spellStart"/>
-      <w:r>
-        <w:rPr>
-          <w:rFonts w:ascii="Calibri Light" w:hAnsi="Calibri Light" w:cs="Calibri Light"/>
-        </w:rPr>
-        <w:t>los</w:t>
-      </w:r>
-      <w:proofErr w:type="spellEnd"/>
-      <w:r>
-        <w:rPr>
-          <w:rFonts w:ascii="Calibri Light" w:hAnsi="Calibri Light" w:cs="Calibri Light"/>
-        </w:rPr>
-        <w:t xml:space="preserve"> </w:t>
-      </w:r>
-      <w:proofErr w:type="spellStart"/>
-      <w:r>
-        <w:rPr>
-          <w:rFonts w:ascii="Calibri Light" w:hAnsi="Calibri Light" w:cs="Calibri Light"/>
-        </w:rPr>
-        <w:t>periodos</w:t>
-      </w:r>
-      <w:proofErr w:type="spellEnd"/>
-      <w:r>
-        <w:rPr>
-          <w:rFonts w:ascii="Calibri Light" w:hAnsi="Calibri Light" w:cs="Calibri Light"/>
-        </w:rPr>
-        <w:t xml:space="preserve"> de </w:t>
-      </w:r>
-      <w:proofErr w:type="spellStart"/>
-      <w:r>
-        <w:rPr>
-          <w:rFonts w:ascii="Calibri Light" w:hAnsi="Calibri Light" w:cs="Calibri Light"/>
-        </w:rPr>
-        <w:t>Formación</w:t>
-      </w:r>
-      <w:proofErr w:type="spellEnd"/>
-      <w:r>
-        <w:rPr>
-          <w:rFonts w:ascii="Calibri Light" w:hAnsi="Calibri Light" w:cs="Calibri Light"/>
-        </w:rPr>
-        <w:t xml:space="preserve"> </w:t>
-      </w:r>
-      <w:proofErr w:type="spellStart"/>
-      <w:r>
-        <w:rPr>
-          <w:rFonts w:ascii="Calibri Light" w:hAnsi="Calibri Light" w:cs="Calibri Light"/>
-        </w:rPr>
-        <w:t>Profesional</w:t>
-      </w:r>
-      <w:proofErr w:type="spellEnd"/>
-      <w:r>
-        <w:rPr>
-          <w:rFonts w:ascii="Calibri Light" w:hAnsi="Calibri Light" w:cs="Calibri Light"/>
-        </w:rPr>
-        <w:t xml:space="preserve"> Integral </w:t>
-      </w:r>
-      <w:proofErr w:type="spellStart"/>
-      <w:r>
-        <w:rPr>
-          <w:rFonts w:ascii="Calibri Light" w:hAnsi="Calibri Light" w:cs="Calibri Light"/>
-        </w:rPr>
-        <w:t>en</w:t>
-      </w:r>
-      <w:proofErr w:type="spellEnd"/>
-      <w:r>
-        <w:rPr>
-          <w:rFonts w:ascii="Calibri Light" w:hAnsi="Calibri Light" w:cs="Calibri Light"/>
-        </w:rPr>
-        <w:t xml:space="preserve"> </w:t>
-      </w:r>
-      <w:proofErr w:type="spellStart"/>
-      <w:r>
-        <w:rPr>
-          <w:rFonts w:ascii="Calibri Light" w:hAnsi="Calibri Light" w:cs="Calibri Light"/>
-        </w:rPr>
-        <w:t>el</w:t>
-      </w:r>
-      <w:proofErr w:type="spellEnd"/>
-      <w:r>
-        <w:rPr>
-          <w:rFonts w:ascii="Calibri Light" w:hAnsi="Calibri Light" w:cs="Calibri Light"/>
-        </w:rPr>
-        <w:t xml:space="preserve"> SENA o </w:t>
-      </w:r>
-      <w:proofErr w:type="spellStart"/>
-      <w:r>
-        <w:rPr>
-          <w:rFonts w:ascii="Calibri Light" w:hAnsi="Calibri Light" w:cs="Calibri Light"/>
-        </w:rPr>
-        <w:t>en</w:t>
-      </w:r>
-      <w:proofErr w:type="spellEnd"/>
-      <w:r>
-        <w:rPr>
-          <w:rFonts w:ascii="Calibri Light" w:hAnsi="Calibri Light" w:cs="Calibri Light"/>
-        </w:rPr>
-        <w:t xml:space="preserve"> </w:t>
-      </w:r>
-      <w:proofErr w:type="spellStart"/>
-      <w:r>
-        <w:rPr>
-          <w:rFonts w:ascii="Calibri Light" w:hAnsi="Calibri Light" w:cs="Calibri Light"/>
-        </w:rPr>
-        <w:t>la</w:t>
-      </w:r>
-      <w:proofErr w:type="spellEnd"/>
-      <w:r>
-        <w:rPr>
-          <w:rFonts w:ascii="Calibri Light" w:hAnsi="Calibri Light" w:cs="Calibri Light"/>
-        </w:rPr>
-        <w:t xml:space="preserve"> </w:t>
+        <w:t xml:space="preserve">La cancelación de la matrícula por parte del SENA de acuerdo con el reglamento previsto para los aprendices, ocasionada por el bajo rendimiento o la configuración de faltas disciplinarias cometidas en los periodos de Formación Profesional Integral en el SENA o en la </w:t>
       </w:r>
       <w:r>
         <w:rPr>
@@ -5752,21 +4073,7 @@
           <w:rFonts w:ascii="Calibri Light" w:hAnsi="Calibri Light" w:cs="Calibri Light"/>
         </w:rPr>
         <w:tab/>
-        <w:t xml:space="preserve">Por </w:t>
-      </w:r>
-      <w:proofErr w:type="spellStart"/>
-      <w:r>
-        <w:rPr>
-          <w:rFonts w:ascii="Calibri Light" w:hAnsi="Calibri Light" w:cs="Calibri Light"/>
-        </w:rPr>
-        <w:t>decisión</w:t>
-      </w:r>
-      <w:proofErr w:type="spellEnd"/>
-      <w:r>
-        <w:rPr>
-          <w:rFonts w:ascii="Calibri Light" w:hAnsi="Calibri Light" w:cs="Calibri Light"/>
-        </w:rPr>
-        <w:t xml:space="preserve"> unilateral, libre y voluntaria del </w:t>
+        <w:t xml:space="preserve">Por decisión unilateral, libre y voluntaria del </w:t>
       </w:r>
       <w:r>
         <w:rPr>
@@ -5798,77 +4105,7 @@
           <w:rFonts w:ascii="Calibri Light" w:hAnsi="Calibri Light" w:cs="Calibri Light"/>
         </w:rPr>
         <w:tab/>
-        <w:t xml:space="preserve">Por </w:t>
-      </w:r>
-      <w:proofErr w:type="spellStart"/>
-      <w:r>
-        <w:rPr>
-          <w:rFonts w:ascii="Calibri Light" w:hAnsi="Calibri Light" w:cs="Calibri Light"/>
-        </w:rPr>
-        <w:t>el</w:t>
-      </w:r>
-      <w:proofErr w:type="spellEnd"/>
-      <w:r>
-        <w:rPr>
-          <w:rFonts w:ascii="Calibri Light" w:hAnsi="Calibri Light" w:cs="Calibri Light"/>
-        </w:rPr>
-        <w:t xml:space="preserve"> </w:t>
-      </w:r>
-      <w:proofErr w:type="spellStart"/>
-      <w:r>
-        <w:rPr>
-          <w:rFonts w:ascii="Calibri Light" w:hAnsi="Calibri Light" w:cs="Calibri Light"/>
-        </w:rPr>
-        <w:t>incumplimiento</w:t>
-      </w:r>
-      <w:proofErr w:type="spellEnd"/>
-      <w:r>
-        <w:rPr>
-          <w:rFonts w:ascii="Calibri Light" w:hAnsi="Calibri Light" w:cs="Calibri Light"/>
-        </w:rPr>
-        <w:t xml:space="preserve"> de </w:t>
-      </w:r>
-      <w:proofErr w:type="spellStart"/>
-      <w:r>
-        <w:rPr>
-          <w:rFonts w:ascii="Calibri Light" w:hAnsi="Calibri Light" w:cs="Calibri Light"/>
-        </w:rPr>
-        <w:t>las</w:t>
-      </w:r>
-      <w:proofErr w:type="spellEnd"/>
-      <w:r>
-        <w:rPr>
-          <w:rFonts w:ascii="Calibri Light" w:hAnsi="Calibri Light" w:cs="Calibri Light"/>
-        </w:rPr>
-        <w:t xml:space="preserve"> </w:t>
-      </w:r>
-      <w:proofErr w:type="spellStart"/>
-      <w:r>
-        <w:rPr>
-          <w:rFonts w:ascii="Calibri Light" w:hAnsi="Calibri Light" w:cs="Calibri Light"/>
-        </w:rPr>
-        <w:t>obligaciones</w:t>
-      </w:r>
-      <w:proofErr w:type="spellEnd"/>
-      <w:r>
-        <w:rPr>
-          <w:rFonts w:ascii="Calibri Light" w:hAnsi="Calibri Light" w:cs="Calibri Light"/>
-        </w:rPr>
-        <w:t xml:space="preserve"> por parte </w:t>
-      </w:r>
-      <w:proofErr w:type="spellStart"/>
-      <w:r>
-        <w:rPr>
-          <w:rFonts w:ascii="Calibri Light" w:hAnsi="Calibri Light" w:cs="Calibri Light"/>
-        </w:rPr>
-        <w:t>del</w:t>
-      </w:r>
-      <w:proofErr w:type="spellEnd"/>
-      <w:r>
-        <w:rPr>
-          <w:rFonts w:ascii="Calibri Light" w:hAnsi="Calibri Light" w:cs="Calibri Light"/>
-        </w:rPr>
-        <w:t xml:space="preserve"> </w:t>
+        <w:t xml:space="preserve">Por el incumplimiento de las obligaciones por parte del </w:t>
       </w:r>
       <w:r>
         <w:rPr>
@@ -5898,105 +4135,7 @@
           <w:rFonts w:ascii="Calibri Light" w:hAnsi="Calibri Light" w:cs="Calibri Light"/>
         </w:rPr>
         <w:tab/>
-        <w:t xml:space="preserve">Por </w:t>
-      </w:r>
-      <w:proofErr w:type="spellStart"/>
-      <w:r>
-        <w:rPr>
-          <w:rFonts w:ascii="Calibri Light" w:hAnsi="Calibri Light" w:cs="Calibri Light"/>
-        </w:rPr>
-        <w:t>conclusión</w:t>
-      </w:r>
-      <w:proofErr w:type="spellEnd"/>
-      <w:r>
-        <w:rPr>
-          <w:rFonts w:ascii="Calibri Light" w:hAnsi="Calibri Light" w:cs="Calibri Light"/>
-        </w:rPr>
-        <w:t xml:space="preserve"> de </w:t>
-      </w:r>
-      <w:proofErr w:type="spellStart"/>
-      <w:r>
-        <w:rPr>
-          <w:rFonts w:ascii="Calibri Light" w:hAnsi="Calibri Light" w:cs="Calibri Light"/>
-        </w:rPr>
-        <w:t>la</w:t>
-      </w:r>
-      <w:proofErr w:type="spellEnd"/>
-      <w:r>
-        <w:rPr>
-          <w:rFonts w:ascii="Calibri Light" w:hAnsi="Calibri Light" w:cs="Calibri Light"/>
-        </w:rPr>
-        <w:t xml:space="preserve"> etapa de </w:t>
-      </w:r>
-      <w:proofErr w:type="spellStart"/>
-      <w:r>
-        <w:rPr>
-          <w:rFonts w:ascii="Calibri Light" w:hAnsi="Calibri Light" w:cs="Calibri Light"/>
-        </w:rPr>
-        <w:t>formación</w:t>
-      </w:r>
-      <w:proofErr w:type="spellEnd"/>
-      <w:r>
-        <w:rPr>
-          <w:rFonts w:ascii="Calibri Light" w:hAnsi="Calibri Light" w:cs="Calibri Light"/>
-        </w:rPr>
-        <w:t xml:space="preserve">, </w:t>
-      </w:r>
-      <w:proofErr w:type="spellStart"/>
-      <w:r>
-        <w:rPr>
-          <w:rFonts w:ascii="Calibri Light" w:hAnsi="Calibri Light" w:cs="Calibri Light"/>
-        </w:rPr>
-        <w:t>según</w:t>
-      </w:r>
-      <w:proofErr w:type="spellEnd"/>
-      <w:r>
-        <w:rPr>
-          <w:rFonts w:ascii="Calibri Light" w:hAnsi="Calibri Light" w:cs="Calibri Light"/>
-        </w:rPr>
-        <w:t xml:space="preserve"> </w:t>
-      </w:r>
-      <w:proofErr w:type="spellStart"/>
-      <w:r>
-        <w:rPr>
-          <w:rFonts w:ascii="Calibri Light" w:hAnsi="Calibri Light" w:cs="Calibri Light"/>
-        </w:rPr>
-        <w:t>certificación</w:t>
-      </w:r>
-      <w:proofErr w:type="spellEnd"/>
-      <w:r>
-        <w:rPr>
-          <w:rFonts w:ascii="Calibri Light" w:hAnsi="Calibri Light" w:cs="Calibri Light"/>
-        </w:rPr>
-        <w:t xml:space="preserve"> de </w:t>
-      </w:r>
-      <w:proofErr w:type="spellStart"/>
-      <w:r>
-        <w:rPr>
-          <w:rFonts w:ascii="Calibri Light" w:hAnsi="Calibri Light" w:cs="Calibri Light"/>
-        </w:rPr>
-        <w:t>la</w:t>
-      </w:r>
-      <w:proofErr w:type="spellEnd"/>
-      <w:r>
-        <w:rPr>
-          <w:rFonts w:ascii="Calibri Light" w:hAnsi="Calibri Light" w:cs="Calibri Light"/>
-        </w:rPr>
-        <w:t xml:space="preserve"> </w:t>
-      </w:r>
-      <w:proofErr w:type="spellStart"/>
-      <w:r>
-        <w:rPr>
-          <w:rFonts w:ascii="Calibri Light" w:hAnsi="Calibri Light" w:cs="Calibri Light"/>
-        </w:rPr>
-        <w:t>institución</w:t>
-      </w:r>
-      <w:proofErr w:type="spellEnd"/>
-      <w:r>
-        <w:rPr>
-          <w:rFonts w:ascii="Calibri Light" w:hAnsi="Calibri Light" w:cs="Calibri Light"/>
-        </w:rPr>
-        <w:t xml:space="preserve"> educativa o del SENA.</w:t>
+        <w:t>Por conclusión de la etapa de formación, según certificación de la institución educativa o del SENA.</w:t>
       </w:r>
     </w:p>
     <w:p>
@@ -6018,76 +4157,7 @@
           <w:rFonts w:ascii="Calibri Light" w:hAnsi="Calibri Light" w:cs="Calibri Light"/>
         </w:rPr>
         <w:tab/>
-      </w:r>
-      <w:proofErr w:type="spellStart"/>
-      <w:r>
-        <w:rPr>
-          <w:rFonts w:ascii="Calibri Light" w:hAnsi="Calibri Light" w:cs="Calibri Light"/>
-        </w:rPr>
-        <w:t>Las</w:t>
-      </w:r>
-      <w:proofErr w:type="spellEnd"/>
-      <w:r>
-        <w:rPr>
-          <w:rFonts w:ascii="Calibri Light" w:hAnsi="Calibri Light" w:cs="Calibri Light"/>
-        </w:rPr>
-        <w:t xml:space="preserve"> </w:t>
-      </w:r>
-      <w:proofErr w:type="spellStart"/>
-      <w:r>
-        <w:rPr>
-          <w:rFonts w:ascii="Calibri Light" w:hAnsi="Calibri Light" w:cs="Calibri Light"/>
-        </w:rPr>
-        <w:t>demás</w:t>
-      </w:r>
-      <w:proofErr w:type="spellEnd"/>
-      <w:r>
-        <w:rPr>
-          <w:rFonts w:ascii="Calibri Light" w:hAnsi="Calibri Light" w:cs="Calibri Light"/>
-        </w:rPr>
-        <w:t xml:space="preserve"> que </w:t>
-      </w:r>
-      <w:proofErr w:type="spellStart"/>
-      <w:r>
-        <w:rPr>
-          <w:rFonts w:ascii="Calibri Light" w:hAnsi="Calibri Light" w:cs="Calibri Light"/>
-        </w:rPr>
-        <w:t>las</w:t>
-      </w:r>
-      <w:proofErr w:type="spellEnd"/>
-      <w:r>
-        <w:rPr>
-          <w:rFonts w:ascii="Calibri Light" w:hAnsi="Calibri Light" w:cs="Calibri Light"/>
-        </w:rPr>
-        <w:t xml:space="preserve"> normas </w:t>
-      </w:r>
-      <w:proofErr w:type="spellStart"/>
-      <w:r>
-        <w:rPr>
-          <w:rFonts w:ascii="Calibri Light" w:hAnsi="Calibri Light" w:cs="Calibri Light"/>
-        </w:rPr>
-        <w:t>aplicables</w:t>
-      </w:r>
-      <w:proofErr w:type="spellEnd"/>
-      <w:r>
-        <w:rPr>
-          <w:rFonts w:ascii="Calibri Light" w:hAnsi="Calibri Light" w:cs="Calibri Light"/>
-        </w:rPr>
-        <w:t xml:space="preserve"> </w:t>
-      </w:r>
-      <w:proofErr w:type="spellStart"/>
-      <w:r>
-        <w:rPr>
-          <w:rFonts w:ascii="Calibri Light" w:hAnsi="Calibri Light" w:cs="Calibri Light"/>
-        </w:rPr>
-        <w:t>establezcan</w:t>
-      </w:r>
-      <w:proofErr w:type="spellEnd"/>
-      <w:r>
-        <w:rPr>
-          <w:rFonts w:ascii="Calibri Light" w:hAnsi="Calibri Light" w:cs="Calibri Light"/>
-        </w:rPr>
-        <w:t xml:space="preserve">. </w:t>
+        <w:t xml:space="preserve">Las demás que las normas aplicables establezcan. </w:t>
       </w:r>
     </w:p>
     <w:p>
@@ -7184,39 +5254,7 @@
           <w:rFonts w:ascii="Calibri Light" w:hAnsi="Calibri Light" w:cs="Calibri Light"/>
           <w:lang w:val="es-ES"/>
         </w:rPr>
-        <w:t xml:space="preserve">Las PARTES se comprometen a cumplir todas las leyes y regulaciones vigentes, incluyendo la Ley 1778 de 2016, el FCPA, el UK </w:t>
-      </w:r>
-      <w:proofErr w:type="spellStart"/>
-      <w:r>
-        <w:rPr>
-          <w:rFonts w:ascii="Calibri Light" w:hAnsi="Calibri Light" w:cs="Calibri Light"/>
-          <w:lang w:val="es-ES"/>
-        </w:rPr>
-        <w:t>Bribery</w:t>
-      </w:r>
-      <w:proofErr w:type="spellEnd"/>
-      <w:r>
-        <w:rPr>
-          <w:rFonts w:ascii="Calibri Light" w:hAnsi="Calibri Light" w:cs="Calibri Light"/>
-          <w:lang w:val="es-ES"/>
-        </w:rPr>
-        <w:t xml:space="preserve"> </w:t>
-      </w:r>
-      <w:proofErr w:type="spellStart"/>
-      <w:r>
-        <w:rPr>
-          <w:rFonts w:ascii="Calibri Light" w:hAnsi="Calibri Light" w:cs="Calibri Light"/>
-          <w:lang w:val="es-ES"/>
-        </w:rPr>
-        <w:t>Act</w:t>
-      </w:r>
-      <w:proofErr w:type="spellEnd"/>
-      <w:r>
-        <w:rPr>
-          <w:rFonts w:ascii="Calibri Light" w:hAnsi="Calibri Light" w:cs="Calibri Light"/>
-          <w:lang w:val="es-ES"/>
-        </w:rPr>
-        <w:t xml:space="preserve"> y otras relacionadas con soborno, corrupción y conflictos de interés.</w:t>
+        <w:t>Las PARTES se comprometen a cumplir todas las leyes y regulaciones vigentes, incluyendo la Ley 1778 de 2016, el FCPA, el UK Bribery Act y otras relacionadas con soborno, corrupción y conflictos de interés.</w:t>
       </w:r>
     </w:p>
     <w:p>
@@ -7316,23 +5354,7 @@
           <w:rFonts w:ascii="Calibri Light" w:hAnsi="Calibri Light" w:cs="Calibri Light"/>
           <w:lang w:val="es-ES"/>
         </w:rPr>
-        <w:t xml:space="preserve">Las PARTES garantizarán que sus representantes no son funcionarios públicos </w:t>
-      </w:r>
-      <w:proofErr w:type="spellStart"/>
-      <w:r>
-        <w:rPr>
-          <w:rFonts w:ascii="Calibri Light" w:hAnsi="Calibri Light" w:cs="Calibri Light"/>
-          <w:lang w:val="es-ES"/>
-        </w:rPr>
-        <w:t>y</w:t>
-      </w:r>
-      <w:proofErr w:type="spellEnd"/>
-      <w:r>
-        <w:rPr>
-          <w:rFonts w:ascii="Calibri Light" w:hAnsi="Calibri Light" w:cs="Calibri Light"/>
-          <w:lang w:val="es-ES"/>
-        </w:rPr>
-        <w:t xml:space="preserve"> informarán sobre cualquier cambio en este estatus.</w:t>
+        <w:t>Las PARTES garantizarán que sus representantes no son funcionarios públicos y informarán sobre cualquier cambio en este estatus.</w:t>
       </w:r>
     </w:p>
     <w:p>
@@ -7494,19 +5516,11 @@
           <w:rFonts w:ascii="Calibri Light" w:hAnsi="Calibri Light" w:cs="Calibri Light"/>
         </w:rPr>
       </w:pPr>
-      <w:proofErr w:type="spellStart"/>
-      <w:r>
-        <w:rPr>
-          <w:rFonts w:ascii="Calibri Light" w:hAnsi="Calibri Light" w:cs="Calibri Light"/>
-        </w:rPr>
-        <w:t>ii</w:t>
-      </w:r>
-      <w:proofErr w:type="spellEnd"/>
-      <w:r>
-        <w:rPr>
-          <w:rFonts w:ascii="Calibri Light" w:hAnsi="Calibri Light" w:cs="Calibri Light"/>
-        </w:rPr>
-        <w:t xml:space="preserve">. </w:t>
+      <w:r>
+        <w:rPr>
+          <w:rFonts w:ascii="Calibri Light" w:hAnsi="Calibri Light" w:cs="Calibri Light"/>
+        </w:rPr>
+        <w:t xml:space="preserve">ii. </w:t>
       </w:r>
       <w:r>
         <w:rPr>
@@ -7544,19 +5558,11 @@
           <w:rFonts w:ascii="Calibri Light" w:hAnsi="Calibri Light" w:cs="Calibri Light"/>
         </w:rPr>
       </w:pPr>
-      <w:proofErr w:type="spellStart"/>
-      <w:r>
-        <w:rPr>
-          <w:rFonts w:ascii="Calibri Light" w:hAnsi="Calibri Light" w:cs="Calibri Light"/>
-        </w:rPr>
-        <w:t>iii</w:t>
-      </w:r>
-      <w:proofErr w:type="spellEnd"/>
-      <w:r>
-        <w:rPr>
-          <w:rFonts w:ascii="Calibri Light" w:hAnsi="Calibri Light" w:cs="Calibri Light"/>
-        </w:rPr>
-        <w:t xml:space="preserve">. </w:t>
+      <w:r>
+        <w:rPr>
+          <w:rFonts w:ascii="Calibri Light" w:hAnsi="Calibri Light" w:cs="Calibri Light"/>
+        </w:rPr>
+        <w:t xml:space="preserve">iii. </w:t>
       </w:r>
       <w:r>
         <w:rPr>
@@ -8024,23 +6030,7 @@
           <w:rFonts w:ascii="Calibri Light" w:hAnsi="Calibri Light" w:cs="Calibri Light"/>
           <w:b/>
         </w:rPr>
-        <w:t>[[</w:t>
-      </w:r>
-      <w:proofErr w:type="spellStart"/>
-      <w:r>
-        <w:rPr>
-          <w:rFonts w:ascii="Calibri Light" w:hAnsi="Calibri Light" w:cs="Calibri Light"/>
-          <w:b/>
-        </w:rPr>
-        <w:t>FechaIngreso</w:t>
-      </w:r>
-      <w:proofErr w:type="spellEnd"/>
-      <w:r>
-        <w:rPr>
-          <w:rFonts w:ascii="Calibri Light" w:hAnsi="Calibri Light" w:cs="Calibri Light"/>
-          <w:b/>
-        </w:rPr>
-        <w:t>]]</w:t>
+        <w:t>[[FechaIngreso]]</w:t>
       </w:r>
       <w:r>
         <w:rPr>
@@ -8054,23 +6044,7 @@
           <w:rFonts w:ascii="Calibri Light" w:hAnsi="Calibri Light" w:cs="Calibri Light"/>
           <w:b/>
         </w:rPr>
-        <w:t xml:space="preserve"> [[</w:t>
-      </w:r>
-      <w:proofErr w:type="spellStart"/>
-      <w:r>
-        <w:rPr>
-          <w:rFonts w:ascii="Calibri Light" w:hAnsi="Calibri Light" w:cs="Calibri Light"/>
-          <w:b/>
-        </w:rPr>
-        <w:t>FechaSalida</w:t>
-      </w:r>
-      <w:proofErr w:type="spellEnd"/>
-      <w:r>
-        <w:rPr>
-          <w:rFonts w:ascii="Calibri Light" w:hAnsi="Calibri Light" w:cs="Calibri Light"/>
-          <w:b/>
-        </w:rPr>
-        <w:t>]]</w:t>
+        <w:t xml:space="preserve"> [[FechaSalida]]</w:t>
       </w:r>
       <w:r>
         <w:rPr>
@@ -8113,21 +6087,7 @@
         <w:rPr>
           <w:rFonts w:ascii="Calibri Light" w:hAnsi="Calibri Light" w:cs="Calibri Light"/>
         </w:rPr>
-        <w:t xml:space="preserve"> [[</w:t>
-      </w:r>
-      <w:proofErr w:type="spellStart"/>
-      <w:r>
-        <w:rPr>
-          <w:rFonts w:ascii="Calibri Light" w:hAnsi="Calibri Light" w:cs="Calibri Light"/>
-        </w:rPr>
-        <w:t>FechaLarga</w:t>
-      </w:r>
-      <w:proofErr w:type="spellEnd"/>
-      <w:r>
-        <w:rPr>
-          <w:rFonts w:ascii="Calibri Light" w:hAnsi="Calibri Light" w:cs="Calibri Light"/>
-        </w:rPr>
-        <w:t>]]</w:t>
+        <w:t xml:space="preserve"> [[FechaLarga]]</w:t>
       </w:r>
     </w:p>
     <w:p>
@@ -8266,16 +6226,7 @@
           <w:b/>
           <w:lang w:eastAsia="es-ES"/>
         </w:rPr>
-        <w:t xml:space="preserve">          </w:t>
-      </w:r>
-      <w:proofErr w:type="gramStart"/>
-      <w:r>
-        <w:rPr>
-          <w:rFonts w:ascii="Calibri Light" w:eastAsia="Times New Roman" w:hAnsi="Calibri Light" w:cs="Calibri Light"/>
-          <w:b/>
-          <w:lang w:eastAsia="es-ES"/>
-        </w:rPr>
-        <w:t xml:space="preserve">  </w:t>
+        <w:t xml:space="preserve">            </w:t>
       </w:r>
       <w:r>
         <w:rPr>
@@ -8291,16 +6242,7 @@
           <w:color w:val="000000"/>
           <w:lang w:eastAsia="es-CO"/>
         </w:rPr>
-        <w:t>[</w:t>
-      </w:r>
-      <w:proofErr w:type="gramEnd"/>
-      <w:r>
-        <w:rPr>
-          <w:rFonts w:ascii="Calibri" w:eastAsia="Times New Roman" w:hAnsi="Calibri" w:cs="Calibri"/>
-          <w:color w:val="000000"/>
-          <w:lang w:eastAsia="es-CO"/>
-        </w:rPr>
-        <w:t>[Nombre]]</w:t>
+        <w:t>[[Nombre]]</w:t>
       </w:r>
     </w:p>
     <w:p>
@@ -8789,7 +6731,6 @@
                               <w:szCs w:val="18"/>
                             </w:rPr>
                           </w:pPr>
-                          <w:proofErr w:type="spellStart"/>
                           <w:r>
                             <w:rPr>
                               <w:rFonts w:ascii="Century Gothic" w:hAnsi="Century Gothic"/>
@@ -8799,7 +6740,6 @@
                             </w:rPr>
                             <w:t>Cyrgocolombia</w:t>
                           </w:r>
-                          <w:proofErr w:type="spellEnd"/>
                         </w:p>
                       </w:txbxContent>
                     </wps:txbx>
@@ -9508,7 +7448,7 @@
             </wp:anchor>
           </w:drawing>
         </mc:Choice>
-        <mc:Fallback xmlns:w16sdtfl="http://schemas.microsoft.com/office/word/2024/wordml/sdtformatlock" xmlns:w16du="http://schemas.microsoft.com/office/word/2023/wordml/word16du">
+        <mc:Fallback xmlns:w16du="http://schemas.microsoft.com/office/word/2023/wordml/word16du" xmlns:w16sdtfl="http://schemas.microsoft.com/office/word/2024/wordml/sdtformatlock">
           <w:pict>
             <v:shape w14:anchorId="299C3497" id="Freeform 2" o:spid="_x0000_s1026" style="position:absolute;margin-left:352.5pt;margin-top:-2.05pt;width:152.5pt;height:50pt;z-index:251678720;visibility:visible;mso-wrap-style:square;mso-width-percent:0;mso-height-percent:0;mso-wrap-distance-left:9pt;mso-wrap-distance-top:0;mso-wrap-distance-right:9pt;mso-wrap-distance-bottom:0;mso-position-horizontal:absolute;mso-position-horizontal-relative:text;mso-position-vertical:absolute;mso-position-vertical-relative:text;mso-width-percent:0;mso-height-percent:0;mso-width-relative:margin;mso-height-relative:margin;v-text-anchor:top" coordsize="9718609,3119485" o:gfxdata="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" path="m,l9718608,r,3119485l,3119485,,xe" stroked="f">
               <v:fill r:id="rId2" o:title="" recolor="t" rotate="t" type="frame"/>

</xml_diff>

<commit_message>
Fixes finales para QA
</commit_message>
<xml_diff>
--- a/webapp/templates/word/Contrato_Aprendizaje_Lectivo_Cyrgo.docx
+++ b/webapp/templates/word/Contrato_Aprendizaje_Lectivo_Cyrgo.docx
@@ -2701,13 +2701,28 @@
           <w:b/>
         </w:rPr>
         <w:lastRenderedPageBreak/>
-        <w:t>PARÁGRAFO PRIMERO</w:t>
-      </w:r>
-      <w:r>
-        <w:rPr>
-          <w:rFonts w:ascii="Calibri Light" w:hAnsi="Calibri Light" w:cs="Calibri Light"/>
-        </w:rPr>
-        <w:t xml:space="preserve">.- Este apoyo de sostenimiento no constituye salario en forma alguna ni es considerado una contraprestación directa de un servicio a favor de la </w:t>
+        <w:t xml:space="preserve">PARÁGRAFO </w:t>
+      </w:r>
+      <w:proofErr w:type="gramStart"/>
+      <w:r>
+        <w:rPr>
+          <w:rFonts w:ascii="Calibri Light" w:hAnsi="Calibri Light" w:cs="Calibri Light"/>
+          <w:b/>
+        </w:rPr>
+        <w:t>PRIMERO</w:t>
+      </w:r>
+      <w:r>
+        <w:rPr>
+          <w:rFonts w:ascii="Calibri Light" w:hAnsi="Calibri Light" w:cs="Calibri Light"/>
+        </w:rPr>
+        <w:t>.-</w:t>
+      </w:r>
+      <w:proofErr w:type="gramEnd"/>
+      <w:r>
+        <w:rPr>
+          <w:rFonts w:ascii="Calibri Light" w:hAnsi="Calibri Light" w:cs="Calibri Light"/>
+        </w:rPr>
+        <w:t xml:space="preserve"> Este apoyo de sostenimiento no constituye salario en forma alguna ni es considerado una contraprestación directa de un servicio a favor de la </w:t>
       </w:r>
       <w:r>
         <w:rPr>
@@ -8399,18 +8414,8 @@
         <w:jc w:val="both"/>
         <w:rPr>
           <w:rFonts w:ascii="Calibri Light" w:hAnsi="Calibri Light" w:cs="Calibri Light"/>
-          <w:b/>
-          <w:bCs/>
-        </w:rPr>
-      </w:pPr>
-      <w:r>
-        <w:rPr>
-          <w:rFonts w:ascii="Calibri Light" w:hAnsi="Calibri Light" w:cs="Calibri Light"/>
-          <w:b/>
-          <w:bCs/>
-        </w:rPr>
-        <w:t xml:space="preserve">LA EMPRESA                                                                     EL APRENDIZ      </w:t>
-      </w:r>
+        </w:rPr>
+      </w:pPr>
     </w:p>
     <w:p>
       <w:pPr>
@@ -8419,11 +8424,31 @@
         <w:rPr>
           <w:rFonts w:ascii="Calibri Light" w:hAnsi="Calibri Light" w:cs="Calibri Light"/>
           <w:b/>
-        </w:rPr>
-      </w:pPr>
-      <w:r>
-        <w:rPr>
-          <w:rFonts w:ascii="Calibri Light" w:hAnsi="Calibri Light" w:cs="Calibri Light"/>
+          <w:bCs/>
+        </w:rPr>
+      </w:pPr>
+      <w:r>
+        <w:rPr>
+          <w:rFonts w:ascii="Calibri Light" w:hAnsi="Calibri Light" w:cs="Calibri Light"/>
+          <w:b/>
+          <w:bCs/>
+        </w:rPr>
+        <w:t xml:space="preserve">LA EMPRESA                                                                     EL APRENDIZ      </w:t>
+      </w:r>
+    </w:p>
+    <w:p>
+      <w:pPr>
+        <w:spacing w:line="240" w:lineRule="auto"/>
+        <w:jc w:val="both"/>
+        <w:rPr>
+          <w:rFonts w:ascii="Calibri Light" w:hAnsi="Calibri Light" w:cs="Calibri Light"/>
+          <w:bCs/>
+        </w:rPr>
+      </w:pPr>
+      <w:r>
+        <w:rPr>
+          <w:rFonts w:ascii="Calibri Light" w:hAnsi="Calibri Light" w:cs="Calibri Light"/>
+          <w:bCs/>
           <w:noProof/>
           <w:lang w:val="es-ES_tradnl"/>
         </w:rPr>
@@ -8469,65 +8494,215 @@
           </wp:inline>
         </w:drawing>
       </w:r>
+      <w:bookmarkEnd w:id="6"/>
     </w:p>
     <w:p>
       <w:pPr>
-        <w:spacing w:after="0" w:line="240" w:lineRule="auto"/>
-        <w:jc w:val="both"/>
-        <w:rPr>
-          <w:rFonts w:ascii="Calibri Light" w:hAnsi="Calibri Light" w:cs="Calibri Light"/>
-          <w:b/>
-        </w:rPr>
-      </w:pPr>
-      <w:r>
-        <w:rPr>
-          <w:rFonts w:ascii="Calibri Light" w:hAnsi="Calibri Light" w:cs="Calibri Light"/>
-          <w:b/>
-        </w:rPr>
-        <w:t>_________________________                                     _______________________</w:t>
-      </w:r>
-    </w:p>
-    <w:bookmarkEnd w:id="6"/>
-    <w:p>
-      <w:pPr>
         <w:spacing w:line="240" w:lineRule="auto"/>
+        <w:rPr>
+          <w:rFonts w:ascii="Calibri Light" w:hAnsi="Calibri Light" w:cs="Calibri Light"/>
+          <w:b/>
+        </w:rPr>
+      </w:pPr>
+      <w:r>
+        <w:rPr>
+          <w:rFonts w:ascii="Calibri Light" w:eastAsia="Calibri" w:hAnsi="Calibri Light" w:cs="Calibri Light"/>
+          <w:noProof/>
+        </w:rPr>
+        <mc:AlternateContent>
+          <mc:Choice Requires="wps">
+            <w:drawing>
+              <wp:anchor distT="0" distB="0" distL="114300" distR="114300" simplePos="0" relativeHeight="251659264" behindDoc="0" locked="0" layoutInCell="1" allowOverlap="1" wp14:anchorId="307F9F98" wp14:editId="2B1A5779">
+                <wp:simplePos x="0" y="0"/>
+                <wp:positionH relativeFrom="column">
+                  <wp:posOffset>2943225</wp:posOffset>
+                </wp:positionH>
+                <wp:positionV relativeFrom="paragraph">
+                  <wp:posOffset>0</wp:posOffset>
+                </wp:positionV>
+                <wp:extent cx="1943100" cy="0"/>
+                <wp:effectExtent l="38100" t="38100" r="57150" b="95250"/>
+                <wp:wrapNone/>
+                <wp:docPr id="3" name="Conector: angular 3"/>
+                <wp:cNvGraphicFramePr/>
+                <a:graphic xmlns:a="http://schemas.openxmlformats.org/drawingml/2006/main">
+                  <a:graphicData uri="http://schemas.microsoft.com/office/word/2010/wordprocessingShape">
+                    <wps:wsp>
+                      <wps:cNvCnPr/>
+                      <wps:spPr>
+                        <a:xfrm>
+                          <a:off x="0" y="0"/>
+                          <a:ext cx="1943100" cy="0"/>
+                        </a:xfrm>
+                        <a:prstGeom prst="bentConnector3">
+                          <a:avLst/>
+                        </a:prstGeom>
+                        <a:ln w="6350"/>
+                      </wps:spPr>
+                      <wps:style>
+                        <a:lnRef idx="2">
+                          <a:schemeClr val="dk1"/>
+                        </a:lnRef>
+                        <a:fillRef idx="0">
+                          <a:schemeClr val="dk1"/>
+                        </a:fillRef>
+                        <a:effectRef idx="1">
+                          <a:schemeClr val="dk1"/>
+                        </a:effectRef>
+                        <a:fontRef idx="minor">
+                          <a:schemeClr val="tx1"/>
+                        </a:fontRef>
+                      </wps:style>
+                      <wps:bodyPr/>
+                    </wps:wsp>
+                  </a:graphicData>
+                </a:graphic>
+                <wp14:sizeRelH relativeFrom="margin">
+                  <wp14:pctWidth>0</wp14:pctWidth>
+                </wp14:sizeRelH>
+                <wp14:sizeRelV relativeFrom="margin">
+                  <wp14:pctHeight>0</wp14:pctHeight>
+                </wp14:sizeRelV>
+              </wp:anchor>
+            </w:drawing>
+          </mc:Choice>
+          <mc:Fallback>
+            <w:pict>
+              <v:shapetype w14:anchorId="4858854D" id="_x0000_t34" coordsize="21600,21600" o:spt="34" o:oned="t" adj="10800" path="m,l@0,0@0,21600,21600,21600e" filled="f">
+                <v:stroke joinstyle="miter"/>
+                <v:formulas>
+                  <v:f eqn="val #0"/>
+                </v:formulas>
+                <v:path arrowok="t" fillok="f" o:connecttype="none"/>
+                <v:handles>
+                  <v:h position="#0,center"/>
+                </v:handles>
+                <o:lock v:ext="edit" shapetype="t"/>
+              </v:shapetype>
+              <v:shape id="Conector: angular 3" o:spid="_x0000_s1026" type="#_x0000_t34" style="position:absolute;margin-left:231.75pt;margin-top:0;width:153pt;height:0;z-index:251659264;visibility:visible;mso-wrap-style:square;mso-width-percent:0;mso-height-percent:0;mso-wrap-distance-left:9pt;mso-wrap-distance-top:0;mso-wrap-distance-right:9pt;mso-wrap-distance-bottom:0;mso-position-horizontal:absolute;mso-position-horizontal-relative:text;mso-position-vertical:absolute;mso-position-vertical-relative:text;mso-width-percent:0;mso-height-percent:0;mso-width-relative:margin;mso-height-relative:margin" o:gfxdata="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" strokecolor="black [3200]" strokeweight=".5pt"/>
+            </w:pict>
+          </mc:Fallback>
+        </mc:AlternateContent>
+      </w:r>
+      <w:r>
+        <w:rPr>
+          <w:rFonts w:ascii="Calibri Light" w:eastAsia="Calibri" w:hAnsi="Calibri Light" w:cs="Calibri Light"/>
+          <w:noProof/>
+        </w:rPr>
+        <mc:AlternateContent>
+          <mc:Choice Requires="wps">
+            <w:drawing>
+              <wp:anchor distT="0" distB="0" distL="114300" distR="114300" simplePos="0" relativeHeight="251660288" behindDoc="0" locked="0" layoutInCell="1" allowOverlap="1" wp14:anchorId="2C9A7AD9" wp14:editId="3D67B205">
+                <wp:simplePos x="0" y="0"/>
+                <wp:positionH relativeFrom="column">
+                  <wp:posOffset>28575</wp:posOffset>
+                </wp:positionH>
+                <wp:positionV relativeFrom="paragraph">
+                  <wp:posOffset>5080</wp:posOffset>
+                </wp:positionV>
+                <wp:extent cx="1943100" cy="0"/>
+                <wp:effectExtent l="38100" t="38100" r="57150" b="95250"/>
+                <wp:wrapNone/>
+                <wp:docPr id="4" name="Conector: angular 4"/>
+                <wp:cNvGraphicFramePr/>
+                <a:graphic xmlns:a="http://schemas.openxmlformats.org/drawingml/2006/main">
+                  <a:graphicData uri="http://schemas.microsoft.com/office/word/2010/wordprocessingShape">
+                    <wps:wsp>
+                      <wps:cNvCnPr/>
+                      <wps:spPr>
+                        <a:xfrm>
+                          <a:off x="0" y="0"/>
+                          <a:ext cx="1943100" cy="0"/>
+                        </a:xfrm>
+                        <a:prstGeom prst="bentConnector3">
+                          <a:avLst/>
+                        </a:prstGeom>
+                        <a:ln w="6350"/>
+                      </wps:spPr>
+                      <wps:style>
+                        <a:lnRef idx="2">
+                          <a:schemeClr val="dk1"/>
+                        </a:lnRef>
+                        <a:fillRef idx="0">
+                          <a:schemeClr val="dk1"/>
+                        </a:fillRef>
+                        <a:effectRef idx="1">
+                          <a:schemeClr val="dk1"/>
+                        </a:effectRef>
+                        <a:fontRef idx="minor">
+                          <a:schemeClr val="tx1"/>
+                        </a:fontRef>
+                      </wps:style>
+                      <wps:bodyPr/>
+                    </wps:wsp>
+                  </a:graphicData>
+                </a:graphic>
+              </wp:anchor>
+            </w:drawing>
+          </mc:Choice>
+          <mc:Fallback>
+            <w:pict>
+              <v:shape w14:anchorId="2A63D347" id="Conector: angular 4" o:spid="_x0000_s1026" type="#_x0000_t34" style="position:absolute;margin-left:2.25pt;margin-top:.4pt;width:153pt;height:0;z-index:251660288;visibility:visible;mso-wrap-style:square;mso-wrap-distance-left:9pt;mso-wrap-distance-top:0;mso-wrap-distance-right:9pt;mso-wrap-distance-bottom:0;mso-position-horizontal:absolute;mso-position-horizontal-relative:text;mso-position-vertical:absolute;mso-position-vertical-relative:text" o:gfxdata="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" strokecolor="black [3200]" strokeweight=".5pt"/>
+            </w:pict>
+          </mc:Fallback>
+        </mc:AlternateContent>
+      </w:r>
+      <w:r>
+        <w:rPr>
+          <w:rFonts w:ascii="Calibri Light" w:hAnsi="Calibri Light" w:cs="Calibri Light"/>
+          <w:b/>
+        </w:rPr>
+        <w:br/>
+      </w:r>
+      <w:r>
+        <w:rPr>
+          <w:rFonts w:ascii="Calibri Light" w:eastAsia="Times New Roman" w:hAnsi="Calibri Light" w:cs="Calibri Light"/>
+          <w:b/>
+          <w:lang w:eastAsia="es-ES"/>
+        </w:rPr>
+        <w:t xml:space="preserve">DANIEL EDUARDO NUNCIRA AGUDELO          </w:t>
+      </w:r>
+      <w:r>
+        <w:rPr>
+          <w:rFonts w:ascii="Calibri Light" w:eastAsia="Times New Roman" w:hAnsi="Calibri Light" w:cs="Calibri Light"/>
+          <w:b/>
+          <w:lang w:eastAsia="es-ES"/>
+        </w:rPr>
+        <w:t xml:space="preserve">          </w:t>
+      </w:r>
+      <w:proofErr w:type="gramStart"/>
+      <w:r>
+        <w:rPr>
+          <w:rFonts w:ascii="Calibri Light" w:eastAsia="Times New Roman" w:hAnsi="Calibri Light" w:cs="Calibri Light"/>
+          <w:b/>
+          <w:lang w:eastAsia="es-ES"/>
+        </w:rPr>
+        <w:t xml:space="preserve">  </w:t>
+      </w:r>
+      <w:r>
+        <w:rPr>
+          <w:rFonts w:ascii="Calibri Light" w:eastAsia="Times New Roman" w:hAnsi="Calibri Light" w:cs="Calibri Light"/>
+          <w:b/>
+          <w:lang w:eastAsia="es-ES"/>
+        </w:rPr>
+        <w:t xml:space="preserve"> </w:t>
+      </w:r>
+      <w:r>
         <w:rPr>
           <w:rFonts w:ascii="Calibri" w:eastAsia="Times New Roman" w:hAnsi="Calibri" w:cs="Calibri"/>
           <w:color w:val="000000"/>
           <w:lang w:eastAsia="es-CO"/>
         </w:rPr>
-      </w:pPr>
-      <w:r>
-        <w:rPr>
-          <w:rFonts w:ascii="Calibri Light" w:eastAsia="Times New Roman" w:hAnsi="Calibri Light" w:cs="Calibri Light"/>
-          <w:b/>
-          <w:lang w:eastAsia="es-ES"/>
-        </w:rPr>
-        <w:t xml:space="preserve">DANIEL EDUARDO NUNCIRA AGUDELO          </w:t>
-      </w:r>
-      <w:r>
-        <w:rPr>
-          <w:rFonts w:ascii="Calibri Light" w:eastAsia="Times New Roman" w:hAnsi="Calibri Light" w:cs="Calibri Light"/>
-          <w:b/>
-          <w:lang w:eastAsia="es-ES"/>
-        </w:rPr>
-        <w:t xml:space="preserve">            </w:t>
-      </w:r>
-      <w:r>
-        <w:rPr>
-          <w:rFonts w:ascii="Calibri Light" w:eastAsia="Times New Roman" w:hAnsi="Calibri Light" w:cs="Calibri Light"/>
-          <w:b/>
-          <w:lang w:eastAsia="es-ES"/>
-        </w:rPr>
-        <w:t xml:space="preserve"> </w:t>
-      </w:r>
+        <w:t>[</w:t>
+      </w:r>
+      <w:proofErr w:type="gramEnd"/>
       <w:r>
         <w:rPr>
           <w:rFonts w:ascii="Calibri" w:eastAsia="Times New Roman" w:hAnsi="Calibri" w:cs="Calibri"/>
           <w:color w:val="000000"/>
           <w:lang w:eastAsia="es-CO"/>
         </w:rPr>
-        <w:t>[[Nombre]]</w:t>
+        <w:t>[Nombre]]</w:t>
       </w:r>
     </w:p>
     <w:p>
@@ -9735,7 +9910,7 @@
             </wp:anchor>
           </w:drawing>
         </mc:Choice>
-        <mc:Fallback xmlns:oel="http://schemas.microsoft.com/office/2019/extlst" xmlns:w16du="http://schemas.microsoft.com/office/word/2023/wordml/word16du" xmlns:w16sdtfl="http://schemas.microsoft.com/office/word/2024/wordml/sdtformatlock">
+        <mc:Fallback xmlns:w16sdtfl="http://schemas.microsoft.com/office/word/2024/wordml/sdtformatlock" xmlns:w16du="http://schemas.microsoft.com/office/word/2023/wordml/word16du" xmlns:oel="http://schemas.microsoft.com/office/2019/extlst">
           <w:pict>
             <v:shape w14:anchorId="299C3497" id="Freeform 2" o:spid="_x0000_s1026" style="position:absolute;margin-left:352.5pt;margin-top:-2.05pt;width:152.5pt;height:50pt;z-index:251678720;visibility:visible;mso-wrap-style:square;mso-width-percent:0;mso-height-percent:0;mso-wrap-distance-left:9pt;mso-wrap-distance-top:0;mso-wrap-distance-right:9pt;mso-wrap-distance-bottom:0;mso-position-horizontal:absolute;mso-position-horizontal-relative:text;mso-position-vertical:absolute;mso-position-vertical-relative:text;mso-width-percent:0;mso-height-percent:0;mso-width-relative:margin;mso-height-relative:margin;v-text-anchor:top" coordsize="9718609,3119485" o:gfxdata="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" path="m,l9718608,r,3119485l,3119485,,xe" stroked="f">
               <v:fill r:id="rId2" o:title="" recolor="t" rotate="t" type="frame"/>

</xml_diff>